<commit_message>
Added SVM and KNN
</commit_message>
<xml_diff>
--- a/Classification/Classification Report.docx
+++ b/Classification/Classification Report.docx
@@ -1,6 +1,6 @@
 
 <file path=word/document.xml><?xml version="1.0" encoding="utf-8"?>
-<w:document xmlns:wpc="http://schemas.microsoft.com/office/word/2010/wordprocessingCanvas" xmlns:cx="http://schemas.microsoft.com/office/drawing/2014/chartex" xmlns:cx1="http://schemas.microsoft.com/office/drawing/2015/9/8/chartex" xmlns:cx2="http://schemas.microsoft.com/office/drawing/2015/10/21/chartex" xmlns:cx3="http://schemas.microsoft.com/office/drawing/2016/5/9/chartex" xmlns:cx4="http://schemas.microsoft.com/office/drawing/2016/5/10/chartex" xmlns:cx5="http://schemas.microsoft.com/office/drawing/2016/5/11/chartex" xmlns:cx6="http://schemas.microsoft.com/office/drawing/2016/5/12/chartex" xmlns:cx7="http://schemas.microsoft.com/office/drawing/2016/5/13/chartex" xmlns:cx8="http://schemas.microsoft.com/office/drawing/2016/5/14/chartex" xmlns:mc="http://schemas.openxmlformats.org/markup-compatibility/2006" xmlns:aink="http://schemas.microsoft.com/office/drawing/2016/ink" xmlns:am3d="http://schemas.microsoft.com/office/drawing/2017/model3d" xmlns:o="urn:schemas-microsoft-com:office:office" xmlns:oel="http://schemas.microsoft.com/office/2019/extlst" xmlns:r="http://schemas.openxmlformats.org/officeDocument/2006/relationships" xmlns:m="http://schemas.openxmlformats.org/officeDocument/2006/math" xmlns:v="urn:schemas-microsoft-com:vml" xmlns:wp14="http://schemas.microsoft.com/office/word/2010/wordprocessingDrawing" xmlns:wp="http://schemas.openxmlformats.org/drawingml/2006/wordprocessingDrawing" xmlns:w10="urn:schemas-microsoft-com:office:word" xmlns:w="http://schemas.openxmlformats.org/wordprocessingml/2006/main" xmlns:w14="http://schemas.microsoft.com/office/word/2010/wordml" xmlns:w15="http://schemas.microsoft.com/office/word/2012/wordml" xmlns:w16cex="http://schemas.microsoft.com/office/word/2018/wordml/cex" xmlns:w16cid="http://schemas.microsoft.com/office/word/2016/wordml/cid" xmlns:w16="http://schemas.microsoft.com/office/word/2018/wordml" xmlns:w16du="http://schemas.microsoft.com/office/word/2023/wordml/word16du" xmlns:w16sdtdh="http://schemas.microsoft.com/office/word/2020/wordml/sdtdatahash" xmlns:w16sdtfl="http://schemas.microsoft.com/office/word/2024/wordml/sdtformatlock" xmlns:w16se="http://schemas.microsoft.com/office/word/2015/wordml/symex" xmlns:wpg="http://schemas.microsoft.com/office/word/2010/wordprocessingGroup" xmlns:wpi="http://schemas.microsoft.com/office/word/2010/wordprocessingInk" xmlns:wne="http://schemas.microsoft.com/office/word/2006/wordml" xmlns:wps="http://schemas.microsoft.com/office/word/2010/wordprocessingShape" mc:Ignorable="w14 w15 w16se w16cid w16 w16cex w16sdtdh w16sdtfl w16du wp14">
+<w:document xmlns:wpc="http://schemas.microsoft.com/office/word/2010/wordprocessingCanvas" xmlns:cx="http://schemas.microsoft.com/office/drawing/2014/chartex" xmlns:cx1="http://schemas.microsoft.com/office/drawing/2015/9/8/chartex" xmlns:cx2="http://schemas.microsoft.com/office/drawing/2015/10/21/chartex" xmlns:cx3="http://schemas.microsoft.com/office/drawing/2016/5/9/chartex" xmlns:cx4="http://schemas.microsoft.com/office/drawing/2016/5/10/chartex" xmlns:cx5="http://schemas.microsoft.com/office/drawing/2016/5/11/chartex" xmlns:cx6="http://schemas.microsoft.com/office/drawing/2016/5/12/chartex" xmlns:cx7="http://schemas.microsoft.com/office/drawing/2016/5/13/chartex" xmlns:cx8="http://schemas.microsoft.com/office/drawing/2016/5/14/chartex" xmlns:mc="http://schemas.openxmlformats.org/markup-compatibility/2006" xmlns:aink="http://schemas.microsoft.com/office/drawing/2016/ink" xmlns:am3d="http://schemas.microsoft.com/office/drawing/2017/model3d" xmlns:o="urn:schemas-microsoft-com:office:office" xmlns:oel="http://schemas.microsoft.com/office/2019/extlst" xmlns:r="http://schemas.openxmlformats.org/officeDocument/2006/relationships" xmlns:m="http://schemas.openxmlformats.org/officeDocument/2006/math" xmlns:v="urn:schemas-microsoft-com:vml" xmlns:wp14="http://schemas.microsoft.com/office/word/2010/wordprocessingDrawing" xmlns:wp="http://schemas.openxmlformats.org/drawingml/2006/wordprocessingDrawing" xmlns:w10="urn:schemas-microsoft-com:office:word" xmlns:w="http://schemas.openxmlformats.org/wordprocessingml/2006/main" xmlns:w14="http://schemas.microsoft.com/office/word/2010/wordml" xmlns:w15="http://schemas.microsoft.com/office/word/2012/wordml" xmlns:w16cei="http://schemas.microsoft.com/office/word/2026/wordml/cei" xmlns:w16cex="http://schemas.microsoft.com/office/word/2018/wordml/cex" xmlns:w16cid="http://schemas.microsoft.com/office/word/2016/wordml/cid" xmlns:w16="http://schemas.microsoft.com/office/word/2018/wordml" xmlns:w16du="http://schemas.microsoft.com/office/word/2023/wordml/word16du" xmlns:w16sdtdh="http://schemas.microsoft.com/office/word/2020/wordml/sdtdatahash" xmlns:w16sdtfl="http://schemas.microsoft.com/office/word/2024/wordml/sdtformatlock" xmlns:w16se="http://schemas.microsoft.com/office/word/2015/wordml/symex" xmlns:wpg="http://schemas.microsoft.com/office/word/2010/wordprocessingGroup" xmlns:wpi="http://schemas.microsoft.com/office/word/2010/wordprocessingInk" xmlns:wne="http://schemas.microsoft.com/office/word/2006/wordml" xmlns:wps="http://schemas.microsoft.com/office/word/2010/wordprocessingShape" mc:Ignorable="w14 w15 w16se w16cid w16 w16cex w16sdtdh w16sdtfl w16du wp14">
   <w:body>
     <w:p>
       <w:pPr>
@@ -41,10 +41,7 @@
         <w:t>Yes</w:t>
       </w:r>
       <w:r>
-        <w:t>, how often is it correct?</w:t>
-      </w:r>
-      <w:r>
-        <w:t xml:space="preserve"> </w:t>
+        <w:t xml:space="preserve">, how often is it correct? </w:t>
       </w:r>
       <w:r>
         <w:t xml:space="preserve">(i.e., </w:t>
@@ -56,10 +53,7 @@
         <w:t>)</w:t>
       </w:r>
       <w:r>
-        <w:t xml:space="preserve"> = TP / (TP + </w:t>
-      </w:r>
-      <w:r>
-        <w:t xml:space="preserve">FP) </w:t>
+        <w:t xml:space="preserve"> = TP / (TP + FP) </w:t>
       </w:r>
       <w:r>
         <w:t>= 78/ (78 + 6) = 0.93</w:t>
@@ -97,15 +91,7 @@
           <w:kern w:val="0"/>
           <w14:ligatures w14:val="none"/>
         </w:rPr>
-        <w:t>, how many did the model find?</w:t>
-      </w:r>
-      <w:r>
-        <w:rPr>
-          <w:rFonts w:ascii="Times New Roman" w:eastAsia="Times New Roman" w:hAnsi="Times New Roman" w:cs="Times New Roman"/>
-          <w:kern w:val="0"/>
-          <w14:ligatures w14:val="none"/>
-        </w:rPr>
-        <w:t xml:space="preserve"> </w:t>
+        <w:t xml:space="preserve">, how many did the model find? </w:t>
       </w:r>
       <w:r>
         <w:rPr>
@@ -194,15 +180,7 @@
           <w:kern w:val="0"/>
           <w14:ligatures w14:val="none"/>
         </w:rPr>
-        <w:t>alance between Precision and Recall</w:t>
-      </w:r>
-      <w:r>
-        <w:rPr>
-          <w:rFonts w:ascii="Times New Roman" w:eastAsia="Times New Roman" w:hAnsi="Times New Roman" w:cs="Times New Roman"/>
-          <w:kern w:val="0"/>
-          <w14:ligatures w14:val="none"/>
-        </w:rPr>
-        <w:t xml:space="preserve"> </w:t>
+        <w:t xml:space="preserve">alance between Precision and Recall </w:t>
       </w:r>
       <w:r>
         <w:rPr>
@@ -258,39 +236,7 @@
           <w:kern w:val="0"/>
           <w14:ligatures w14:val="none"/>
         </w:rPr>
-        <w:t xml:space="preserve"> = 2 * (0.93 * 0.92)/ </w:t>
-      </w:r>
-      <w:r>
-        <w:rPr>
-          <w:rFonts w:ascii="Times New Roman" w:eastAsia="Times New Roman" w:hAnsi="Times New Roman" w:cs="Times New Roman"/>
-          <w:kern w:val="0"/>
-          <w14:ligatures w14:val="none"/>
-        </w:rPr>
-        <w:t xml:space="preserve">(0.93 </w:t>
-      </w:r>
-      <w:r>
-        <w:rPr>
-          <w:rFonts w:ascii="Times New Roman" w:eastAsia="Times New Roman" w:hAnsi="Times New Roman" w:cs="Times New Roman"/>
-          <w:kern w:val="0"/>
-          <w14:ligatures w14:val="none"/>
-        </w:rPr>
-        <w:t>+</w:t>
-      </w:r>
-      <w:r>
-        <w:rPr>
-          <w:rFonts w:ascii="Times New Roman" w:eastAsia="Times New Roman" w:hAnsi="Times New Roman" w:cs="Times New Roman"/>
-          <w:kern w:val="0"/>
-          <w14:ligatures w14:val="none"/>
-        </w:rPr>
-        <w:t xml:space="preserve"> 0.92)</w:t>
-      </w:r>
-      <w:r>
-        <w:rPr>
-          <w:rFonts w:ascii="Times New Roman" w:eastAsia="Times New Roman" w:hAnsi="Times New Roman" w:cs="Times New Roman"/>
-          <w:kern w:val="0"/>
-          <w14:ligatures w14:val="none"/>
-        </w:rPr>
-        <w:t xml:space="preserve"> = 0.92</w:t>
+        <w:t xml:space="preserve"> = 2 * (0.93 * 0.92)/ (0.93 + 0.92) = 0.92</w:t>
       </w:r>
     </w:p>
     <w:p>
@@ -315,23 +261,7 @@
           <w:kern w:val="0"/>
           <w14:ligatures w14:val="none"/>
         </w:rPr>
-        <w:t>n</w:t>
-      </w:r>
-      <w:r>
-        <w:rPr>
-          <w:rFonts w:ascii="Times New Roman" w:eastAsia="Times New Roman" w:hAnsi="Times New Roman" w:cs="Times New Roman"/>
-          <w:kern w:val="0"/>
-          <w14:ligatures w14:val="none"/>
-        </w:rPr>
-        <w:t>umber of actual samples in each class</w:t>
-      </w:r>
-      <w:r>
-        <w:rPr>
-          <w:rFonts w:ascii="Times New Roman" w:eastAsia="Times New Roman" w:hAnsi="Times New Roman" w:cs="Times New Roman"/>
-          <w:kern w:val="0"/>
-          <w14:ligatures w14:val="none"/>
-        </w:rPr>
-        <w:t xml:space="preserve">? </w:t>
+        <w:t xml:space="preserve">number of actual samples in each class? </w:t>
       </w:r>
       <w:r>
         <w:rPr>
@@ -364,10 +294,7 @@
         <w:pStyle w:val="ListParagraph"/>
       </w:pPr>
       <w:r>
-        <w:t xml:space="preserve">49 - </w:t>
-      </w:r>
-      <w:r>
-        <w:t>did purchase the course from advertisement.</w:t>
+        <w:t>49 - did purchase the course from advertisement.</w:t>
       </w:r>
     </w:p>
     <w:p>
@@ -383,42 +310,7 @@
           <w:b/>
           <w:bCs/>
         </w:rPr>
-        <w:t>How many</w:t>
-      </w:r>
-      <w:r>
-        <w:rPr>
-          <w:b/>
-          <w:bCs/>
-        </w:rPr>
-        <w:t xml:space="preserve"> </w:t>
-      </w:r>
-      <w:r>
-        <w:rPr>
-          <w:b/>
-          <w:bCs/>
-        </w:rPr>
-        <w:t>predictions did</w:t>
-      </w:r>
-      <w:r>
-        <w:rPr>
-          <w:b/>
-          <w:bCs/>
-        </w:rPr>
-        <w:t xml:space="preserve"> the model </w:t>
-      </w:r>
-      <w:r>
-        <w:rPr>
-          <w:b/>
-          <w:bCs/>
-        </w:rPr>
-        <w:t>get</w:t>
-      </w:r>
-      <w:r>
-        <w:rPr>
-          <w:b/>
-          <w:bCs/>
-        </w:rPr>
-        <w:t xml:space="preserve"> right</w:t>
+        <w:t>How many predictions did the model get right</w:t>
       </w:r>
       <w:r>
         <w:rPr>
@@ -446,14 +338,7 @@
           <w:b/>
           <w:bCs/>
         </w:rPr>
-        <w:t xml:space="preserve">= (TP + TN) / (TP + TN + FP + </w:t>
-      </w:r>
-      <w:r>
-        <w:rPr>
-          <w:b/>
-          <w:bCs/>
-        </w:rPr>
-        <w:t xml:space="preserve">FN) </w:t>
+        <w:t xml:space="preserve">= (TP + TN) / (TP + TN + FP + FN) </w:t>
       </w:r>
       <w:r>
         <w:rPr>
@@ -552,28 +437,7 @@
         <w:t xml:space="preserve"> = TP / (TP + FP) </w:t>
       </w:r>
       <w:r>
-        <w:t>= 7</w:t>
-      </w:r>
-      <w:r>
-        <w:t>6</w:t>
-      </w:r>
-      <w:r>
-        <w:t>/ (7</w:t>
-      </w:r>
-      <w:r>
-        <w:t>6</w:t>
-      </w:r>
-      <w:r>
-        <w:t xml:space="preserve"> + </w:t>
-      </w:r>
-      <w:r>
-        <w:t>8</w:t>
-      </w:r>
-      <w:r>
-        <w:t>) = 0.9</w:t>
-      </w:r>
-      <w:r>
-        <w:t>0</w:t>
+        <w:t>= 76/ (76 + 8) = 0.90</w:t>
       </w:r>
     </w:p>
     <w:p>
@@ -1260,15 +1124,7 @@
           <w:kern w:val="0"/>
           <w14:ligatures w14:val="none"/>
         </w:rPr>
-        <w:t>) = 0.</w:t>
-      </w:r>
-      <w:r>
-        <w:rPr>
-          <w:rFonts w:ascii="Times New Roman" w:eastAsia="Times New Roman" w:hAnsi="Times New Roman" w:cs="Times New Roman"/>
-          <w:kern w:val="0"/>
-          <w14:ligatures w14:val="none"/>
-        </w:rPr>
-        <w:t>9</w:t>
+        <w:t>) = 0.9</w:t>
       </w:r>
       <w:r>
         <w:rPr>
@@ -1357,15 +1213,7 @@
           <w:kern w:val="0"/>
           <w14:ligatures w14:val="none"/>
         </w:rPr>
-        <w:t xml:space="preserve"> * 0.</w:t>
-      </w:r>
-      <w:r>
-        <w:rPr>
-          <w:rFonts w:ascii="Times New Roman" w:eastAsia="Times New Roman" w:hAnsi="Times New Roman" w:cs="Times New Roman"/>
-          <w:kern w:val="0"/>
-          <w14:ligatures w14:val="none"/>
-        </w:rPr>
-        <w:t>9</w:t>
+        <w:t xml:space="preserve"> * 0.9</w:t>
       </w:r>
       <w:r>
         <w:rPr>
@@ -1381,15 +1229,7 @@
           <w:kern w:val="0"/>
           <w14:ligatures w14:val="none"/>
         </w:rPr>
-        <w:t>)/ (0</w:t>
-      </w:r>
-      <w:r>
-        <w:rPr>
-          <w:rFonts w:ascii="Times New Roman" w:eastAsia="Times New Roman" w:hAnsi="Times New Roman" w:cs="Times New Roman"/>
-          <w:kern w:val="0"/>
-          <w14:ligatures w14:val="none"/>
-        </w:rPr>
-        <w:t>.</w:t>
+        <w:t>)/ (0.</w:t>
       </w:r>
       <w:r>
         <w:rPr>
@@ -1635,6 +1475,933 @@
           <w:bCs/>
         </w:rPr>
         <w:t>91</w:t>
+      </w:r>
+    </w:p>
+    <w:p>
+      <w:pPr>
+        <w:ind w:left="720" w:hanging="360"/>
+        <w:rPr>
+          <w:b/>
+          <w:bCs/>
+          <w:sz w:val="40"/>
+          <w:szCs w:val="40"/>
+        </w:rPr>
+      </w:pPr>
+      <w:r>
+        <w:rPr>
+          <w:b/>
+          <w:bCs/>
+          <w:sz w:val="40"/>
+          <w:szCs w:val="40"/>
+        </w:rPr>
+        <w:t>Logistic Classification</w:t>
+      </w:r>
+    </w:p>
+    <w:p>
+      <w:pPr>
+        <w:pStyle w:val="ListParagraph"/>
+        <w:numPr>
+          <w:ilvl w:val="0"/>
+          <w:numId w:val="10"/>
+        </w:numPr>
+        <w:rPr>
+          <w:rFonts w:ascii="Times New Roman" w:eastAsia="Times New Roman" w:hAnsi="Times New Roman" w:cs="Times New Roman"/>
+          <w:kern w:val="0"/>
+          <w14:ligatures w14:val="none"/>
+        </w:rPr>
+      </w:pPr>
+      <w:r>
+        <w:rPr>
+          <w:rFonts w:ascii="Times New Roman" w:eastAsia="Times New Roman" w:hAnsi="Times New Roman" w:cs="Times New Roman"/>
+          <w:kern w:val="0"/>
+          <w14:ligatures w14:val="none"/>
+        </w:rPr>
+        <w:t>When the model says Yes, how often is it correct? (i.e., Precision) = TP / (TP + FP) = 7</w:t>
+      </w:r>
+      <w:r>
+        <w:rPr>
+          <w:rFonts w:ascii="Times New Roman" w:eastAsia="Times New Roman" w:hAnsi="Times New Roman" w:cs="Times New Roman"/>
+          <w:kern w:val="0"/>
+          <w14:ligatures w14:val="none"/>
+        </w:rPr>
+        <w:t>9</w:t>
+      </w:r>
+      <w:r>
+        <w:rPr>
+          <w:rFonts w:ascii="Times New Roman" w:eastAsia="Times New Roman" w:hAnsi="Times New Roman" w:cs="Times New Roman"/>
+          <w:kern w:val="0"/>
+          <w14:ligatures w14:val="none"/>
+        </w:rPr>
+        <w:t>/ (7</w:t>
+      </w:r>
+      <w:r>
+        <w:rPr>
+          <w:rFonts w:ascii="Times New Roman" w:eastAsia="Times New Roman" w:hAnsi="Times New Roman" w:cs="Times New Roman"/>
+          <w:kern w:val="0"/>
+          <w14:ligatures w14:val="none"/>
+        </w:rPr>
+        <w:t>9</w:t>
+      </w:r>
+      <w:r>
+        <w:rPr>
+          <w:rFonts w:ascii="Times New Roman" w:eastAsia="Times New Roman" w:hAnsi="Times New Roman" w:cs="Times New Roman"/>
+          <w:kern w:val="0"/>
+          <w14:ligatures w14:val="none"/>
+        </w:rPr>
+        <w:t xml:space="preserve"> + </w:t>
+      </w:r>
+      <w:r>
+        <w:rPr>
+          <w:rFonts w:ascii="Times New Roman" w:eastAsia="Times New Roman" w:hAnsi="Times New Roman" w:cs="Times New Roman"/>
+          <w:kern w:val="0"/>
+          <w14:ligatures w14:val="none"/>
+        </w:rPr>
+        <w:t>9</w:t>
+      </w:r>
+      <w:r>
+        <w:rPr>
+          <w:rFonts w:ascii="Times New Roman" w:eastAsia="Times New Roman" w:hAnsi="Times New Roman" w:cs="Times New Roman"/>
+          <w:kern w:val="0"/>
+          <w14:ligatures w14:val="none"/>
+        </w:rPr>
+        <w:t>) = 0.9</w:t>
+      </w:r>
+      <w:r>
+        <w:rPr>
+          <w:rFonts w:ascii="Times New Roman" w:eastAsia="Times New Roman" w:hAnsi="Times New Roman" w:cs="Times New Roman"/>
+          <w:kern w:val="0"/>
+          <w14:ligatures w14:val="none"/>
+        </w:rPr>
+        <w:t>0</w:t>
+      </w:r>
+    </w:p>
+    <w:p>
+      <w:pPr>
+        <w:pStyle w:val="ListParagraph"/>
+        <w:numPr>
+          <w:ilvl w:val="0"/>
+          <w:numId w:val="10"/>
+        </w:numPr>
+        <w:rPr>
+          <w:rFonts w:ascii="Times New Roman" w:eastAsia="Times New Roman" w:hAnsi="Times New Roman" w:cs="Times New Roman"/>
+          <w:kern w:val="0"/>
+          <w14:ligatures w14:val="none"/>
+        </w:rPr>
+      </w:pPr>
+      <w:r>
+        <w:rPr>
+          <w:rFonts w:ascii="Times New Roman" w:eastAsia="Times New Roman" w:hAnsi="Times New Roman" w:cs="Times New Roman"/>
+          <w:kern w:val="0"/>
+          <w14:ligatures w14:val="none"/>
+        </w:rPr>
+        <w:t xml:space="preserve">Out of all actual </w:t>
+      </w:r>
+      <w:r>
+        <w:rPr>
+          <w:rFonts w:ascii="Times New Roman" w:eastAsia="Times New Roman" w:hAnsi="Times New Roman" w:cs="Times New Roman"/>
+          <w:kern w:val="0"/>
+          <w14:ligatures w14:val="none"/>
+        </w:rPr>
+        <w:t>Yes</w:t>
+      </w:r>
+      <w:r>
+        <w:rPr>
+          <w:rFonts w:ascii="Times New Roman" w:eastAsia="Times New Roman" w:hAnsi="Times New Roman" w:cs="Times New Roman"/>
+          <w:kern w:val="0"/>
+          <w14:ligatures w14:val="none"/>
+        </w:rPr>
+        <w:t xml:space="preserve">, how many did the model find? </w:t>
+      </w:r>
+      <w:r>
+        <w:rPr>
+          <w:rFonts w:ascii="Times New Roman" w:eastAsia="Times New Roman" w:hAnsi="Times New Roman" w:cs="Times New Roman"/>
+          <w:kern w:val="0"/>
+          <w14:ligatures w14:val="none"/>
+        </w:rPr>
+        <w:t xml:space="preserve">(i.e., </w:t>
+      </w:r>
+      <w:r>
+        <w:rPr>
+          <w:rFonts w:ascii="Times New Roman" w:eastAsia="Times New Roman" w:hAnsi="Times New Roman" w:cs="Times New Roman"/>
+          <w:kern w:val="0"/>
+          <w14:ligatures w14:val="none"/>
+        </w:rPr>
+        <w:t>Recall</w:t>
+      </w:r>
+      <w:r>
+        <w:rPr>
+          <w:rFonts w:ascii="Times New Roman" w:eastAsia="Times New Roman" w:hAnsi="Times New Roman" w:cs="Times New Roman"/>
+          <w:kern w:val="0"/>
+          <w14:ligatures w14:val="none"/>
+        </w:rPr>
+        <w:t>)</w:t>
+      </w:r>
+      <w:r>
+        <w:rPr>
+          <w:rFonts w:ascii="Times New Roman" w:eastAsia="Times New Roman" w:hAnsi="Times New Roman" w:cs="Times New Roman"/>
+          <w:kern w:val="0"/>
+          <w14:ligatures w14:val="none"/>
+        </w:rPr>
+        <w:t>?</w:t>
+      </w:r>
+      <w:r>
+        <w:rPr>
+          <w:rFonts w:ascii="Times New Roman" w:eastAsia="Times New Roman" w:hAnsi="Times New Roman" w:cs="Times New Roman"/>
+          <w:kern w:val="0"/>
+          <w14:ligatures w14:val="none"/>
+        </w:rPr>
+        <w:t xml:space="preserve"> </w:t>
+      </w:r>
+      <w:r>
+        <w:rPr>
+          <w:rFonts w:ascii="Times New Roman" w:eastAsia="Times New Roman" w:hAnsi="Times New Roman" w:cs="Times New Roman"/>
+          <w:kern w:val="0"/>
+          <w14:ligatures w14:val="none"/>
+        </w:rPr>
+        <w:t>= TP / (TP + FN)</w:t>
+      </w:r>
+      <w:r>
+        <w:rPr>
+          <w:rFonts w:ascii="Times New Roman" w:eastAsia="Times New Roman" w:hAnsi="Times New Roman" w:cs="Times New Roman"/>
+          <w:kern w:val="0"/>
+          <w14:ligatures w14:val="none"/>
+        </w:rPr>
+        <w:t xml:space="preserve"> = 79/ (79 + 6) = 0.93</w:t>
+      </w:r>
+    </w:p>
+    <w:p>
+      <w:pPr>
+        <w:pStyle w:val="ListParagraph"/>
+        <w:numPr>
+          <w:ilvl w:val="0"/>
+          <w:numId w:val="10"/>
+        </w:numPr>
+      </w:pPr>
+      <w:r>
+        <w:rPr>
+          <w:rFonts w:ascii="Times New Roman" w:eastAsia="Times New Roman" w:hAnsi="Times New Roman" w:cs="Times New Roman"/>
+          <w:kern w:val="0"/>
+          <w14:ligatures w14:val="none"/>
+        </w:rPr>
+        <w:t>What is the b</w:t>
+      </w:r>
+      <w:r>
+        <w:rPr>
+          <w:rFonts w:ascii="Times New Roman" w:eastAsia="Times New Roman" w:hAnsi="Times New Roman" w:cs="Times New Roman"/>
+          <w:kern w:val="0"/>
+          <w14:ligatures w14:val="none"/>
+        </w:rPr>
+        <w:t xml:space="preserve">alance between Precision and Recall </w:t>
+      </w:r>
+      <w:r>
+        <w:rPr>
+          <w:rFonts w:ascii="Times New Roman" w:eastAsia="Times New Roman" w:hAnsi="Times New Roman" w:cs="Times New Roman"/>
+          <w:kern w:val="0"/>
+          <w14:ligatures w14:val="none"/>
+        </w:rPr>
+        <w:t>(</w:t>
+      </w:r>
+      <w:r>
+        <w:rPr>
+          <w:rFonts w:ascii="Times New Roman" w:eastAsia="Times New Roman" w:hAnsi="Times New Roman" w:cs="Times New Roman"/>
+          <w:kern w:val="0"/>
+          <w14:ligatures w14:val="none"/>
+        </w:rPr>
+        <w:t>F1-Score</w:t>
+      </w:r>
+      <w:r>
+        <w:rPr>
+          <w:rFonts w:ascii="Times New Roman" w:eastAsia="Times New Roman" w:hAnsi="Times New Roman" w:cs="Times New Roman"/>
+          <w:kern w:val="0"/>
+          <w14:ligatures w14:val="none"/>
+        </w:rPr>
+        <w:t xml:space="preserve">)? = </w:t>
+      </w:r>
+      <w:r>
+        <w:rPr>
+          <w:rFonts w:ascii="Times New Roman" w:eastAsia="Times New Roman" w:hAnsi="Times New Roman" w:cs="Times New Roman"/>
+          <w:kern w:val="0"/>
+          <w14:ligatures w14:val="none"/>
+        </w:rPr>
+        <w:t>F1 = 2 × (Precision × Recall) / (Precision + Recall)</w:t>
+      </w:r>
+      <w:r>
+        <w:rPr>
+          <w:rFonts w:ascii="Times New Roman" w:eastAsia="Times New Roman" w:hAnsi="Times New Roman" w:cs="Times New Roman"/>
+          <w:kern w:val="0"/>
+          <w14:ligatures w14:val="none"/>
+        </w:rPr>
+        <w:t xml:space="preserve"> = 2 * (0.90 * 0.93)/ (0.90 + 0.93) = 0.91</w:t>
+      </w:r>
+    </w:p>
+    <w:p>
+      <w:pPr>
+        <w:pStyle w:val="ListParagraph"/>
+        <w:numPr>
+          <w:ilvl w:val="0"/>
+          <w:numId w:val="10"/>
+        </w:numPr>
+        <w:rPr>
+          <w:rFonts w:ascii="Times New Roman" w:eastAsia="Times New Roman" w:hAnsi="Times New Roman" w:cs="Times New Roman"/>
+          <w:kern w:val="0"/>
+          <w14:ligatures w14:val="none"/>
+        </w:rPr>
+      </w:pPr>
+      <w:r>
+        <w:t xml:space="preserve">What is the </w:t>
+      </w:r>
+      <w:r>
+        <w:rPr>
+          <w:rFonts w:ascii="Times New Roman" w:eastAsia="Times New Roman" w:hAnsi="Times New Roman" w:cs="Times New Roman"/>
+          <w:kern w:val="0"/>
+          <w14:ligatures w14:val="none"/>
+        </w:rPr>
+        <w:t xml:space="preserve">number of actual samples in each class? </w:t>
+      </w:r>
+      <w:r>
+        <w:rPr>
+          <w:rFonts w:ascii="Times New Roman" w:eastAsia="Times New Roman" w:hAnsi="Times New Roman" w:cs="Times New Roman"/>
+          <w:kern w:val="0"/>
+          <w14:ligatures w14:val="none"/>
+        </w:rPr>
+        <w:t>(</w:t>
+      </w:r>
+      <w:r>
+        <w:t>Support is n</w:t>
+      </w:r>
+      <w:r>
+        <w:t>umber of actual samples in each class.</w:t>
+      </w:r>
+      <w:r>
+        <w:t>)</w:t>
+      </w:r>
+    </w:p>
+    <w:p>
+      <w:pPr>
+        <w:pStyle w:val="ListParagraph"/>
+        <w:ind w:firstLine="720"/>
+      </w:pPr>
+      <w:r>
+        <w:t>85 - did not purchase the course from advertisement.</w:t>
+      </w:r>
+    </w:p>
+    <w:p>
+      <w:pPr>
+        <w:pStyle w:val="ListParagraph"/>
+        <w:ind w:firstLine="720"/>
+      </w:pPr>
+      <w:r>
+        <w:t>49 - did purchase the course from advertisement.</w:t>
+      </w:r>
+    </w:p>
+    <w:p>
+      <w:pPr>
+        <w:pStyle w:val="ListParagraph"/>
+        <w:numPr>
+          <w:ilvl w:val="0"/>
+          <w:numId w:val="10"/>
+        </w:numPr>
+      </w:pPr>
+      <w:r>
+        <w:rPr>
+          <w:b/>
+          <w:bCs/>
+        </w:rPr>
+        <w:t>How many predictions did the model get right (Accuracy)? = (TP + TN) / (TP + TN + FP + FN) = (79+ 40)/ (79 + 40 + 9+ 6) = 0.89</w:t>
+      </w:r>
+    </w:p>
+    <w:p>
+      <w:pPr>
+        <w:pStyle w:val="ListParagraph"/>
+      </w:pPr>
+    </w:p>
+    <w:p>
+      <w:pPr>
+        <w:ind w:left="720" w:hanging="360"/>
+        <w:rPr>
+          <w:b/>
+          <w:bCs/>
+          <w:sz w:val="40"/>
+          <w:szCs w:val="40"/>
+        </w:rPr>
+      </w:pPr>
+      <w:r>
+        <w:rPr>
+          <w:b/>
+          <w:bCs/>
+          <w:sz w:val="40"/>
+          <w:szCs w:val="40"/>
+        </w:rPr>
+        <w:t>K</w:t>
+      </w:r>
+      <w:r>
+        <w:rPr>
+          <w:rFonts w:ascii="Cambria Math" w:hAnsi="Cambria Math" w:cs="Cambria Math"/>
+          <w:b/>
+          <w:bCs/>
+          <w:sz w:val="40"/>
+          <w:szCs w:val="40"/>
+        </w:rPr>
+        <w:t>‑</w:t>
+      </w:r>
+      <w:r>
+        <w:rPr>
+          <w:b/>
+          <w:bCs/>
+          <w:sz w:val="40"/>
+          <w:szCs w:val="40"/>
+        </w:rPr>
+        <w:t>Nearest Neighbor (KNN)</w:t>
+      </w:r>
+      <w:r>
+        <w:rPr>
+          <w:b/>
+          <w:bCs/>
+          <w:sz w:val="40"/>
+          <w:szCs w:val="40"/>
+        </w:rPr>
+        <w:t xml:space="preserve"> </w:t>
+      </w:r>
+      <w:r>
+        <w:rPr>
+          <w:b/>
+          <w:bCs/>
+          <w:sz w:val="40"/>
+          <w:szCs w:val="40"/>
+        </w:rPr>
+        <w:t>(with Standardization)</w:t>
+      </w:r>
+    </w:p>
+    <w:p>
+      <w:pPr>
+        <w:pStyle w:val="ListParagraph"/>
+        <w:numPr>
+          <w:ilvl w:val="0"/>
+          <w:numId w:val="11"/>
+        </w:numPr>
+        <w:rPr>
+          <w:rFonts w:ascii="Times New Roman" w:eastAsia="Times New Roman" w:hAnsi="Times New Roman" w:cs="Times New Roman"/>
+          <w:kern w:val="0"/>
+          <w14:ligatures w14:val="none"/>
+        </w:rPr>
+      </w:pPr>
+      <w:r>
+        <w:rPr>
+          <w:rFonts w:ascii="Times New Roman" w:eastAsia="Times New Roman" w:hAnsi="Times New Roman" w:cs="Times New Roman"/>
+          <w:kern w:val="0"/>
+          <w14:ligatures w14:val="none"/>
+        </w:rPr>
+        <w:t>When the model says Yes, how often is it correct? (i.e., Precision) = TP/ (TP + FP) = 7</w:t>
+      </w:r>
+      <w:r>
+        <w:rPr>
+          <w:rFonts w:ascii="Times New Roman" w:eastAsia="Times New Roman" w:hAnsi="Times New Roman" w:cs="Times New Roman"/>
+          <w:kern w:val="0"/>
+          <w14:ligatures w14:val="none"/>
+        </w:rPr>
+        <w:t>8</w:t>
+      </w:r>
+      <w:r>
+        <w:rPr>
+          <w:rFonts w:ascii="Times New Roman" w:eastAsia="Times New Roman" w:hAnsi="Times New Roman" w:cs="Times New Roman"/>
+          <w:kern w:val="0"/>
+          <w14:ligatures w14:val="none"/>
+        </w:rPr>
+        <w:t>/ (7</w:t>
+      </w:r>
+      <w:r>
+        <w:rPr>
+          <w:rFonts w:ascii="Times New Roman" w:eastAsia="Times New Roman" w:hAnsi="Times New Roman" w:cs="Times New Roman"/>
+          <w:kern w:val="0"/>
+          <w14:ligatures w14:val="none"/>
+        </w:rPr>
+        <w:t>8</w:t>
+      </w:r>
+      <w:r>
+        <w:rPr>
+          <w:rFonts w:ascii="Times New Roman" w:eastAsia="Times New Roman" w:hAnsi="Times New Roman" w:cs="Times New Roman"/>
+          <w:kern w:val="0"/>
+          <w14:ligatures w14:val="none"/>
+        </w:rPr>
+        <w:t xml:space="preserve"> + </w:t>
+      </w:r>
+      <w:r>
+        <w:rPr>
+          <w:rFonts w:ascii="Times New Roman" w:eastAsia="Times New Roman" w:hAnsi="Times New Roman" w:cs="Times New Roman"/>
+          <w:kern w:val="0"/>
+          <w14:ligatures w14:val="none"/>
+        </w:rPr>
+        <w:t>4</w:t>
+      </w:r>
+      <w:r>
+        <w:rPr>
+          <w:rFonts w:ascii="Times New Roman" w:eastAsia="Times New Roman" w:hAnsi="Times New Roman" w:cs="Times New Roman"/>
+          <w:kern w:val="0"/>
+          <w14:ligatures w14:val="none"/>
+        </w:rPr>
+        <w:t>) = 0.9</w:t>
+      </w:r>
+      <w:r>
+        <w:rPr>
+          <w:rFonts w:ascii="Times New Roman" w:eastAsia="Times New Roman" w:hAnsi="Times New Roman" w:cs="Times New Roman"/>
+          <w:kern w:val="0"/>
+          <w14:ligatures w14:val="none"/>
+        </w:rPr>
+        <w:t>5</w:t>
+      </w:r>
+    </w:p>
+    <w:p>
+      <w:pPr>
+        <w:pStyle w:val="ListParagraph"/>
+        <w:numPr>
+          <w:ilvl w:val="0"/>
+          <w:numId w:val="11"/>
+        </w:numPr>
+        <w:rPr>
+          <w:rFonts w:ascii="Times New Roman" w:eastAsia="Times New Roman" w:hAnsi="Times New Roman" w:cs="Times New Roman"/>
+          <w:kern w:val="0"/>
+          <w14:ligatures w14:val="none"/>
+        </w:rPr>
+      </w:pPr>
+      <w:r>
+        <w:rPr>
+          <w:rFonts w:ascii="Times New Roman" w:eastAsia="Times New Roman" w:hAnsi="Times New Roman" w:cs="Times New Roman"/>
+          <w:kern w:val="0"/>
+          <w14:ligatures w14:val="none"/>
+        </w:rPr>
+        <w:t xml:space="preserve">Out of all actual </w:t>
+      </w:r>
+      <w:r>
+        <w:rPr>
+          <w:rFonts w:ascii="Times New Roman" w:eastAsia="Times New Roman" w:hAnsi="Times New Roman" w:cs="Times New Roman"/>
+          <w:kern w:val="0"/>
+          <w14:ligatures w14:val="none"/>
+        </w:rPr>
+        <w:t>Yes</w:t>
+      </w:r>
+      <w:r>
+        <w:rPr>
+          <w:rFonts w:ascii="Times New Roman" w:eastAsia="Times New Roman" w:hAnsi="Times New Roman" w:cs="Times New Roman"/>
+          <w:kern w:val="0"/>
+          <w14:ligatures w14:val="none"/>
+        </w:rPr>
+        <w:t xml:space="preserve">, how many did the model find? </w:t>
+      </w:r>
+      <w:r>
+        <w:rPr>
+          <w:rFonts w:ascii="Times New Roman" w:eastAsia="Times New Roman" w:hAnsi="Times New Roman" w:cs="Times New Roman"/>
+          <w:kern w:val="0"/>
+          <w14:ligatures w14:val="none"/>
+        </w:rPr>
+        <w:t xml:space="preserve">(i.e., </w:t>
+      </w:r>
+      <w:r>
+        <w:rPr>
+          <w:rFonts w:ascii="Times New Roman" w:eastAsia="Times New Roman" w:hAnsi="Times New Roman" w:cs="Times New Roman"/>
+          <w:kern w:val="0"/>
+          <w14:ligatures w14:val="none"/>
+        </w:rPr>
+        <w:t>Recall</w:t>
+      </w:r>
+      <w:r>
+        <w:rPr>
+          <w:rFonts w:ascii="Times New Roman" w:eastAsia="Times New Roman" w:hAnsi="Times New Roman" w:cs="Times New Roman"/>
+          <w:kern w:val="0"/>
+          <w14:ligatures w14:val="none"/>
+        </w:rPr>
+        <w:t>)</w:t>
+      </w:r>
+      <w:r>
+        <w:rPr>
+          <w:rFonts w:ascii="Times New Roman" w:eastAsia="Times New Roman" w:hAnsi="Times New Roman" w:cs="Times New Roman"/>
+          <w:kern w:val="0"/>
+          <w14:ligatures w14:val="none"/>
+        </w:rPr>
+        <w:t>?</w:t>
+      </w:r>
+      <w:r>
+        <w:rPr>
+          <w:rFonts w:ascii="Times New Roman" w:eastAsia="Times New Roman" w:hAnsi="Times New Roman" w:cs="Times New Roman"/>
+          <w:kern w:val="0"/>
+          <w14:ligatures w14:val="none"/>
+        </w:rPr>
+        <w:t xml:space="preserve"> </w:t>
+      </w:r>
+      <w:r>
+        <w:rPr>
+          <w:rFonts w:ascii="Times New Roman" w:eastAsia="Times New Roman" w:hAnsi="Times New Roman" w:cs="Times New Roman"/>
+          <w:kern w:val="0"/>
+          <w14:ligatures w14:val="none"/>
+        </w:rPr>
+        <w:t>= TP / (TP + FN)</w:t>
+      </w:r>
+      <w:r>
+        <w:rPr>
+          <w:rFonts w:ascii="Times New Roman" w:eastAsia="Times New Roman" w:hAnsi="Times New Roman" w:cs="Times New Roman"/>
+          <w:kern w:val="0"/>
+          <w14:ligatures w14:val="none"/>
+        </w:rPr>
+        <w:t xml:space="preserve"> = 7</w:t>
+      </w:r>
+      <w:r>
+        <w:rPr>
+          <w:rFonts w:ascii="Times New Roman" w:eastAsia="Times New Roman" w:hAnsi="Times New Roman" w:cs="Times New Roman"/>
+          <w:kern w:val="0"/>
+          <w14:ligatures w14:val="none"/>
+        </w:rPr>
+        <w:t>8</w:t>
+      </w:r>
+      <w:r>
+        <w:rPr>
+          <w:rFonts w:ascii="Times New Roman" w:eastAsia="Times New Roman" w:hAnsi="Times New Roman" w:cs="Times New Roman"/>
+          <w:kern w:val="0"/>
+          <w14:ligatures w14:val="none"/>
+        </w:rPr>
+        <w:t>/ (7</w:t>
+      </w:r>
+      <w:r>
+        <w:rPr>
+          <w:rFonts w:ascii="Times New Roman" w:eastAsia="Times New Roman" w:hAnsi="Times New Roman" w:cs="Times New Roman"/>
+          <w:kern w:val="0"/>
+          <w14:ligatures w14:val="none"/>
+        </w:rPr>
+        <w:t>8</w:t>
+      </w:r>
+      <w:r>
+        <w:rPr>
+          <w:rFonts w:ascii="Times New Roman" w:eastAsia="Times New Roman" w:hAnsi="Times New Roman" w:cs="Times New Roman"/>
+          <w:kern w:val="0"/>
+          <w14:ligatures w14:val="none"/>
+        </w:rPr>
+        <w:t xml:space="preserve"> + </w:t>
+      </w:r>
+      <w:r>
+        <w:rPr>
+          <w:rFonts w:ascii="Times New Roman" w:eastAsia="Times New Roman" w:hAnsi="Times New Roman" w:cs="Times New Roman"/>
+          <w:kern w:val="0"/>
+          <w14:ligatures w14:val="none"/>
+        </w:rPr>
+        <w:t>7</w:t>
+      </w:r>
+      <w:r>
+        <w:rPr>
+          <w:rFonts w:ascii="Times New Roman" w:eastAsia="Times New Roman" w:hAnsi="Times New Roman" w:cs="Times New Roman"/>
+          <w:kern w:val="0"/>
+          <w14:ligatures w14:val="none"/>
+        </w:rPr>
+        <w:t>) = 0.9</w:t>
+      </w:r>
+      <w:r>
+        <w:rPr>
+          <w:rFonts w:ascii="Times New Roman" w:eastAsia="Times New Roman" w:hAnsi="Times New Roman" w:cs="Times New Roman"/>
+          <w:kern w:val="0"/>
+          <w14:ligatures w14:val="none"/>
+        </w:rPr>
+        <w:t>2</w:t>
+      </w:r>
+    </w:p>
+    <w:p>
+      <w:pPr>
+        <w:pStyle w:val="ListParagraph"/>
+        <w:numPr>
+          <w:ilvl w:val="0"/>
+          <w:numId w:val="11"/>
+        </w:numPr>
+      </w:pPr>
+      <w:r>
+        <w:rPr>
+          <w:rFonts w:ascii="Times New Roman" w:eastAsia="Times New Roman" w:hAnsi="Times New Roman" w:cs="Times New Roman"/>
+          <w:kern w:val="0"/>
+          <w14:ligatures w14:val="none"/>
+        </w:rPr>
+        <w:t>What is the b</w:t>
+      </w:r>
+      <w:r>
+        <w:rPr>
+          <w:rFonts w:ascii="Times New Roman" w:eastAsia="Times New Roman" w:hAnsi="Times New Roman" w:cs="Times New Roman"/>
+          <w:kern w:val="0"/>
+          <w14:ligatures w14:val="none"/>
+        </w:rPr>
+        <w:t xml:space="preserve">alance between Precision and Recall </w:t>
+      </w:r>
+      <w:r>
+        <w:rPr>
+          <w:rFonts w:ascii="Times New Roman" w:eastAsia="Times New Roman" w:hAnsi="Times New Roman" w:cs="Times New Roman"/>
+          <w:kern w:val="0"/>
+          <w14:ligatures w14:val="none"/>
+        </w:rPr>
+        <w:t>(</w:t>
+      </w:r>
+      <w:r>
+        <w:rPr>
+          <w:rFonts w:ascii="Times New Roman" w:eastAsia="Times New Roman" w:hAnsi="Times New Roman" w:cs="Times New Roman"/>
+          <w:kern w:val="0"/>
+          <w14:ligatures w14:val="none"/>
+        </w:rPr>
+        <w:t>F1-Score</w:t>
+      </w:r>
+      <w:r>
+        <w:rPr>
+          <w:rFonts w:ascii="Times New Roman" w:eastAsia="Times New Roman" w:hAnsi="Times New Roman" w:cs="Times New Roman"/>
+          <w:kern w:val="0"/>
+          <w14:ligatures w14:val="none"/>
+        </w:rPr>
+        <w:t xml:space="preserve">)? = </w:t>
+      </w:r>
+      <w:r>
+        <w:rPr>
+          <w:rFonts w:ascii="Times New Roman" w:eastAsia="Times New Roman" w:hAnsi="Times New Roman" w:cs="Times New Roman"/>
+          <w:kern w:val="0"/>
+          <w14:ligatures w14:val="none"/>
+        </w:rPr>
+        <w:t>F1 = 2 × (Precision × Recall) / (Precision + Recall)</w:t>
+      </w:r>
+      <w:r>
+        <w:rPr>
+          <w:rFonts w:ascii="Times New Roman" w:eastAsia="Times New Roman" w:hAnsi="Times New Roman" w:cs="Times New Roman"/>
+          <w:kern w:val="0"/>
+          <w14:ligatures w14:val="none"/>
+        </w:rPr>
+        <w:t xml:space="preserve"> = 2 * (0.9</w:t>
+      </w:r>
+      <w:r>
+        <w:rPr>
+          <w:rFonts w:ascii="Times New Roman" w:eastAsia="Times New Roman" w:hAnsi="Times New Roman" w:cs="Times New Roman"/>
+          <w:kern w:val="0"/>
+          <w14:ligatures w14:val="none"/>
+        </w:rPr>
+        <w:t>5</w:t>
+      </w:r>
+      <w:r>
+        <w:rPr>
+          <w:rFonts w:ascii="Times New Roman" w:eastAsia="Times New Roman" w:hAnsi="Times New Roman" w:cs="Times New Roman"/>
+          <w:kern w:val="0"/>
+          <w14:ligatures w14:val="none"/>
+        </w:rPr>
+        <w:t xml:space="preserve"> * 0.9</w:t>
+      </w:r>
+      <w:r>
+        <w:rPr>
+          <w:rFonts w:ascii="Times New Roman" w:eastAsia="Times New Roman" w:hAnsi="Times New Roman" w:cs="Times New Roman"/>
+          <w:kern w:val="0"/>
+          <w14:ligatures w14:val="none"/>
+        </w:rPr>
+        <w:t>2</w:t>
+      </w:r>
+      <w:r>
+        <w:rPr>
+          <w:rFonts w:ascii="Times New Roman" w:eastAsia="Times New Roman" w:hAnsi="Times New Roman" w:cs="Times New Roman"/>
+          <w:kern w:val="0"/>
+          <w14:ligatures w14:val="none"/>
+        </w:rPr>
+        <w:t>)/ (0.9</w:t>
+      </w:r>
+      <w:r>
+        <w:rPr>
+          <w:rFonts w:ascii="Times New Roman" w:eastAsia="Times New Roman" w:hAnsi="Times New Roman" w:cs="Times New Roman"/>
+          <w:kern w:val="0"/>
+          <w14:ligatures w14:val="none"/>
+        </w:rPr>
+        <w:t>5</w:t>
+      </w:r>
+      <w:r>
+        <w:rPr>
+          <w:rFonts w:ascii="Times New Roman" w:eastAsia="Times New Roman" w:hAnsi="Times New Roman" w:cs="Times New Roman"/>
+          <w:kern w:val="0"/>
+          <w14:ligatures w14:val="none"/>
+        </w:rPr>
+        <w:t xml:space="preserve"> + 0.9</w:t>
+      </w:r>
+      <w:r>
+        <w:rPr>
+          <w:rFonts w:ascii="Times New Roman" w:eastAsia="Times New Roman" w:hAnsi="Times New Roman" w:cs="Times New Roman"/>
+          <w:kern w:val="0"/>
+          <w14:ligatures w14:val="none"/>
+        </w:rPr>
+        <w:t>2</w:t>
+      </w:r>
+      <w:r>
+        <w:rPr>
+          <w:rFonts w:ascii="Times New Roman" w:eastAsia="Times New Roman" w:hAnsi="Times New Roman" w:cs="Times New Roman"/>
+          <w:kern w:val="0"/>
+          <w14:ligatures w14:val="none"/>
+        </w:rPr>
+        <w:t>) = 0.9</w:t>
+      </w:r>
+      <w:r>
+        <w:rPr>
+          <w:rFonts w:ascii="Times New Roman" w:eastAsia="Times New Roman" w:hAnsi="Times New Roman" w:cs="Times New Roman"/>
+          <w:kern w:val="0"/>
+          <w14:ligatures w14:val="none"/>
+        </w:rPr>
+        <w:t>3</w:t>
+      </w:r>
+    </w:p>
+    <w:p>
+      <w:pPr>
+        <w:pStyle w:val="ListParagraph"/>
+        <w:numPr>
+          <w:ilvl w:val="0"/>
+          <w:numId w:val="11"/>
+        </w:numPr>
+        <w:rPr>
+          <w:rFonts w:ascii="Times New Roman" w:eastAsia="Times New Roman" w:hAnsi="Times New Roman" w:cs="Times New Roman"/>
+          <w:kern w:val="0"/>
+          <w14:ligatures w14:val="none"/>
+        </w:rPr>
+      </w:pPr>
+      <w:r>
+        <w:t xml:space="preserve">What is the </w:t>
+      </w:r>
+      <w:r>
+        <w:rPr>
+          <w:rFonts w:ascii="Times New Roman" w:eastAsia="Times New Roman" w:hAnsi="Times New Roman" w:cs="Times New Roman"/>
+          <w:kern w:val="0"/>
+          <w14:ligatures w14:val="none"/>
+        </w:rPr>
+        <w:t xml:space="preserve">number of actual samples in each class? </w:t>
+      </w:r>
+      <w:r>
+        <w:rPr>
+          <w:rFonts w:ascii="Times New Roman" w:eastAsia="Times New Roman" w:hAnsi="Times New Roman" w:cs="Times New Roman"/>
+          <w:kern w:val="0"/>
+          <w14:ligatures w14:val="none"/>
+        </w:rPr>
+        <w:t>(</w:t>
+      </w:r>
+      <w:r>
+        <w:t>Support is n</w:t>
+      </w:r>
+      <w:r>
+        <w:t>umber of actual samples in each class.</w:t>
+      </w:r>
+      <w:r>
+        <w:t>)</w:t>
+      </w:r>
+    </w:p>
+    <w:p>
+      <w:pPr>
+        <w:pStyle w:val="ListParagraph"/>
+        <w:ind w:firstLine="720"/>
+      </w:pPr>
+      <w:r>
+        <w:t>85 - did not purchase the course from advertisement.</w:t>
+      </w:r>
+    </w:p>
+    <w:p>
+      <w:pPr>
+        <w:pStyle w:val="ListParagraph"/>
+        <w:ind w:firstLine="720"/>
+      </w:pPr>
+      <w:r>
+        <w:t>49 - did purchase the course from advertisement.</w:t>
+      </w:r>
+    </w:p>
+    <w:p>
+      <w:pPr>
+        <w:pStyle w:val="ListParagraph"/>
+        <w:numPr>
+          <w:ilvl w:val="0"/>
+          <w:numId w:val="11"/>
+        </w:numPr>
+      </w:pPr>
+      <w:r>
+        <w:rPr>
+          <w:b/>
+          <w:bCs/>
+        </w:rPr>
+        <w:t>How many predictions did the model get right (Accuracy)? = (TP + TN) / (TP + TN + FP + FN) = (7</w:t>
+      </w:r>
+      <w:r>
+        <w:rPr>
+          <w:b/>
+          <w:bCs/>
+        </w:rPr>
+        <w:t>8</w:t>
+      </w:r>
+      <w:r>
+        <w:rPr>
+          <w:b/>
+          <w:bCs/>
+        </w:rPr>
+        <w:t>+ 4</w:t>
+      </w:r>
+      <w:r>
+        <w:rPr>
+          <w:b/>
+          <w:bCs/>
+        </w:rPr>
+        <w:t>5</w:t>
+      </w:r>
+      <w:r>
+        <w:rPr>
+          <w:b/>
+          <w:bCs/>
+        </w:rPr>
+        <w:t>)/ (7</w:t>
+      </w:r>
+      <w:r>
+        <w:rPr>
+          <w:b/>
+          <w:bCs/>
+        </w:rPr>
+        <w:t>8</w:t>
+      </w:r>
+      <w:r>
+        <w:rPr>
+          <w:b/>
+          <w:bCs/>
+        </w:rPr>
+        <w:t xml:space="preserve"> + 4</w:t>
+      </w:r>
+      <w:r>
+        <w:rPr>
+          <w:b/>
+          <w:bCs/>
+        </w:rPr>
+        <w:t>5</w:t>
+      </w:r>
+      <w:r>
+        <w:rPr>
+          <w:b/>
+          <w:bCs/>
+        </w:rPr>
+        <w:t xml:space="preserve"> + </w:t>
+      </w:r>
+      <w:r>
+        <w:rPr>
+          <w:b/>
+          <w:bCs/>
+        </w:rPr>
+        <w:t xml:space="preserve">4 </w:t>
+      </w:r>
+      <w:r>
+        <w:rPr>
+          <w:b/>
+          <w:bCs/>
+        </w:rPr>
+        <w:t xml:space="preserve">+ </w:t>
+      </w:r>
+      <w:r>
+        <w:rPr>
+          <w:b/>
+          <w:bCs/>
+        </w:rPr>
+        <w:t>7</w:t>
+      </w:r>
+      <w:r>
+        <w:rPr>
+          <w:b/>
+          <w:bCs/>
+        </w:rPr>
+        <w:t>) = 0.</w:t>
+      </w:r>
+      <w:r>
+        <w:rPr>
+          <w:b/>
+          <w:bCs/>
+        </w:rPr>
+        <w:t>92</w:t>
       </w:r>
     </w:p>
     <w:p>
@@ -1653,7 +2420,7 @@
 </file>
 
 <file path=word/numbering.xml><?xml version="1.0" encoding="utf-8"?>
-<w:numbering xmlns:wpc="http://schemas.microsoft.com/office/word/2010/wordprocessingCanvas" xmlns:cx="http://schemas.microsoft.com/office/drawing/2014/chartex" xmlns:cx1="http://schemas.microsoft.com/office/drawing/2015/9/8/chartex" xmlns:cx2="http://schemas.microsoft.com/office/drawing/2015/10/21/chartex" xmlns:cx3="http://schemas.microsoft.com/office/drawing/2016/5/9/chartex" xmlns:cx4="http://schemas.microsoft.com/office/drawing/2016/5/10/chartex" xmlns:cx5="http://schemas.microsoft.com/office/drawing/2016/5/11/chartex" xmlns:cx6="http://schemas.microsoft.com/office/drawing/2016/5/12/chartex" xmlns:cx7="http://schemas.microsoft.com/office/drawing/2016/5/13/chartex" xmlns:cx8="http://schemas.microsoft.com/office/drawing/2016/5/14/chartex" xmlns:mc="http://schemas.openxmlformats.org/markup-compatibility/2006" xmlns:aink="http://schemas.microsoft.com/office/drawing/2016/ink" xmlns:am3d="http://schemas.microsoft.com/office/drawing/2017/model3d" xmlns:o="urn:schemas-microsoft-com:office:office" xmlns:oel="http://schemas.microsoft.com/office/2019/extlst" xmlns:r="http://schemas.openxmlformats.org/officeDocument/2006/relationships" xmlns:m="http://schemas.openxmlformats.org/officeDocument/2006/math" xmlns:v="urn:schemas-microsoft-com:vml" xmlns:wp14="http://schemas.microsoft.com/office/word/2010/wordprocessingDrawing" xmlns:wp="http://schemas.openxmlformats.org/drawingml/2006/wordprocessingDrawing" xmlns:w10="urn:schemas-microsoft-com:office:word" xmlns:w="http://schemas.openxmlformats.org/wordprocessingml/2006/main" xmlns:w14="http://schemas.microsoft.com/office/word/2010/wordml" xmlns:w15="http://schemas.microsoft.com/office/word/2012/wordml" xmlns:w16cex="http://schemas.microsoft.com/office/word/2018/wordml/cex" xmlns:w16cid="http://schemas.microsoft.com/office/word/2016/wordml/cid" xmlns:w16="http://schemas.microsoft.com/office/word/2018/wordml" xmlns:w16du="http://schemas.microsoft.com/office/word/2023/wordml/word16du" xmlns:w16sdtdh="http://schemas.microsoft.com/office/word/2020/wordml/sdtdatahash" xmlns:w16sdtfl="http://schemas.microsoft.com/office/word/2024/wordml/sdtformatlock" xmlns:w16se="http://schemas.microsoft.com/office/word/2015/wordml/symex" xmlns:wpg="http://schemas.microsoft.com/office/word/2010/wordprocessingGroup" xmlns:wpi="http://schemas.microsoft.com/office/word/2010/wordprocessingInk" xmlns:wne="http://schemas.microsoft.com/office/word/2006/wordml" xmlns:wps="http://schemas.microsoft.com/office/word/2010/wordprocessingShape" mc:Ignorable="w14 w15 w16se w16cid w16 w16cex w16sdtdh w16sdtfl w16du wp14">
+<w:numbering xmlns:wpc="http://schemas.microsoft.com/office/word/2010/wordprocessingCanvas" xmlns:cx="http://schemas.microsoft.com/office/drawing/2014/chartex" xmlns:cx1="http://schemas.microsoft.com/office/drawing/2015/9/8/chartex" xmlns:cx2="http://schemas.microsoft.com/office/drawing/2015/10/21/chartex" xmlns:cx3="http://schemas.microsoft.com/office/drawing/2016/5/9/chartex" xmlns:cx4="http://schemas.microsoft.com/office/drawing/2016/5/10/chartex" xmlns:cx5="http://schemas.microsoft.com/office/drawing/2016/5/11/chartex" xmlns:cx6="http://schemas.microsoft.com/office/drawing/2016/5/12/chartex" xmlns:cx7="http://schemas.microsoft.com/office/drawing/2016/5/13/chartex" xmlns:cx8="http://schemas.microsoft.com/office/drawing/2016/5/14/chartex" xmlns:mc="http://schemas.openxmlformats.org/markup-compatibility/2006" xmlns:aink="http://schemas.microsoft.com/office/drawing/2016/ink" xmlns:am3d="http://schemas.microsoft.com/office/drawing/2017/model3d" xmlns:o="urn:schemas-microsoft-com:office:office" xmlns:oel="http://schemas.microsoft.com/office/2019/extlst" xmlns:r="http://schemas.openxmlformats.org/officeDocument/2006/relationships" xmlns:m="http://schemas.openxmlformats.org/officeDocument/2006/math" xmlns:v="urn:schemas-microsoft-com:vml" xmlns:wp14="http://schemas.microsoft.com/office/word/2010/wordprocessingDrawing" xmlns:wp="http://schemas.openxmlformats.org/drawingml/2006/wordprocessingDrawing" xmlns:w10="urn:schemas-microsoft-com:office:word" xmlns:w="http://schemas.openxmlformats.org/wordprocessingml/2006/main" xmlns:w14="http://schemas.microsoft.com/office/word/2010/wordml" xmlns:w15="http://schemas.microsoft.com/office/word/2012/wordml" xmlns:w16cei="http://schemas.microsoft.com/office/word/2026/wordml/cei" xmlns:w16cex="http://schemas.microsoft.com/office/word/2018/wordml/cex" xmlns:w16cid="http://schemas.microsoft.com/office/word/2016/wordml/cid" xmlns:w16="http://schemas.microsoft.com/office/word/2018/wordml" xmlns:w16du="http://schemas.microsoft.com/office/word/2023/wordml/word16du" xmlns:w16sdtdh="http://schemas.microsoft.com/office/word/2020/wordml/sdtdatahash" xmlns:w16sdtfl="http://schemas.microsoft.com/office/word/2024/wordml/sdtformatlock" xmlns:w16se="http://schemas.microsoft.com/office/word/2015/wordml/symex" xmlns:wpg="http://schemas.microsoft.com/office/word/2010/wordprocessingGroup" xmlns:wpi="http://schemas.microsoft.com/office/word/2010/wordprocessingInk" xmlns:wne="http://schemas.microsoft.com/office/word/2006/wordml" xmlns:wps="http://schemas.microsoft.com/office/word/2010/wordprocessingShape" mc:Ignorable="w14 w15 w16se w16cid w16 w16cex w16sdtdh w16sdtfl w16du wp14">
   <w:abstractNum w:abstractNumId="0" w15:restartNumberingAfterBreak="0">
     <w:nsid w:val="078703DC"/>
     <w:multiLevelType w:val="multilevel"/>
@@ -2338,6 +3105,95 @@
     </w:lvl>
   </w:abstractNum>
   <w:abstractNum w:abstractNumId="7" w15:restartNumberingAfterBreak="0">
+    <w:nsid w:val="4361304E"/>
+    <w:multiLevelType w:val="hybridMultilevel"/>
+    <w:tmpl w:val="2B1AD4A2"/>
+    <w:lvl w:ilvl="0" w:tplc="FFFFFFFF">
+      <w:start w:val="1"/>
+      <w:numFmt w:val="decimal"/>
+      <w:lvlText w:val="%1."/>
+      <w:lvlJc w:val="left"/>
+      <w:pPr>
+        <w:ind w:left="1440" w:hanging="360"/>
+      </w:pPr>
+      <w:rPr>
+        <w:rFonts w:hint="default"/>
+      </w:rPr>
+    </w:lvl>
+    <w:lvl w:ilvl="1" w:tplc="FFFFFFFF" w:tentative="1">
+      <w:start w:val="1"/>
+      <w:numFmt w:val="lowerLetter"/>
+      <w:lvlText w:val="%2."/>
+      <w:lvlJc w:val="left"/>
+      <w:pPr>
+        <w:ind w:left="2160" w:hanging="360"/>
+      </w:pPr>
+    </w:lvl>
+    <w:lvl w:ilvl="2" w:tplc="FFFFFFFF" w:tentative="1">
+      <w:start w:val="1"/>
+      <w:numFmt w:val="lowerRoman"/>
+      <w:lvlText w:val="%3."/>
+      <w:lvlJc w:val="right"/>
+      <w:pPr>
+        <w:ind w:left="2880" w:hanging="180"/>
+      </w:pPr>
+    </w:lvl>
+    <w:lvl w:ilvl="3" w:tplc="FFFFFFFF" w:tentative="1">
+      <w:start w:val="1"/>
+      <w:numFmt w:val="decimal"/>
+      <w:lvlText w:val="%4."/>
+      <w:lvlJc w:val="left"/>
+      <w:pPr>
+        <w:ind w:left="3600" w:hanging="360"/>
+      </w:pPr>
+    </w:lvl>
+    <w:lvl w:ilvl="4" w:tplc="FFFFFFFF" w:tentative="1">
+      <w:start w:val="1"/>
+      <w:numFmt w:val="lowerLetter"/>
+      <w:lvlText w:val="%5."/>
+      <w:lvlJc w:val="left"/>
+      <w:pPr>
+        <w:ind w:left="4320" w:hanging="360"/>
+      </w:pPr>
+    </w:lvl>
+    <w:lvl w:ilvl="5" w:tplc="FFFFFFFF" w:tentative="1">
+      <w:start w:val="1"/>
+      <w:numFmt w:val="lowerRoman"/>
+      <w:lvlText w:val="%6."/>
+      <w:lvlJc w:val="right"/>
+      <w:pPr>
+        <w:ind w:left="5040" w:hanging="180"/>
+      </w:pPr>
+    </w:lvl>
+    <w:lvl w:ilvl="6" w:tplc="FFFFFFFF" w:tentative="1">
+      <w:start w:val="1"/>
+      <w:numFmt w:val="decimal"/>
+      <w:lvlText w:val="%7."/>
+      <w:lvlJc w:val="left"/>
+      <w:pPr>
+        <w:ind w:left="5760" w:hanging="360"/>
+      </w:pPr>
+    </w:lvl>
+    <w:lvl w:ilvl="7" w:tplc="FFFFFFFF" w:tentative="1">
+      <w:start w:val="1"/>
+      <w:numFmt w:val="lowerLetter"/>
+      <w:lvlText w:val="%8."/>
+      <w:lvlJc w:val="left"/>
+      <w:pPr>
+        <w:ind w:left="6480" w:hanging="360"/>
+      </w:pPr>
+    </w:lvl>
+    <w:lvl w:ilvl="8" w:tplc="FFFFFFFF" w:tentative="1">
+      <w:start w:val="1"/>
+      <w:numFmt w:val="lowerRoman"/>
+      <w:lvlText w:val="%9."/>
+      <w:lvlJc w:val="right"/>
+      <w:pPr>
+        <w:ind w:left="7200" w:hanging="180"/>
+      </w:pPr>
+    </w:lvl>
+  </w:abstractNum>
+  <w:abstractNum w:abstractNumId="8" w15:restartNumberingAfterBreak="0">
     <w:nsid w:val="5BC8457B"/>
     <w:multiLevelType w:val="hybridMultilevel"/>
     <w:tmpl w:val="2B1AD4A2"/>
@@ -2426,7 +3282,7 @@
       </w:pPr>
     </w:lvl>
   </w:abstractNum>
-  <w:abstractNum w:abstractNumId="8" w15:restartNumberingAfterBreak="0">
+  <w:abstractNum w:abstractNumId="9" w15:restartNumberingAfterBreak="0">
     <w:nsid w:val="5D1A710E"/>
     <w:multiLevelType w:val="hybridMultilevel"/>
     <w:tmpl w:val="6652CD3E"/>
@@ -2506,6 +3362,95 @@
       </w:pPr>
     </w:lvl>
     <w:lvl w:ilvl="8" w:tplc="0409001B" w:tentative="1">
+      <w:start w:val="1"/>
+      <w:numFmt w:val="lowerRoman"/>
+      <w:lvlText w:val="%9."/>
+      <w:lvlJc w:val="right"/>
+      <w:pPr>
+        <w:ind w:left="7200" w:hanging="180"/>
+      </w:pPr>
+    </w:lvl>
+  </w:abstractNum>
+  <w:abstractNum w:abstractNumId="10" w15:restartNumberingAfterBreak="0">
+    <w:nsid w:val="696214F5"/>
+    <w:multiLevelType w:val="hybridMultilevel"/>
+    <w:tmpl w:val="2B1AD4A2"/>
+    <w:lvl w:ilvl="0" w:tplc="FFFFFFFF">
+      <w:start w:val="1"/>
+      <w:numFmt w:val="decimal"/>
+      <w:lvlText w:val="%1."/>
+      <w:lvlJc w:val="left"/>
+      <w:pPr>
+        <w:ind w:left="1440" w:hanging="360"/>
+      </w:pPr>
+      <w:rPr>
+        <w:rFonts w:hint="default"/>
+      </w:rPr>
+    </w:lvl>
+    <w:lvl w:ilvl="1" w:tplc="FFFFFFFF" w:tentative="1">
+      <w:start w:val="1"/>
+      <w:numFmt w:val="lowerLetter"/>
+      <w:lvlText w:val="%2."/>
+      <w:lvlJc w:val="left"/>
+      <w:pPr>
+        <w:ind w:left="2160" w:hanging="360"/>
+      </w:pPr>
+    </w:lvl>
+    <w:lvl w:ilvl="2" w:tplc="FFFFFFFF" w:tentative="1">
+      <w:start w:val="1"/>
+      <w:numFmt w:val="lowerRoman"/>
+      <w:lvlText w:val="%3."/>
+      <w:lvlJc w:val="right"/>
+      <w:pPr>
+        <w:ind w:left="2880" w:hanging="180"/>
+      </w:pPr>
+    </w:lvl>
+    <w:lvl w:ilvl="3" w:tplc="FFFFFFFF" w:tentative="1">
+      <w:start w:val="1"/>
+      <w:numFmt w:val="decimal"/>
+      <w:lvlText w:val="%4."/>
+      <w:lvlJc w:val="left"/>
+      <w:pPr>
+        <w:ind w:left="3600" w:hanging="360"/>
+      </w:pPr>
+    </w:lvl>
+    <w:lvl w:ilvl="4" w:tplc="FFFFFFFF" w:tentative="1">
+      <w:start w:val="1"/>
+      <w:numFmt w:val="lowerLetter"/>
+      <w:lvlText w:val="%5."/>
+      <w:lvlJc w:val="left"/>
+      <w:pPr>
+        <w:ind w:left="4320" w:hanging="360"/>
+      </w:pPr>
+    </w:lvl>
+    <w:lvl w:ilvl="5" w:tplc="FFFFFFFF" w:tentative="1">
+      <w:start w:val="1"/>
+      <w:numFmt w:val="lowerRoman"/>
+      <w:lvlText w:val="%6."/>
+      <w:lvlJc w:val="right"/>
+      <w:pPr>
+        <w:ind w:left="5040" w:hanging="180"/>
+      </w:pPr>
+    </w:lvl>
+    <w:lvl w:ilvl="6" w:tplc="FFFFFFFF" w:tentative="1">
+      <w:start w:val="1"/>
+      <w:numFmt w:val="decimal"/>
+      <w:lvlText w:val="%7."/>
+      <w:lvlJc w:val="left"/>
+      <w:pPr>
+        <w:ind w:left="5760" w:hanging="360"/>
+      </w:pPr>
+    </w:lvl>
+    <w:lvl w:ilvl="7" w:tplc="FFFFFFFF" w:tentative="1">
+      <w:start w:val="1"/>
+      <w:numFmt w:val="lowerLetter"/>
+      <w:lvlText w:val="%8."/>
+      <w:lvlJc w:val="left"/>
+      <w:pPr>
+        <w:ind w:left="6480" w:hanging="360"/>
+      </w:pPr>
+    </w:lvl>
+    <w:lvl w:ilvl="8" w:tplc="FFFFFFFF" w:tentative="1">
       <w:start w:val="1"/>
       <w:numFmt w:val="lowerRoman"/>
       <w:lvlText w:val="%9."/>
@@ -2537,9 +3482,15 @@
     <w:abstractNumId w:val="5"/>
   </w:num>
   <w:num w:numId="8" w16cid:durableId="697630763">
+    <w:abstractNumId w:val="9"/>
+  </w:num>
+  <w:num w:numId="9" w16cid:durableId="1902671883">
     <w:abstractNumId w:val="8"/>
   </w:num>
-  <w:num w:numId="9" w16cid:durableId="1902671883">
+  <w:num w:numId="10" w16cid:durableId="1077753651">
+    <w:abstractNumId w:val="10"/>
+  </w:num>
+  <w:num w:numId="11" w16cid:durableId="1607810135">
     <w:abstractNumId w:val="7"/>
   </w:num>
 </w:numbering>
@@ -3148,6 +4099,7 @@
   <w:style w:type="character" w:default="1" w:styleId="DefaultParagraphFont">
     <w:name w:val="Default Paragraph Font"/>
     <w:uiPriority w:val="1"/>
+    <w:semiHidden/>
     <w:unhideWhenUsed/>
   </w:style>
   <w:style w:type="table" w:default="1" w:styleId="TableNormal">

</xml_diff>

<commit_message>
Updated the confusion matrix of naive bayes
</commit_message>
<xml_diff>
--- a/Classification/Classification Report.docx
+++ b/Classification/Classification Report.docx
@@ -1,6 +1,6 @@
 
 <file path=word/document.xml><?xml version="1.0" encoding="utf-8"?>
-<w:document xmlns:wpc="http://schemas.microsoft.com/office/word/2010/wordprocessingCanvas" xmlns:cx="http://schemas.microsoft.com/office/drawing/2014/chartex" xmlns:cx1="http://schemas.microsoft.com/office/drawing/2015/9/8/chartex" xmlns:cx2="http://schemas.microsoft.com/office/drawing/2015/10/21/chartex" xmlns:cx3="http://schemas.microsoft.com/office/drawing/2016/5/9/chartex" xmlns:cx4="http://schemas.microsoft.com/office/drawing/2016/5/10/chartex" xmlns:cx5="http://schemas.microsoft.com/office/drawing/2016/5/11/chartex" xmlns:cx6="http://schemas.microsoft.com/office/drawing/2016/5/12/chartex" xmlns:cx7="http://schemas.microsoft.com/office/drawing/2016/5/13/chartex" xmlns:cx8="http://schemas.microsoft.com/office/drawing/2016/5/14/chartex" xmlns:mc="http://schemas.openxmlformats.org/markup-compatibility/2006" xmlns:aink="http://schemas.microsoft.com/office/drawing/2016/ink" xmlns:am3d="http://schemas.microsoft.com/office/drawing/2017/model3d" xmlns:o="urn:schemas-microsoft-com:office:office" xmlns:oel="http://schemas.microsoft.com/office/2019/extlst" xmlns:r="http://schemas.openxmlformats.org/officeDocument/2006/relationships" xmlns:m="http://schemas.openxmlformats.org/officeDocument/2006/math" xmlns:v="urn:schemas-microsoft-com:vml" xmlns:wp14="http://schemas.microsoft.com/office/word/2010/wordprocessingDrawing" xmlns:wp="http://schemas.openxmlformats.org/drawingml/2006/wordprocessingDrawing" xmlns:w10="urn:schemas-microsoft-com:office:word" xmlns:w="http://schemas.openxmlformats.org/wordprocessingml/2006/main" xmlns:w14="http://schemas.microsoft.com/office/word/2010/wordml" xmlns:w15="http://schemas.microsoft.com/office/word/2012/wordml" xmlns:w16cei="http://schemas.microsoft.com/office/word/2026/wordml/cei" xmlns:w16cex="http://schemas.microsoft.com/office/word/2018/wordml/cex" xmlns:w16cid="http://schemas.microsoft.com/office/word/2016/wordml/cid" xmlns:w16="http://schemas.microsoft.com/office/word/2018/wordml" xmlns:w16du="http://schemas.microsoft.com/office/word/2023/wordml/word16du" xmlns:w16sdtdh="http://schemas.microsoft.com/office/word/2020/wordml/sdtdatahash" xmlns:w16sdtfl="http://schemas.microsoft.com/office/word/2024/wordml/sdtformatlock" xmlns:w16se="http://schemas.microsoft.com/office/word/2015/wordml/symex" xmlns:wpg="http://schemas.microsoft.com/office/word/2010/wordprocessingGroup" xmlns:wpi="http://schemas.microsoft.com/office/word/2010/wordprocessingInk" xmlns:wne="http://schemas.microsoft.com/office/word/2006/wordml" xmlns:wps="http://schemas.microsoft.com/office/word/2010/wordprocessingShape" mc:Ignorable="w14 w15 w16se w16cid w16 w16cex w16sdtdh w16sdtfl w16du wp14">
+<w:document xmlns:wpc="http://schemas.microsoft.com/office/word/2010/wordprocessingCanvas" xmlns:cx="http://schemas.microsoft.com/office/drawing/2014/chartex" xmlns:cx1="http://schemas.microsoft.com/office/drawing/2015/9/8/chartex" xmlns:cx2="http://schemas.microsoft.com/office/drawing/2015/10/21/chartex" xmlns:cx3="http://schemas.microsoft.com/office/drawing/2016/5/9/chartex" xmlns:cx4="http://schemas.microsoft.com/office/drawing/2016/5/10/chartex" xmlns:cx5="http://schemas.microsoft.com/office/drawing/2016/5/11/chartex" xmlns:cx6="http://schemas.microsoft.com/office/drawing/2016/5/12/chartex" xmlns:cx7="http://schemas.microsoft.com/office/drawing/2016/5/13/chartex" xmlns:cx8="http://schemas.microsoft.com/office/drawing/2016/5/14/chartex" xmlns:mc="http://schemas.openxmlformats.org/markup-compatibility/2006" xmlns:aink="http://schemas.microsoft.com/office/drawing/2016/ink" xmlns:am3d="http://schemas.microsoft.com/office/drawing/2017/model3d" xmlns:o="urn:schemas-microsoft-com:office:office" xmlns:oel="http://schemas.microsoft.com/office/2019/extlst" xmlns:r="http://schemas.openxmlformats.org/officeDocument/2006/relationships" xmlns:m="http://schemas.openxmlformats.org/officeDocument/2006/math" xmlns:v="urn:schemas-microsoft-com:vml" xmlns:wp14="http://schemas.microsoft.com/office/word/2010/wordprocessingDrawing" xmlns:wp="http://schemas.openxmlformats.org/drawingml/2006/wordprocessingDrawing" xmlns:w10="urn:schemas-microsoft-com:office:word" xmlns:w="http://schemas.openxmlformats.org/wordprocessingml/2006/main" xmlns:w14="http://schemas.microsoft.com/office/word/2010/wordml" xmlns:w15="http://schemas.microsoft.com/office/word/2012/wordml" xmlns:w16cex="http://schemas.microsoft.com/office/word/2018/wordml/cex" xmlns:w16cid="http://schemas.microsoft.com/office/word/2016/wordml/cid" xmlns:w16="http://schemas.microsoft.com/office/word/2018/wordml" xmlns:w16du="http://schemas.microsoft.com/office/word/2023/wordml/word16du" xmlns:w16sdtdh="http://schemas.microsoft.com/office/word/2020/wordml/sdtdatahash" xmlns:w16sdtfl="http://schemas.microsoft.com/office/word/2024/wordml/sdtformatlock" xmlns:w16se="http://schemas.microsoft.com/office/word/2015/wordml/symex" xmlns:wpg="http://schemas.microsoft.com/office/word/2010/wordprocessingGroup" xmlns:wpi="http://schemas.microsoft.com/office/word/2010/wordprocessingInk" xmlns:wne="http://schemas.microsoft.com/office/word/2006/wordml" xmlns:wps="http://schemas.microsoft.com/office/word/2010/wordprocessingShape" mc:Ignorable="w14 w15 w16se w16cid w16 w16cex w16sdtdh w16sdtfl w16du wp14">
   <w:body>
     <w:p>
       <w:pPr>
@@ -1860,16 +1860,7 @@
           <w:sz w:val="40"/>
           <w:szCs w:val="40"/>
         </w:rPr>
-        <w:t xml:space="preserve"> </w:t>
-      </w:r>
-      <w:r>
-        <w:rPr>
-          <w:b/>
-          <w:bCs/>
-          <w:sz w:val="40"/>
-          <w:szCs w:val="40"/>
-        </w:rPr>
-        <w:t>(with Standardization)</w:t>
+        <w:t xml:space="preserve"> (with Standardization)</w:t>
       </w:r>
     </w:p>
     <w:p>
@@ -2041,63 +2032,7 @@
           <w:kern w:val="0"/>
           <w14:ligatures w14:val="none"/>
         </w:rPr>
-        <w:t xml:space="preserve"> = 7</w:t>
-      </w:r>
-      <w:r>
-        <w:rPr>
-          <w:rFonts w:ascii="Times New Roman" w:eastAsia="Times New Roman" w:hAnsi="Times New Roman" w:cs="Times New Roman"/>
-          <w:kern w:val="0"/>
-          <w14:ligatures w14:val="none"/>
-        </w:rPr>
-        <w:t>8</w:t>
-      </w:r>
-      <w:r>
-        <w:rPr>
-          <w:rFonts w:ascii="Times New Roman" w:eastAsia="Times New Roman" w:hAnsi="Times New Roman" w:cs="Times New Roman"/>
-          <w:kern w:val="0"/>
-          <w14:ligatures w14:val="none"/>
-        </w:rPr>
-        <w:t>/ (7</w:t>
-      </w:r>
-      <w:r>
-        <w:rPr>
-          <w:rFonts w:ascii="Times New Roman" w:eastAsia="Times New Roman" w:hAnsi="Times New Roman" w:cs="Times New Roman"/>
-          <w:kern w:val="0"/>
-          <w14:ligatures w14:val="none"/>
-        </w:rPr>
-        <w:t>8</w:t>
-      </w:r>
-      <w:r>
-        <w:rPr>
-          <w:rFonts w:ascii="Times New Roman" w:eastAsia="Times New Roman" w:hAnsi="Times New Roman" w:cs="Times New Roman"/>
-          <w:kern w:val="0"/>
-          <w14:ligatures w14:val="none"/>
-        </w:rPr>
-        <w:t xml:space="preserve"> + </w:t>
-      </w:r>
-      <w:r>
-        <w:rPr>
-          <w:rFonts w:ascii="Times New Roman" w:eastAsia="Times New Roman" w:hAnsi="Times New Roman" w:cs="Times New Roman"/>
-          <w:kern w:val="0"/>
-          <w14:ligatures w14:val="none"/>
-        </w:rPr>
-        <w:t>7</w:t>
-      </w:r>
-      <w:r>
-        <w:rPr>
-          <w:rFonts w:ascii="Times New Roman" w:eastAsia="Times New Roman" w:hAnsi="Times New Roman" w:cs="Times New Roman"/>
-          <w:kern w:val="0"/>
-          <w14:ligatures w14:val="none"/>
-        </w:rPr>
-        <w:t>) = 0.9</w:t>
-      </w:r>
-      <w:r>
-        <w:rPr>
-          <w:rFonts w:ascii="Times New Roman" w:eastAsia="Times New Roman" w:hAnsi="Times New Roman" w:cs="Times New Roman"/>
-          <w:kern w:val="0"/>
-          <w14:ligatures w14:val="none"/>
-        </w:rPr>
-        <w:t>2</w:t>
+        <w:t xml:space="preserve"> = 78/ (78 + 7) = 0.92</w:t>
       </w:r>
     </w:p>
     <w:p>
@@ -2162,79 +2097,7 @@
           <w:kern w:val="0"/>
           <w14:ligatures w14:val="none"/>
         </w:rPr>
-        <w:t xml:space="preserve"> = 2 * (0.9</w:t>
-      </w:r>
-      <w:r>
-        <w:rPr>
-          <w:rFonts w:ascii="Times New Roman" w:eastAsia="Times New Roman" w:hAnsi="Times New Roman" w:cs="Times New Roman"/>
-          <w:kern w:val="0"/>
-          <w14:ligatures w14:val="none"/>
-        </w:rPr>
-        <w:t>5</w:t>
-      </w:r>
-      <w:r>
-        <w:rPr>
-          <w:rFonts w:ascii="Times New Roman" w:eastAsia="Times New Roman" w:hAnsi="Times New Roman" w:cs="Times New Roman"/>
-          <w:kern w:val="0"/>
-          <w14:ligatures w14:val="none"/>
-        </w:rPr>
-        <w:t xml:space="preserve"> * 0.9</w:t>
-      </w:r>
-      <w:r>
-        <w:rPr>
-          <w:rFonts w:ascii="Times New Roman" w:eastAsia="Times New Roman" w:hAnsi="Times New Roman" w:cs="Times New Roman"/>
-          <w:kern w:val="0"/>
-          <w14:ligatures w14:val="none"/>
-        </w:rPr>
-        <w:t>2</w:t>
-      </w:r>
-      <w:r>
-        <w:rPr>
-          <w:rFonts w:ascii="Times New Roman" w:eastAsia="Times New Roman" w:hAnsi="Times New Roman" w:cs="Times New Roman"/>
-          <w:kern w:val="0"/>
-          <w14:ligatures w14:val="none"/>
-        </w:rPr>
-        <w:t>)/ (0.9</w:t>
-      </w:r>
-      <w:r>
-        <w:rPr>
-          <w:rFonts w:ascii="Times New Roman" w:eastAsia="Times New Roman" w:hAnsi="Times New Roman" w:cs="Times New Roman"/>
-          <w:kern w:val="0"/>
-          <w14:ligatures w14:val="none"/>
-        </w:rPr>
-        <w:t>5</w:t>
-      </w:r>
-      <w:r>
-        <w:rPr>
-          <w:rFonts w:ascii="Times New Roman" w:eastAsia="Times New Roman" w:hAnsi="Times New Roman" w:cs="Times New Roman"/>
-          <w:kern w:val="0"/>
-          <w14:ligatures w14:val="none"/>
-        </w:rPr>
-        <w:t xml:space="preserve"> + 0.9</w:t>
-      </w:r>
-      <w:r>
-        <w:rPr>
-          <w:rFonts w:ascii="Times New Roman" w:eastAsia="Times New Roman" w:hAnsi="Times New Roman" w:cs="Times New Roman"/>
-          <w:kern w:val="0"/>
-          <w14:ligatures w14:val="none"/>
-        </w:rPr>
-        <w:t>2</w:t>
-      </w:r>
-      <w:r>
-        <w:rPr>
-          <w:rFonts w:ascii="Times New Roman" w:eastAsia="Times New Roman" w:hAnsi="Times New Roman" w:cs="Times New Roman"/>
-          <w:kern w:val="0"/>
-          <w14:ligatures w14:val="none"/>
-        </w:rPr>
-        <w:t>) = 0.9</w:t>
-      </w:r>
-      <w:r>
-        <w:rPr>
-          <w:rFonts w:ascii="Times New Roman" w:eastAsia="Times New Roman" w:hAnsi="Times New Roman" w:cs="Times New Roman"/>
-          <w:kern w:val="0"/>
-          <w14:ligatures w14:val="none"/>
-        </w:rPr>
-        <w:t>3</w:t>
+        <w:t xml:space="preserve"> = 2 * (0.95 * 0.92)/ (0.95 + 0.92) = 0.93</w:t>
       </w:r>
     </w:p>
     <w:p>
@@ -2406,9 +2269,3874 @@
     </w:p>
     <w:p>
       <w:pPr>
+        <w:ind w:left="720" w:hanging="360"/>
+        <w:rPr>
+          <w:b/>
+          <w:bCs/>
+          <w:sz w:val="40"/>
+          <w:szCs w:val="40"/>
+        </w:rPr>
+      </w:pPr>
+      <w:r>
+        <w:br/>
+      </w:r>
+      <w:r>
+        <w:rPr>
+          <w:b/>
+          <w:bCs/>
+          <w:sz w:val="40"/>
+          <w:szCs w:val="40"/>
+        </w:rPr>
+        <w:t>Multinomial Naive Bayes</w:t>
+      </w:r>
+    </w:p>
+    <w:p>
+      <w:pPr>
         <w:pStyle w:val="ListParagraph"/>
-      </w:pPr>
-    </w:p>
+        <w:numPr>
+          <w:ilvl w:val="0"/>
+          <w:numId w:val="12"/>
+        </w:numPr>
+        <w:rPr>
+          <w:rFonts w:ascii="Times New Roman" w:eastAsia="Times New Roman" w:hAnsi="Times New Roman" w:cs="Times New Roman"/>
+          <w:kern w:val="0"/>
+          <w14:ligatures w14:val="none"/>
+        </w:rPr>
+      </w:pPr>
+      <w:r>
+        <w:rPr>
+          <w:rFonts w:ascii="Times New Roman" w:eastAsia="Times New Roman" w:hAnsi="Times New Roman" w:cs="Times New Roman"/>
+          <w:kern w:val="0"/>
+          <w14:ligatures w14:val="none"/>
+        </w:rPr>
+        <w:t xml:space="preserve">When the model says Yes, how often is it correct? (i.e., Precision) = TP/ (TP + FP) = </w:t>
+      </w:r>
+      <w:r>
+        <w:rPr>
+          <w:rFonts w:ascii="Times New Roman" w:eastAsia="Times New Roman" w:hAnsi="Times New Roman" w:cs="Times New Roman"/>
+          <w:kern w:val="0"/>
+          <w14:ligatures w14:val="none"/>
+        </w:rPr>
+        <w:t>85</w:t>
+      </w:r>
+      <w:r>
+        <w:rPr>
+          <w:rFonts w:ascii="Times New Roman" w:eastAsia="Times New Roman" w:hAnsi="Times New Roman" w:cs="Times New Roman"/>
+          <w:kern w:val="0"/>
+          <w14:ligatures w14:val="none"/>
+        </w:rPr>
+        <w:t>/ (</w:t>
+      </w:r>
+      <w:r>
+        <w:rPr>
+          <w:rFonts w:ascii="Times New Roman" w:eastAsia="Times New Roman" w:hAnsi="Times New Roman" w:cs="Times New Roman"/>
+          <w:kern w:val="0"/>
+          <w14:ligatures w14:val="none"/>
+        </w:rPr>
+        <w:t>85</w:t>
+      </w:r>
+      <w:r>
+        <w:rPr>
+          <w:rFonts w:ascii="Times New Roman" w:eastAsia="Times New Roman" w:hAnsi="Times New Roman" w:cs="Times New Roman"/>
+          <w:kern w:val="0"/>
+          <w14:ligatures w14:val="none"/>
+        </w:rPr>
+        <w:t xml:space="preserve"> + </w:t>
+      </w:r>
+      <w:r>
+        <w:rPr>
+          <w:rFonts w:ascii="Times New Roman" w:eastAsia="Times New Roman" w:hAnsi="Times New Roman" w:cs="Times New Roman"/>
+          <w:kern w:val="0"/>
+          <w14:ligatures w14:val="none"/>
+        </w:rPr>
+        <w:t>4</w:t>
+      </w:r>
+      <w:r>
+        <w:rPr>
+          <w:rFonts w:ascii="Times New Roman" w:eastAsia="Times New Roman" w:hAnsi="Times New Roman" w:cs="Times New Roman"/>
+          <w:kern w:val="0"/>
+          <w14:ligatures w14:val="none"/>
+        </w:rPr>
+        <w:t>9</w:t>
+      </w:r>
+      <w:r>
+        <w:rPr>
+          <w:rFonts w:ascii="Times New Roman" w:eastAsia="Times New Roman" w:hAnsi="Times New Roman" w:cs="Times New Roman"/>
+          <w:kern w:val="0"/>
+          <w14:ligatures w14:val="none"/>
+        </w:rPr>
+        <w:t>) = 0.</w:t>
+      </w:r>
+      <w:r>
+        <w:rPr>
+          <w:rFonts w:ascii="Times New Roman" w:eastAsia="Times New Roman" w:hAnsi="Times New Roman" w:cs="Times New Roman"/>
+          <w:kern w:val="0"/>
+          <w14:ligatures w14:val="none"/>
+        </w:rPr>
+        <w:t>63</w:t>
+      </w:r>
+    </w:p>
+    <w:p>
+      <w:pPr>
+        <w:pStyle w:val="ListParagraph"/>
+        <w:numPr>
+          <w:ilvl w:val="0"/>
+          <w:numId w:val="12"/>
+        </w:numPr>
+        <w:rPr>
+          <w:rFonts w:ascii="Times New Roman" w:eastAsia="Times New Roman" w:hAnsi="Times New Roman" w:cs="Times New Roman"/>
+          <w:kern w:val="0"/>
+          <w14:ligatures w14:val="none"/>
+        </w:rPr>
+      </w:pPr>
+      <w:r>
+        <w:rPr>
+          <w:rFonts w:ascii="Times New Roman" w:eastAsia="Times New Roman" w:hAnsi="Times New Roman" w:cs="Times New Roman"/>
+          <w:kern w:val="0"/>
+          <w14:ligatures w14:val="none"/>
+        </w:rPr>
+        <w:t xml:space="preserve">Out of all actual </w:t>
+      </w:r>
+      <w:r>
+        <w:rPr>
+          <w:rFonts w:ascii="Times New Roman" w:eastAsia="Times New Roman" w:hAnsi="Times New Roman" w:cs="Times New Roman"/>
+          <w:kern w:val="0"/>
+          <w14:ligatures w14:val="none"/>
+        </w:rPr>
+        <w:t>Yes</w:t>
+      </w:r>
+      <w:r>
+        <w:rPr>
+          <w:rFonts w:ascii="Times New Roman" w:eastAsia="Times New Roman" w:hAnsi="Times New Roman" w:cs="Times New Roman"/>
+          <w:kern w:val="0"/>
+          <w14:ligatures w14:val="none"/>
+        </w:rPr>
+        <w:t xml:space="preserve">, how many did the model find? </w:t>
+      </w:r>
+      <w:r>
+        <w:rPr>
+          <w:rFonts w:ascii="Times New Roman" w:eastAsia="Times New Roman" w:hAnsi="Times New Roman" w:cs="Times New Roman"/>
+          <w:kern w:val="0"/>
+          <w14:ligatures w14:val="none"/>
+        </w:rPr>
+        <w:t xml:space="preserve">(i.e., </w:t>
+      </w:r>
+      <w:r>
+        <w:rPr>
+          <w:rFonts w:ascii="Times New Roman" w:eastAsia="Times New Roman" w:hAnsi="Times New Roman" w:cs="Times New Roman"/>
+          <w:kern w:val="0"/>
+          <w14:ligatures w14:val="none"/>
+        </w:rPr>
+        <w:t>Recall</w:t>
+      </w:r>
+      <w:r>
+        <w:rPr>
+          <w:rFonts w:ascii="Times New Roman" w:eastAsia="Times New Roman" w:hAnsi="Times New Roman" w:cs="Times New Roman"/>
+          <w:kern w:val="0"/>
+          <w14:ligatures w14:val="none"/>
+        </w:rPr>
+        <w:t>)</w:t>
+      </w:r>
+      <w:r>
+        <w:rPr>
+          <w:rFonts w:ascii="Times New Roman" w:eastAsia="Times New Roman" w:hAnsi="Times New Roman" w:cs="Times New Roman"/>
+          <w:kern w:val="0"/>
+          <w14:ligatures w14:val="none"/>
+        </w:rPr>
+        <w:t>?</w:t>
+      </w:r>
+      <w:r>
+        <w:rPr>
+          <w:rFonts w:ascii="Times New Roman" w:eastAsia="Times New Roman" w:hAnsi="Times New Roman" w:cs="Times New Roman"/>
+          <w:kern w:val="0"/>
+          <w14:ligatures w14:val="none"/>
+        </w:rPr>
+        <w:t xml:space="preserve"> </w:t>
+      </w:r>
+      <w:r>
+        <w:rPr>
+          <w:rFonts w:ascii="Times New Roman" w:eastAsia="Times New Roman" w:hAnsi="Times New Roman" w:cs="Times New Roman"/>
+          <w:kern w:val="0"/>
+          <w14:ligatures w14:val="none"/>
+        </w:rPr>
+        <w:t>= TP / (TP + FN)</w:t>
+      </w:r>
+      <w:r>
+        <w:rPr>
+          <w:rFonts w:ascii="Times New Roman" w:eastAsia="Times New Roman" w:hAnsi="Times New Roman" w:cs="Times New Roman"/>
+          <w:kern w:val="0"/>
+          <w14:ligatures w14:val="none"/>
+        </w:rPr>
+        <w:t xml:space="preserve"> = </w:t>
+      </w:r>
+      <w:r>
+        <w:rPr>
+          <w:rFonts w:ascii="Times New Roman" w:eastAsia="Times New Roman" w:hAnsi="Times New Roman" w:cs="Times New Roman"/>
+          <w:kern w:val="0"/>
+          <w14:ligatures w14:val="none"/>
+        </w:rPr>
+        <w:t>85</w:t>
+      </w:r>
+      <w:r>
+        <w:rPr>
+          <w:rFonts w:ascii="Times New Roman" w:eastAsia="Times New Roman" w:hAnsi="Times New Roman" w:cs="Times New Roman"/>
+          <w:kern w:val="0"/>
+          <w14:ligatures w14:val="none"/>
+        </w:rPr>
+        <w:t>/ (</w:t>
+      </w:r>
+      <w:r>
+        <w:rPr>
+          <w:rFonts w:ascii="Times New Roman" w:eastAsia="Times New Roman" w:hAnsi="Times New Roman" w:cs="Times New Roman"/>
+          <w:kern w:val="0"/>
+          <w14:ligatures w14:val="none"/>
+        </w:rPr>
+        <w:t>85</w:t>
+      </w:r>
+      <w:r>
+        <w:rPr>
+          <w:rFonts w:ascii="Times New Roman" w:eastAsia="Times New Roman" w:hAnsi="Times New Roman" w:cs="Times New Roman"/>
+          <w:kern w:val="0"/>
+          <w14:ligatures w14:val="none"/>
+        </w:rPr>
+        <w:t xml:space="preserve"> + </w:t>
+      </w:r>
+      <w:r>
+        <w:rPr>
+          <w:rFonts w:ascii="Times New Roman" w:eastAsia="Times New Roman" w:hAnsi="Times New Roman" w:cs="Times New Roman"/>
+          <w:kern w:val="0"/>
+          <w14:ligatures w14:val="none"/>
+        </w:rPr>
+        <w:t>0</w:t>
+      </w:r>
+      <w:r>
+        <w:rPr>
+          <w:rFonts w:ascii="Times New Roman" w:eastAsia="Times New Roman" w:hAnsi="Times New Roman" w:cs="Times New Roman"/>
+          <w:kern w:val="0"/>
+          <w14:ligatures w14:val="none"/>
+        </w:rPr>
+        <w:t xml:space="preserve">) = </w:t>
+      </w:r>
+      <w:r>
+        <w:rPr>
+          <w:rFonts w:ascii="Times New Roman" w:eastAsia="Times New Roman" w:hAnsi="Times New Roman" w:cs="Times New Roman"/>
+          <w:kern w:val="0"/>
+          <w14:ligatures w14:val="none"/>
+        </w:rPr>
+        <w:t>1</w:t>
+      </w:r>
+    </w:p>
+    <w:p>
+      <w:pPr>
+        <w:pStyle w:val="ListParagraph"/>
+        <w:numPr>
+          <w:ilvl w:val="0"/>
+          <w:numId w:val="12"/>
+        </w:numPr>
+      </w:pPr>
+      <w:r>
+        <w:rPr>
+          <w:rFonts w:ascii="Times New Roman" w:eastAsia="Times New Roman" w:hAnsi="Times New Roman" w:cs="Times New Roman"/>
+          <w:kern w:val="0"/>
+          <w14:ligatures w14:val="none"/>
+        </w:rPr>
+        <w:t>What is the b</w:t>
+      </w:r>
+      <w:r>
+        <w:rPr>
+          <w:rFonts w:ascii="Times New Roman" w:eastAsia="Times New Roman" w:hAnsi="Times New Roman" w:cs="Times New Roman"/>
+          <w:kern w:val="0"/>
+          <w14:ligatures w14:val="none"/>
+        </w:rPr>
+        <w:t xml:space="preserve">alance between Precision and Recall </w:t>
+      </w:r>
+      <w:r>
+        <w:rPr>
+          <w:rFonts w:ascii="Times New Roman" w:eastAsia="Times New Roman" w:hAnsi="Times New Roman" w:cs="Times New Roman"/>
+          <w:kern w:val="0"/>
+          <w14:ligatures w14:val="none"/>
+        </w:rPr>
+        <w:t>(</w:t>
+      </w:r>
+      <w:r>
+        <w:rPr>
+          <w:rFonts w:ascii="Times New Roman" w:eastAsia="Times New Roman" w:hAnsi="Times New Roman" w:cs="Times New Roman"/>
+          <w:kern w:val="0"/>
+          <w14:ligatures w14:val="none"/>
+        </w:rPr>
+        <w:t>F1-Score</w:t>
+      </w:r>
+      <w:r>
+        <w:rPr>
+          <w:rFonts w:ascii="Times New Roman" w:eastAsia="Times New Roman" w:hAnsi="Times New Roman" w:cs="Times New Roman"/>
+          <w:kern w:val="0"/>
+          <w14:ligatures w14:val="none"/>
+        </w:rPr>
+        <w:t xml:space="preserve">)? = </w:t>
+      </w:r>
+      <w:r>
+        <w:rPr>
+          <w:rFonts w:ascii="Times New Roman" w:eastAsia="Times New Roman" w:hAnsi="Times New Roman" w:cs="Times New Roman"/>
+          <w:kern w:val="0"/>
+          <w14:ligatures w14:val="none"/>
+        </w:rPr>
+        <w:t>F1 = 2 × (Precision × Recall) / (Precision + Recall)</w:t>
+      </w:r>
+      <w:r>
+        <w:rPr>
+          <w:rFonts w:ascii="Times New Roman" w:eastAsia="Times New Roman" w:hAnsi="Times New Roman" w:cs="Times New Roman"/>
+          <w:kern w:val="0"/>
+          <w14:ligatures w14:val="none"/>
+        </w:rPr>
+        <w:t xml:space="preserve"> = 2 * (0.</w:t>
+      </w:r>
+      <w:r>
+        <w:rPr>
+          <w:rFonts w:ascii="Times New Roman" w:eastAsia="Times New Roman" w:hAnsi="Times New Roman" w:cs="Times New Roman"/>
+          <w:kern w:val="0"/>
+          <w14:ligatures w14:val="none"/>
+        </w:rPr>
+        <w:t>63</w:t>
+      </w:r>
+      <w:r>
+        <w:rPr>
+          <w:rFonts w:ascii="Times New Roman" w:eastAsia="Times New Roman" w:hAnsi="Times New Roman" w:cs="Times New Roman"/>
+          <w:kern w:val="0"/>
+          <w14:ligatures w14:val="none"/>
+        </w:rPr>
+        <w:t xml:space="preserve"> * 0</w:t>
+      </w:r>
+      <w:r>
+        <w:rPr>
+          <w:rFonts w:ascii="Times New Roman" w:eastAsia="Times New Roman" w:hAnsi="Times New Roman" w:cs="Times New Roman"/>
+          <w:kern w:val="0"/>
+          <w14:ligatures w14:val="none"/>
+        </w:rPr>
+        <w:t>.1</w:t>
+      </w:r>
+      <w:r>
+        <w:rPr>
+          <w:rFonts w:ascii="Times New Roman" w:eastAsia="Times New Roman" w:hAnsi="Times New Roman" w:cs="Times New Roman"/>
+          <w:kern w:val="0"/>
+          <w14:ligatures w14:val="none"/>
+        </w:rPr>
+        <w:t>)/ (0</w:t>
+      </w:r>
+      <w:r>
+        <w:rPr>
+          <w:rFonts w:ascii="Times New Roman" w:eastAsia="Times New Roman" w:hAnsi="Times New Roman" w:cs="Times New Roman"/>
+          <w:kern w:val="0"/>
+          <w14:ligatures w14:val="none"/>
+        </w:rPr>
+        <w:t>.63</w:t>
+      </w:r>
+      <w:r>
+        <w:rPr>
+          <w:rFonts w:ascii="Times New Roman" w:eastAsia="Times New Roman" w:hAnsi="Times New Roman" w:cs="Times New Roman"/>
+          <w:kern w:val="0"/>
+          <w14:ligatures w14:val="none"/>
+        </w:rPr>
+        <w:t xml:space="preserve"> + </w:t>
+      </w:r>
+      <w:r>
+        <w:rPr>
+          <w:rFonts w:ascii="Times New Roman" w:eastAsia="Times New Roman" w:hAnsi="Times New Roman" w:cs="Times New Roman"/>
+          <w:kern w:val="0"/>
+          <w14:ligatures w14:val="none"/>
+        </w:rPr>
+        <w:t>1</w:t>
+      </w:r>
+      <w:r>
+        <w:rPr>
+          <w:rFonts w:ascii="Times New Roman" w:eastAsia="Times New Roman" w:hAnsi="Times New Roman" w:cs="Times New Roman"/>
+          <w:kern w:val="0"/>
+          <w14:ligatures w14:val="none"/>
+        </w:rPr>
+        <w:t>) = 0.</w:t>
+      </w:r>
+      <w:r>
+        <w:rPr>
+          <w:rFonts w:ascii="Times New Roman" w:eastAsia="Times New Roman" w:hAnsi="Times New Roman" w:cs="Times New Roman"/>
+          <w:kern w:val="0"/>
+          <w14:ligatures w14:val="none"/>
+        </w:rPr>
+        <w:t>78</w:t>
+      </w:r>
+    </w:p>
+    <w:p>
+      <w:pPr>
+        <w:pStyle w:val="ListParagraph"/>
+        <w:numPr>
+          <w:ilvl w:val="0"/>
+          <w:numId w:val="12"/>
+        </w:numPr>
+        <w:rPr>
+          <w:rFonts w:ascii="Times New Roman" w:eastAsia="Times New Roman" w:hAnsi="Times New Roman" w:cs="Times New Roman"/>
+          <w:kern w:val="0"/>
+          <w14:ligatures w14:val="none"/>
+        </w:rPr>
+      </w:pPr>
+      <w:r>
+        <w:t xml:space="preserve">What is the </w:t>
+      </w:r>
+      <w:r>
+        <w:rPr>
+          <w:rFonts w:ascii="Times New Roman" w:eastAsia="Times New Roman" w:hAnsi="Times New Roman" w:cs="Times New Roman"/>
+          <w:kern w:val="0"/>
+          <w14:ligatures w14:val="none"/>
+        </w:rPr>
+        <w:t xml:space="preserve">number of actual samples in each class? </w:t>
+      </w:r>
+      <w:r>
+        <w:rPr>
+          <w:rFonts w:ascii="Times New Roman" w:eastAsia="Times New Roman" w:hAnsi="Times New Roman" w:cs="Times New Roman"/>
+          <w:kern w:val="0"/>
+          <w14:ligatures w14:val="none"/>
+        </w:rPr>
+        <w:t>(</w:t>
+      </w:r>
+      <w:r>
+        <w:t>Support is n</w:t>
+      </w:r>
+      <w:r>
+        <w:t>umber of actual samples in each class.</w:t>
+      </w:r>
+      <w:r>
+        <w:t>)</w:t>
+      </w:r>
+    </w:p>
+    <w:p>
+      <w:pPr>
+        <w:pStyle w:val="ListParagraph"/>
+        <w:ind w:firstLine="720"/>
+      </w:pPr>
+      <w:r>
+        <w:t>85 - did not purchase the course from advertisement.</w:t>
+      </w:r>
+    </w:p>
+    <w:p>
+      <w:pPr>
+        <w:pStyle w:val="ListParagraph"/>
+        <w:ind w:firstLine="720"/>
+      </w:pPr>
+      <w:r>
+        <w:t>49 - did purchase the course from advertisement.</w:t>
+      </w:r>
+    </w:p>
+    <w:p>
+      <w:pPr>
+        <w:pStyle w:val="ListParagraph"/>
+        <w:numPr>
+          <w:ilvl w:val="0"/>
+          <w:numId w:val="12"/>
+        </w:numPr>
+      </w:pPr>
+      <w:r>
+        <w:rPr>
+          <w:b/>
+          <w:bCs/>
+        </w:rPr>
+        <w:t>How many predictions did the model get right (Accuracy)? = (TP + TN) / (TP + TN + FP + FN) = (</w:t>
+      </w:r>
+      <w:r>
+        <w:rPr>
+          <w:b/>
+          <w:bCs/>
+        </w:rPr>
+        <w:t>85</w:t>
+      </w:r>
+      <w:r>
+        <w:rPr>
+          <w:b/>
+          <w:bCs/>
+        </w:rPr>
+        <w:t xml:space="preserve">+ </w:t>
+      </w:r>
+      <w:r>
+        <w:rPr>
+          <w:b/>
+          <w:bCs/>
+        </w:rPr>
+        <w:t>0</w:t>
+      </w:r>
+      <w:r>
+        <w:rPr>
+          <w:b/>
+          <w:bCs/>
+        </w:rPr>
+        <w:t>)/ (</w:t>
+      </w:r>
+      <w:r>
+        <w:rPr>
+          <w:b/>
+          <w:bCs/>
+        </w:rPr>
+        <w:t>85</w:t>
+      </w:r>
+      <w:r>
+        <w:rPr>
+          <w:b/>
+          <w:bCs/>
+        </w:rPr>
+        <w:t xml:space="preserve"> + </w:t>
+      </w:r>
+      <w:r>
+        <w:rPr>
+          <w:b/>
+          <w:bCs/>
+        </w:rPr>
+        <w:t>0</w:t>
+      </w:r>
+      <w:r>
+        <w:rPr>
+          <w:b/>
+          <w:bCs/>
+        </w:rPr>
+        <w:t xml:space="preserve"> + </w:t>
+      </w:r>
+      <w:r>
+        <w:rPr>
+          <w:b/>
+          <w:bCs/>
+        </w:rPr>
+        <w:t>4</w:t>
+      </w:r>
+      <w:r>
+        <w:rPr>
+          <w:b/>
+          <w:bCs/>
+        </w:rPr>
+        <w:t>0</w:t>
+      </w:r>
+      <w:r>
+        <w:rPr>
+          <w:b/>
+          <w:bCs/>
+        </w:rPr>
+        <w:t xml:space="preserve"> </w:t>
+      </w:r>
+      <w:r>
+        <w:rPr>
+          <w:b/>
+          <w:bCs/>
+        </w:rPr>
+        <w:t xml:space="preserve">+ </w:t>
+      </w:r>
+      <w:r>
+        <w:rPr>
+          <w:b/>
+          <w:bCs/>
+        </w:rPr>
+        <w:t>0</w:t>
+      </w:r>
+      <w:r>
+        <w:rPr>
+          <w:b/>
+          <w:bCs/>
+        </w:rPr>
+        <w:t>) = 0.</w:t>
+      </w:r>
+      <w:r>
+        <w:rPr>
+          <w:b/>
+          <w:bCs/>
+        </w:rPr>
+        <w:t>63</w:t>
+      </w:r>
+    </w:p>
+    <w:p>
+      <w:pPr>
+        <w:ind w:left="720" w:hanging="360"/>
+        <w:rPr>
+          <w:b/>
+          <w:bCs/>
+          <w:sz w:val="40"/>
+          <w:szCs w:val="40"/>
+        </w:rPr>
+      </w:pPr>
+      <w:r>
+        <w:rPr>
+          <w:b/>
+          <w:bCs/>
+          <w:sz w:val="40"/>
+          <w:szCs w:val="40"/>
+        </w:rPr>
+        <w:t>Bernoulli Naive Bayes</w:t>
+      </w:r>
+    </w:p>
+    <w:p>
+      <w:pPr>
+        <w:pStyle w:val="ListParagraph"/>
+        <w:numPr>
+          <w:ilvl w:val="0"/>
+          <w:numId w:val="13"/>
+        </w:numPr>
+        <w:rPr>
+          <w:rFonts w:ascii="Times New Roman" w:eastAsia="Times New Roman" w:hAnsi="Times New Roman" w:cs="Times New Roman"/>
+          <w:kern w:val="0"/>
+          <w14:ligatures w14:val="none"/>
+        </w:rPr>
+      </w:pPr>
+      <w:r>
+        <w:rPr>
+          <w:rFonts w:ascii="Times New Roman" w:eastAsia="Times New Roman" w:hAnsi="Times New Roman" w:cs="Times New Roman"/>
+          <w:kern w:val="0"/>
+          <w14:ligatures w14:val="none"/>
+        </w:rPr>
+        <w:t xml:space="preserve">When the model says Yes, how often is it correct? (i.e., Precision) = TP/ (TP + FP) = </w:t>
+      </w:r>
+      <w:r>
+        <w:rPr>
+          <w:rFonts w:ascii="Times New Roman" w:eastAsia="Times New Roman" w:hAnsi="Times New Roman" w:cs="Times New Roman"/>
+          <w:kern w:val="0"/>
+          <w14:ligatures w14:val="none"/>
+        </w:rPr>
+        <w:t>85</w:t>
+      </w:r>
+      <w:r>
+        <w:rPr>
+          <w:rFonts w:ascii="Times New Roman" w:eastAsia="Times New Roman" w:hAnsi="Times New Roman" w:cs="Times New Roman"/>
+          <w:kern w:val="0"/>
+          <w14:ligatures w14:val="none"/>
+        </w:rPr>
+        <w:t>/ (</w:t>
+      </w:r>
+      <w:r>
+        <w:rPr>
+          <w:rFonts w:ascii="Times New Roman" w:eastAsia="Times New Roman" w:hAnsi="Times New Roman" w:cs="Times New Roman"/>
+          <w:kern w:val="0"/>
+          <w14:ligatures w14:val="none"/>
+        </w:rPr>
+        <w:t>85</w:t>
+      </w:r>
+      <w:r>
+        <w:rPr>
+          <w:rFonts w:ascii="Times New Roman" w:eastAsia="Times New Roman" w:hAnsi="Times New Roman" w:cs="Times New Roman"/>
+          <w:kern w:val="0"/>
+          <w14:ligatures w14:val="none"/>
+        </w:rPr>
+        <w:t xml:space="preserve"> + </w:t>
+      </w:r>
+      <w:r>
+        <w:rPr>
+          <w:rFonts w:ascii="Times New Roman" w:eastAsia="Times New Roman" w:hAnsi="Times New Roman" w:cs="Times New Roman"/>
+          <w:kern w:val="0"/>
+          <w14:ligatures w14:val="none"/>
+        </w:rPr>
+        <w:t>49</w:t>
+      </w:r>
+      <w:r>
+        <w:rPr>
+          <w:rFonts w:ascii="Times New Roman" w:eastAsia="Times New Roman" w:hAnsi="Times New Roman" w:cs="Times New Roman"/>
+          <w:kern w:val="0"/>
+          <w14:ligatures w14:val="none"/>
+        </w:rPr>
+        <w:t>) = 0.</w:t>
+      </w:r>
+      <w:r>
+        <w:rPr>
+          <w:rFonts w:ascii="Times New Roman" w:eastAsia="Times New Roman" w:hAnsi="Times New Roman" w:cs="Times New Roman"/>
+          <w:kern w:val="0"/>
+          <w14:ligatures w14:val="none"/>
+        </w:rPr>
+        <w:t>63</w:t>
+      </w:r>
+    </w:p>
+    <w:p>
+      <w:pPr>
+        <w:pStyle w:val="ListParagraph"/>
+        <w:numPr>
+          <w:ilvl w:val="0"/>
+          <w:numId w:val="13"/>
+        </w:numPr>
+        <w:rPr>
+          <w:rFonts w:ascii="Times New Roman" w:eastAsia="Times New Roman" w:hAnsi="Times New Roman" w:cs="Times New Roman"/>
+          <w:kern w:val="0"/>
+          <w14:ligatures w14:val="none"/>
+        </w:rPr>
+      </w:pPr>
+      <w:r>
+        <w:rPr>
+          <w:rFonts w:ascii="Times New Roman" w:eastAsia="Times New Roman" w:hAnsi="Times New Roman" w:cs="Times New Roman"/>
+          <w:kern w:val="0"/>
+          <w14:ligatures w14:val="none"/>
+        </w:rPr>
+        <w:t xml:space="preserve">Out of all actual </w:t>
+      </w:r>
+      <w:r>
+        <w:rPr>
+          <w:rFonts w:ascii="Times New Roman" w:eastAsia="Times New Roman" w:hAnsi="Times New Roman" w:cs="Times New Roman"/>
+          <w:kern w:val="0"/>
+          <w14:ligatures w14:val="none"/>
+        </w:rPr>
+        <w:t>Yes</w:t>
+      </w:r>
+      <w:r>
+        <w:rPr>
+          <w:rFonts w:ascii="Times New Roman" w:eastAsia="Times New Roman" w:hAnsi="Times New Roman" w:cs="Times New Roman"/>
+          <w:kern w:val="0"/>
+          <w14:ligatures w14:val="none"/>
+        </w:rPr>
+        <w:t xml:space="preserve">, how many did the model find? </w:t>
+      </w:r>
+      <w:r>
+        <w:rPr>
+          <w:rFonts w:ascii="Times New Roman" w:eastAsia="Times New Roman" w:hAnsi="Times New Roman" w:cs="Times New Roman"/>
+          <w:kern w:val="0"/>
+          <w14:ligatures w14:val="none"/>
+        </w:rPr>
+        <w:t xml:space="preserve">(i.e., </w:t>
+      </w:r>
+      <w:r>
+        <w:rPr>
+          <w:rFonts w:ascii="Times New Roman" w:eastAsia="Times New Roman" w:hAnsi="Times New Roman" w:cs="Times New Roman"/>
+          <w:kern w:val="0"/>
+          <w14:ligatures w14:val="none"/>
+        </w:rPr>
+        <w:t>Recall</w:t>
+      </w:r>
+      <w:r>
+        <w:rPr>
+          <w:rFonts w:ascii="Times New Roman" w:eastAsia="Times New Roman" w:hAnsi="Times New Roman" w:cs="Times New Roman"/>
+          <w:kern w:val="0"/>
+          <w14:ligatures w14:val="none"/>
+        </w:rPr>
+        <w:t>)</w:t>
+      </w:r>
+      <w:r>
+        <w:rPr>
+          <w:rFonts w:ascii="Times New Roman" w:eastAsia="Times New Roman" w:hAnsi="Times New Roman" w:cs="Times New Roman"/>
+          <w:kern w:val="0"/>
+          <w14:ligatures w14:val="none"/>
+        </w:rPr>
+        <w:t>?</w:t>
+      </w:r>
+      <w:r>
+        <w:rPr>
+          <w:rFonts w:ascii="Times New Roman" w:eastAsia="Times New Roman" w:hAnsi="Times New Roman" w:cs="Times New Roman"/>
+          <w:kern w:val="0"/>
+          <w14:ligatures w14:val="none"/>
+        </w:rPr>
+        <w:t xml:space="preserve"> </w:t>
+      </w:r>
+      <w:r>
+        <w:rPr>
+          <w:rFonts w:ascii="Times New Roman" w:eastAsia="Times New Roman" w:hAnsi="Times New Roman" w:cs="Times New Roman"/>
+          <w:kern w:val="0"/>
+          <w14:ligatures w14:val="none"/>
+        </w:rPr>
+        <w:t>= TP / (TP + FN)</w:t>
+      </w:r>
+      <w:r>
+        <w:rPr>
+          <w:rFonts w:ascii="Times New Roman" w:eastAsia="Times New Roman" w:hAnsi="Times New Roman" w:cs="Times New Roman"/>
+          <w:kern w:val="0"/>
+          <w14:ligatures w14:val="none"/>
+        </w:rPr>
+        <w:t xml:space="preserve"> = 85/ (85 + 0) = 1</w:t>
+      </w:r>
+    </w:p>
+    <w:p>
+      <w:pPr>
+        <w:pStyle w:val="ListParagraph"/>
+        <w:numPr>
+          <w:ilvl w:val="0"/>
+          <w:numId w:val="13"/>
+        </w:numPr>
+      </w:pPr>
+      <w:r>
+        <w:rPr>
+          <w:rFonts w:ascii="Times New Roman" w:eastAsia="Times New Roman" w:hAnsi="Times New Roman" w:cs="Times New Roman"/>
+          <w:kern w:val="0"/>
+          <w14:ligatures w14:val="none"/>
+        </w:rPr>
+        <w:t>What is the b</w:t>
+      </w:r>
+      <w:r>
+        <w:rPr>
+          <w:rFonts w:ascii="Times New Roman" w:eastAsia="Times New Roman" w:hAnsi="Times New Roman" w:cs="Times New Roman"/>
+          <w:kern w:val="0"/>
+          <w14:ligatures w14:val="none"/>
+        </w:rPr>
+        <w:t xml:space="preserve">alance between Precision and Recall </w:t>
+      </w:r>
+      <w:r>
+        <w:rPr>
+          <w:rFonts w:ascii="Times New Roman" w:eastAsia="Times New Roman" w:hAnsi="Times New Roman" w:cs="Times New Roman"/>
+          <w:kern w:val="0"/>
+          <w14:ligatures w14:val="none"/>
+        </w:rPr>
+        <w:t>(</w:t>
+      </w:r>
+      <w:r>
+        <w:rPr>
+          <w:rFonts w:ascii="Times New Roman" w:eastAsia="Times New Roman" w:hAnsi="Times New Roman" w:cs="Times New Roman"/>
+          <w:kern w:val="0"/>
+          <w14:ligatures w14:val="none"/>
+        </w:rPr>
+        <w:t>F1-Score</w:t>
+      </w:r>
+      <w:r>
+        <w:rPr>
+          <w:rFonts w:ascii="Times New Roman" w:eastAsia="Times New Roman" w:hAnsi="Times New Roman" w:cs="Times New Roman"/>
+          <w:kern w:val="0"/>
+          <w14:ligatures w14:val="none"/>
+        </w:rPr>
+        <w:t xml:space="preserve">)? = </w:t>
+      </w:r>
+      <w:r>
+        <w:rPr>
+          <w:rFonts w:ascii="Times New Roman" w:eastAsia="Times New Roman" w:hAnsi="Times New Roman" w:cs="Times New Roman"/>
+          <w:kern w:val="0"/>
+          <w14:ligatures w14:val="none"/>
+        </w:rPr>
+        <w:t>F1 = 2 × (Precision × Recall) / (Precision + Recall)</w:t>
+      </w:r>
+      <w:r>
+        <w:rPr>
+          <w:rFonts w:ascii="Times New Roman" w:eastAsia="Times New Roman" w:hAnsi="Times New Roman" w:cs="Times New Roman"/>
+          <w:kern w:val="0"/>
+          <w14:ligatures w14:val="none"/>
+        </w:rPr>
+        <w:t xml:space="preserve"> = 2 * (0.63 * 0.1)/ (0.63 + 1) = 0.78</w:t>
+      </w:r>
+    </w:p>
+    <w:p>
+      <w:pPr>
+        <w:pStyle w:val="ListParagraph"/>
+        <w:numPr>
+          <w:ilvl w:val="0"/>
+          <w:numId w:val="13"/>
+        </w:numPr>
+        <w:rPr>
+          <w:rFonts w:ascii="Times New Roman" w:eastAsia="Times New Roman" w:hAnsi="Times New Roman" w:cs="Times New Roman"/>
+          <w:kern w:val="0"/>
+          <w14:ligatures w14:val="none"/>
+        </w:rPr>
+      </w:pPr>
+      <w:r>
+        <w:t xml:space="preserve">What is the </w:t>
+      </w:r>
+      <w:r>
+        <w:rPr>
+          <w:rFonts w:ascii="Times New Roman" w:eastAsia="Times New Roman" w:hAnsi="Times New Roman" w:cs="Times New Roman"/>
+          <w:kern w:val="0"/>
+          <w14:ligatures w14:val="none"/>
+        </w:rPr>
+        <w:t xml:space="preserve">number of actual samples in each class? </w:t>
+      </w:r>
+      <w:r>
+        <w:rPr>
+          <w:rFonts w:ascii="Times New Roman" w:eastAsia="Times New Roman" w:hAnsi="Times New Roman" w:cs="Times New Roman"/>
+          <w:kern w:val="0"/>
+          <w14:ligatures w14:val="none"/>
+        </w:rPr>
+        <w:t>(</w:t>
+      </w:r>
+      <w:r>
+        <w:t>Support is n</w:t>
+      </w:r>
+      <w:r>
+        <w:t>umber of actual samples in each class.</w:t>
+      </w:r>
+      <w:r>
+        <w:t>)</w:t>
+      </w:r>
+    </w:p>
+    <w:p>
+      <w:pPr>
+        <w:pStyle w:val="ListParagraph"/>
+        <w:ind w:firstLine="720"/>
+      </w:pPr>
+      <w:r>
+        <w:t>85 - did not purchase the course from advertisement.</w:t>
+      </w:r>
+    </w:p>
+    <w:p>
+      <w:pPr>
+        <w:pStyle w:val="ListParagraph"/>
+        <w:ind w:firstLine="720"/>
+      </w:pPr>
+      <w:r>
+        <w:t>49 - did purchase the course from advertisement.</w:t>
+      </w:r>
+    </w:p>
+    <w:p>
+      <w:pPr>
+        <w:pStyle w:val="ListParagraph"/>
+        <w:numPr>
+          <w:ilvl w:val="0"/>
+          <w:numId w:val="13"/>
+        </w:numPr>
+      </w:pPr>
+      <w:r>
+        <w:rPr>
+          <w:b/>
+          <w:bCs/>
+        </w:rPr>
+        <w:t>How many predictions did the model get right (Accuracy)? = (TP + TN) / (TP + TN + FP + FN) = (</w:t>
+      </w:r>
+      <w:r>
+        <w:rPr>
+          <w:b/>
+          <w:bCs/>
+        </w:rPr>
+        <w:t>85</w:t>
+      </w:r>
+      <w:r>
+        <w:rPr>
+          <w:b/>
+          <w:bCs/>
+        </w:rPr>
+        <w:t xml:space="preserve">+ </w:t>
+      </w:r>
+      <w:r>
+        <w:rPr>
+          <w:b/>
+          <w:bCs/>
+        </w:rPr>
+        <w:t>0</w:t>
+      </w:r>
+      <w:r>
+        <w:rPr>
+          <w:b/>
+          <w:bCs/>
+        </w:rPr>
+        <w:t>)/ (</w:t>
+      </w:r>
+      <w:r>
+        <w:rPr>
+          <w:b/>
+          <w:bCs/>
+        </w:rPr>
+        <w:t>85</w:t>
+      </w:r>
+      <w:r>
+        <w:rPr>
+          <w:b/>
+          <w:bCs/>
+        </w:rPr>
+        <w:t xml:space="preserve"> + </w:t>
+      </w:r>
+      <w:r>
+        <w:rPr>
+          <w:b/>
+          <w:bCs/>
+        </w:rPr>
+        <w:t>0</w:t>
+      </w:r>
+      <w:r>
+        <w:rPr>
+          <w:b/>
+          <w:bCs/>
+        </w:rPr>
+        <w:t xml:space="preserve"> + </w:t>
+      </w:r>
+      <w:r>
+        <w:rPr>
+          <w:b/>
+          <w:bCs/>
+        </w:rPr>
+        <w:t xml:space="preserve">40 </w:t>
+      </w:r>
+      <w:r>
+        <w:rPr>
+          <w:b/>
+          <w:bCs/>
+        </w:rPr>
+        <w:t xml:space="preserve">+ </w:t>
+      </w:r>
+      <w:r>
+        <w:rPr>
+          <w:b/>
+          <w:bCs/>
+        </w:rPr>
+        <w:t>0</w:t>
+      </w:r>
+      <w:r>
+        <w:rPr>
+          <w:b/>
+          <w:bCs/>
+        </w:rPr>
+        <w:t>) = 0.</w:t>
+      </w:r>
+      <w:r>
+        <w:rPr>
+          <w:b/>
+          <w:bCs/>
+        </w:rPr>
+        <w:t>63</w:t>
+      </w:r>
+    </w:p>
+    <w:p>
+      <w:pPr>
+        <w:ind w:left="720" w:hanging="360"/>
+      </w:pPr>
+    </w:p>
+    <w:p>
+      <w:pPr>
+        <w:ind w:left="720" w:hanging="360"/>
+        <w:rPr>
+          <w:b/>
+          <w:bCs/>
+          <w:sz w:val="40"/>
+          <w:szCs w:val="40"/>
+        </w:rPr>
+      </w:pPr>
+      <w:r>
+        <w:rPr>
+          <w:b/>
+          <w:bCs/>
+          <w:sz w:val="40"/>
+          <w:szCs w:val="40"/>
+        </w:rPr>
+        <w:t>Categorical Naive Bayes</w:t>
+      </w:r>
+    </w:p>
+    <w:p>
+      <w:pPr>
+        <w:pStyle w:val="ListParagraph"/>
+        <w:numPr>
+          <w:ilvl w:val="0"/>
+          <w:numId w:val="14"/>
+        </w:numPr>
+        <w:rPr>
+          <w:rFonts w:ascii="Times New Roman" w:eastAsia="Times New Roman" w:hAnsi="Times New Roman" w:cs="Times New Roman"/>
+          <w:kern w:val="0"/>
+          <w14:ligatures w14:val="none"/>
+        </w:rPr>
+      </w:pPr>
+      <w:r>
+        <w:rPr>
+          <w:rFonts w:ascii="Times New Roman" w:eastAsia="Times New Roman" w:hAnsi="Times New Roman" w:cs="Times New Roman"/>
+          <w:kern w:val="0"/>
+          <w14:ligatures w14:val="none"/>
+        </w:rPr>
+        <w:t xml:space="preserve">When the model says Yes, how often is it correct? (i.e., Precision) = TP/ (TP + FP) = </w:t>
+      </w:r>
+      <w:r>
+        <w:rPr>
+          <w:rFonts w:ascii="Times New Roman" w:eastAsia="Times New Roman" w:hAnsi="Times New Roman" w:cs="Times New Roman"/>
+          <w:kern w:val="0"/>
+          <w14:ligatures w14:val="none"/>
+        </w:rPr>
+        <w:t>8</w:t>
+      </w:r>
+      <w:r>
+        <w:rPr>
+          <w:rFonts w:ascii="Times New Roman" w:eastAsia="Times New Roman" w:hAnsi="Times New Roman" w:cs="Times New Roman"/>
+          <w:kern w:val="0"/>
+          <w14:ligatures w14:val="none"/>
+        </w:rPr>
+        <w:t>2</w:t>
+      </w:r>
+      <w:r>
+        <w:rPr>
+          <w:rFonts w:ascii="Times New Roman" w:eastAsia="Times New Roman" w:hAnsi="Times New Roman" w:cs="Times New Roman"/>
+          <w:kern w:val="0"/>
+          <w14:ligatures w14:val="none"/>
+        </w:rPr>
+        <w:t>/ (</w:t>
+      </w:r>
+      <w:r>
+        <w:rPr>
+          <w:rFonts w:ascii="Times New Roman" w:eastAsia="Times New Roman" w:hAnsi="Times New Roman" w:cs="Times New Roman"/>
+          <w:kern w:val="0"/>
+          <w14:ligatures w14:val="none"/>
+        </w:rPr>
+        <w:t>8</w:t>
+      </w:r>
+      <w:r>
+        <w:rPr>
+          <w:rFonts w:ascii="Times New Roman" w:eastAsia="Times New Roman" w:hAnsi="Times New Roman" w:cs="Times New Roman"/>
+          <w:kern w:val="0"/>
+          <w14:ligatures w14:val="none"/>
+        </w:rPr>
+        <w:t>2</w:t>
+      </w:r>
+      <w:r>
+        <w:rPr>
+          <w:rFonts w:ascii="Times New Roman" w:eastAsia="Times New Roman" w:hAnsi="Times New Roman" w:cs="Times New Roman"/>
+          <w:kern w:val="0"/>
+          <w14:ligatures w14:val="none"/>
+        </w:rPr>
+        <w:t xml:space="preserve"> + </w:t>
+      </w:r>
+      <w:r>
+        <w:rPr>
+          <w:rFonts w:ascii="Times New Roman" w:eastAsia="Times New Roman" w:hAnsi="Times New Roman" w:cs="Times New Roman"/>
+          <w:kern w:val="0"/>
+          <w14:ligatures w14:val="none"/>
+        </w:rPr>
+        <w:t>18</w:t>
+      </w:r>
+      <w:r>
+        <w:rPr>
+          <w:rFonts w:ascii="Times New Roman" w:eastAsia="Times New Roman" w:hAnsi="Times New Roman" w:cs="Times New Roman"/>
+          <w:kern w:val="0"/>
+          <w14:ligatures w14:val="none"/>
+        </w:rPr>
+        <w:t>) = 0.</w:t>
+      </w:r>
+      <w:r>
+        <w:rPr>
+          <w:rFonts w:ascii="Times New Roman" w:eastAsia="Times New Roman" w:hAnsi="Times New Roman" w:cs="Times New Roman"/>
+          <w:kern w:val="0"/>
+          <w14:ligatures w14:val="none"/>
+        </w:rPr>
+        <w:t>82</w:t>
+      </w:r>
+    </w:p>
+    <w:p>
+      <w:pPr>
+        <w:pStyle w:val="ListParagraph"/>
+        <w:numPr>
+          <w:ilvl w:val="0"/>
+          <w:numId w:val="14"/>
+        </w:numPr>
+        <w:rPr>
+          <w:rFonts w:ascii="Times New Roman" w:eastAsia="Times New Roman" w:hAnsi="Times New Roman" w:cs="Times New Roman"/>
+          <w:kern w:val="0"/>
+          <w14:ligatures w14:val="none"/>
+        </w:rPr>
+      </w:pPr>
+      <w:r>
+        <w:rPr>
+          <w:rFonts w:ascii="Times New Roman" w:eastAsia="Times New Roman" w:hAnsi="Times New Roman" w:cs="Times New Roman"/>
+          <w:kern w:val="0"/>
+          <w14:ligatures w14:val="none"/>
+        </w:rPr>
+        <w:t xml:space="preserve">Out of all actual </w:t>
+      </w:r>
+      <w:r>
+        <w:rPr>
+          <w:rFonts w:ascii="Times New Roman" w:eastAsia="Times New Roman" w:hAnsi="Times New Roman" w:cs="Times New Roman"/>
+          <w:kern w:val="0"/>
+          <w14:ligatures w14:val="none"/>
+        </w:rPr>
+        <w:t>Yes</w:t>
+      </w:r>
+      <w:r>
+        <w:rPr>
+          <w:rFonts w:ascii="Times New Roman" w:eastAsia="Times New Roman" w:hAnsi="Times New Roman" w:cs="Times New Roman"/>
+          <w:kern w:val="0"/>
+          <w14:ligatures w14:val="none"/>
+        </w:rPr>
+        <w:t xml:space="preserve">, how many did the model find? </w:t>
+      </w:r>
+      <w:r>
+        <w:rPr>
+          <w:rFonts w:ascii="Times New Roman" w:eastAsia="Times New Roman" w:hAnsi="Times New Roman" w:cs="Times New Roman"/>
+          <w:kern w:val="0"/>
+          <w14:ligatures w14:val="none"/>
+        </w:rPr>
+        <w:t xml:space="preserve">(i.e., </w:t>
+      </w:r>
+      <w:r>
+        <w:rPr>
+          <w:rFonts w:ascii="Times New Roman" w:eastAsia="Times New Roman" w:hAnsi="Times New Roman" w:cs="Times New Roman"/>
+          <w:kern w:val="0"/>
+          <w14:ligatures w14:val="none"/>
+        </w:rPr>
+        <w:t>Recall</w:t>
+      </w:r>
+      <w:r>
+        <w:rPr>
+          <w:rFonts w:ascii="Times New Roman" w:eastAsia="Times New Roman" w:hAnsi="Times New Roman" w:cs="Times New Roman"/>
+          <w:kern w:val="0"/>
+          <w14:ligatures w14:val="none"/>
+        </w:rPr>
+        <w:t>)</w:t>
+      </w:r>
+      <w:r>
+        <w:rPr>
+          <w:rFonts w:ascii="Times New Roman" w:eastAsia="Times New Roman" w:hAnsi="Times New Roman" w:cs="Times New Roman"/>
+          <w:kern w:val="0"/>
+          <w14:ligatures w14:val="none"/>
+        </w:rPr>
+        <w:t>?</w:t>
+      </w:r>
+      <w:r>
+        <w:rPr>
+          <w:rFonts w:ascii="Times New Roman" w:eastAsia="Times New Roman" w:hAnsi="Times New Roman" w:cs="Times New Roman"/>
+          <w:kern w:val="0"/>
+          <w14:ligatures w14:val="none"/>
+        </w:rPr>
+        <w:t xml:space="preserve"> </w:t>
+      </w:r>
+      <w:r>
+        <w:rPr>
+          <w:rFonts w:ascii="Times New Roman" w:eastAsia="Times New Roman" w:hAnsi="Times New Roman" w:cs="Times New Roman"/>
+          <w:kern w:val="0"/>
+          <w14:ligatures w14:val="none"/>
+        </w:rPr>
+        <w:t>= TP / (TP + FN)</w:t>
+      </w:r>
+      <w:r>
+        <w:rPr>
+          <w:rFonts w:ascii="Times New Roman" w:eastAsia="Times New Roman" w:hAnsi="Times New Roman" w:cs="Times New Roman"/>
+          <w:kern w:val="0"/>
+          <w14:ligatures w14:val="none"/>
+        </w:rPr>
+        <w:t xml:space="preserve"> = 8</w:t>
+      </w:r>
+      <w:r>
+        <w:rPr>
+          <w:rFonts w:ascii="Times New Roman" w:eastAsia="Times New Roman" w:hAnsi="Times New Roman" w:cs="Times New Roman"/>
+          <w:kern w:val="0"/>
+          <w14:ligatures w14:val="none"/>
+        </w:rPr>
+        <w:t>2</w:t>
+      </w:r>
+      <w:r>
+        <w:rPr>
+          <w:rFonts w:ascii="Times New Roman" w:eastAsia="Times New Roman" w:hAnsi="Times New Roman" w:cs="Times New Roman"/>
+          <w:kern w:val="0"/>
+          <w14:ligatures w14:val="none"/>
+        </w:rPr>
+        <w:t>/ (8</w:t>
+      </w:r>
+      <w:r>
+        <w:rPr>
+          <w:rFonts w:ascii="Times New Roman" w:eastAsia="Times New Roman" w:hAnsi="Times New Roman" w:cs="Times New Roman"/>
+          <w:kern w:val="0"/>
+          <w14:ligatures w14:val="none"/>
+        </w:rPr>
+        <w:t>2</w:t>
+      </w:r>
+      <w:r>
+        <w:rPr>
+          <w:rFonts w:ascii="Times New Roman" w:eastAsia="Times New Roman" w:hAnsi="Times New Roman" w:cs="Times New Roman"/>
+          <w:kern w:val="0"/>
+          <w14:ligatures w14:val="none"/>
+        </w:rPr>
+        <w:t xml:space="preserve"> + </w:t>
+      </w:r>
+      <w:r>
+        <w:rPr>
+          <w:rFonts w:ascii="Times New Roman" w:eastAsia="Times New Roman" w:hAnsi="Times New Roman" w:cs="Times New Roman"/>
+          <w:kern w:val="0"/>
+          <w14:ligatures w14:val="none"/>
+        </w:rPr>
+        <w:t>3</w:t>
+      </w:r>
+      <w:r>
+        <w:rPr>
+          <w:rFonts w:ascii="Times New Roman" w:eastAsia="Times New Roman" w:hAnsi="Times New Roman" w:cs="Times New Roman"/>
+          <w:kern w:val="0"/>
+          <w14:ligatures w14:val="none"/>
+        </w:rPr>
+        <w:t>) =</w:t>
+      </w:r>
+      <w:r>
+        <w:rPr>
+          <w:rFonts w:ascii="Times New Roman" w:eastAsia="Times New Roman" w:hAnsi="Times New Roman" w:cs="Times New Roman"/>
+          <w:kern w:val="0"/>
+          <w14:ligatures w14:val="none"/>
+        </w:rPr>
+        <w:t xml:space="preserve"> 0.96</w:t>
+      </w:r>
+    </w:p>
+    <w:p>
+      <w:pPr>
+        <w:pStyle w:val="ListParagraph"/>
+        <w:numPr>
+          <w:ilvl w:val="0"/>
+          <w:numId w:val="14"/>
+        </w:numPr>
+      </w:pPr>
+      <w:r>
+        <w:rPr>
+          <w:rFonts w:ascii="Times New Roman" w:eastAsia="Times New Roman" w:hAnsi="Times New Roman" w:cs="Times New Roman"/>
+          <w:kern w:val="0"/>
+          <w14:ligatures w14:val="none"/>
+        </w:rPr>
+        <w:t>What is the b</w:t>
+      </w:r>
+      <w:r>
+        <w:rPr>
+          <w:rFonts w:ascii="Times New Roman" w:eastAsia="Times New Roman" w:hAnsi="Times New Roman" w:cs="Times New Roman"/>
+          <w:kern w:val="0"/>
+          <w14:ligatures w14:val="none"/>
+        </w:rPr>
+        <w:t xml:space="preserve">alance between Precision and Recall </w:t>
+      </w:r>
+      <w:r>
+        <w:rPr>
+          <w:rFonts w:ascii="Times New Roman" w:eastAsia="Times New Roman" w:hAnsi="Times New Roman" w:cs="Times New Roman"/>
+          <w:kern w:val="0"/>
+          <w14:ligatures w14:val="none"/>
+        </w:rPr>
+        <w:t>(</w:t>
+      </w:r>
+      <w:r>
+        <w:rPr>
+          <w:rFonts w:ascii="Times New Roman" w:eastAsia="Times New Roman" w:hAnsi="Times New Roman" w:cs="Times New Roman"/>
+          <w:kern w:val="0"/>
+          <w14:ligatures w14:val="none"/>
+        </w:rPr>
+        <w:t>F1-Score</w:t>
+      </w:r>
+      <w:r>
+        <w:rPr>
+          <w:rFonts w:ascii="Times New Roman" w:eastAsia="Times New Roman" w:hAnsi="Times New Roman" w:cs="Times New Roman"/>
+          <w:kern w:val="0"/>
+          <w14:ligatures w14:val="none"/>
+        </w:rPr>
+        <w:t xml:space="preserve">)? = </w:t>
+      </w:r>
+      <w:r>
+        <w:rPr>
+          <w:rFonts w:ascii="Times New Roman" w:eastAsia="Times New Roman" w:hAnsi="Times New Roman" w:cs="Times New Roman"/>
+          <w:kern w:val="0"/>
+          <w14:ligatures w14:val="none"/>
+        </w:rPr>
+        <w:t>F1 = 2 × (Precision × Recall) / (Precision + Recall)</w:t>
+      </w:r>
+      <w:r>
+        <w:rPr>
+          <w:rFonts w:ascii="Times New Roman" w:eastAsia="Times New Roman" w:hAnsi="Times New Roman" w:cs="Times New Roman"/>
+          <w:kern w:val="0"/>
+          <w14:ligatures w14:val="none"/>
+        </w:rPr>
+        <w:t xml:space="preserve"> = 2 * (0.</w:t>
+      </w:r>
+      <w:r>
+        <w:rPr>
+          <w:rFonts w:ascii="Times New Roman" w:eastAsia="Times New Roman" w:hAnsi="Times New Roman" w:cs="Times New Roman"/>
+          <w:kern w:val="0"/>
+          <w14:ligatures w14:val="none"/>
+        </w:rPr>
+        <w:t>82</w:t>
+      </w:r>
+      <w:r>
+        <w:rPr>
+          <w:rFonts w:ascii="Times New Roman" w:eastAsia="Times New Roman" w:hAnsi="Times New Roman" w:cs="Times New Roman"/>
+          <w:kern w:val="0"/>
+          <w14:ligatures w14:val="none"/>
+        </w:rPr>
+        <w:t xml:space="preserve"> * 0.</w:t>
+      </w:r>
+      <w:r>
+        <w:rPr>
+          <w:rFonts w:ascii="Times New Roman" w:eastAsia="Times New Roman" w:hAnsi="Times New Roman" w:cs="Times New Roman"/>
+          <w:kern w:val="0"/>
+          <w14:ligatures w14:val="none"/>
+        </w:rPr>
+        <w:t>96</w:t>
+      </w:r>
+      <w:r>
+        <w:rPr>
+          <w:rFonts w:ascii="Times New Roman" w:eastAsia="Times New Roman" w:hAnsi="Times New Roman" w:cs="Times New Roman"/>
+          <w:kern w:val="0"/>
+          <w14:ligatures w14:val="none"/>
+        </w:rPr>
+        <w:t>)/ (0.</w:t>
+      </w:r>
+      <w:r>
+        <w:rPr>
+          <w:rFonts w:ascii="Times New Roman" w:eastAsia="Times New Roman" w:hAnsi="Times New Roman" w:cs="Times New Roman"/>
+          <w:kern w:val="0"/>
+          <w14:ligatures w14:val="none"/>
+        </w:rPr>
+        <w:t>82</w:t>
+      </w:r>
+      <w:r>
+        <w:rPr>
+          <w:rFonts w:ascii="Times New Roman" w:eastAsia="Times New Roman" w:hAnsi="Times New Roman" w:cs="Times New Roman"/>
+          <w:kern w:val="0"/>
+          <w14:ligatures w14:val="none"/>
+        </w:rPr>
+        <w:t xml:space="preserve"> + </w:t>
+      </w:r>
+      <w:r>
+        <w:rPr>
+          <w:rFonts w:ascii="Times New Roman" w:eastAsia="Times New Roman" w:hAnsi="Times New Roman" w:cs="Times New Roman"/>
+          <w:kern w:val="0"/>
+          <w14:ligatures w14:val="none"/>
+        </w:rPr>
+        <w:t>0.96</w:t>
+      </w:r>
+      <w:r>
+        <w:rPr>
+          <w:rFonts w:ascii="Times New Roman" w:eastAsia="Times New Roman" w:hAnsi="Times New Roman" w:cs="Times New Roman"/>
+          <w:kern w:val="0"/>
+          <w14:ligatures w14:val="none"/>
+        </w:rPr>
+        <w:t>) = 0.</w:t>
+      </w:r>
+      <w:r>
+        <w:rPr>
+          <w:rFonts w:ascii="Times New Roman" w:eastAsia="Times New Roman" w:hAnsi="Times New Roman" w:cs="Times New Roman"/>
+          <w:kern w:val="0"/>
+          <w14:ligatures w14:val="none"/>
+        </w:rPr>
+        <w:t>89</w:t>
+      </w:r>
+    </w:p>
+    <w:p>
+      <w:pPr>
+        <w:pStyle w:val="ListParagraph"/>
+        <w:numPr>
+          <w:ilvl w:val="0"/>
+          <w:numId w:val="14"/>
+        </w:numPr>
+        <w:rPr>
+          <w:rFonts w:ascii="Times New Roman" w:eastAsia="Times New Roman" w:hAnsi="Times New Roman" w:cs="Times New Roman"/>
+          <w:kern w:val="0"/>
+          <w14:ligatures w14:val="none"/>
+        </w:rPr>
+      </w:pPr>
+      <w:r>
+        <w:t xml:space="preserve">What is the </w:t>
+      </w:r>
+      <w:r>
+        <w:rPr>
+          <w:rFonts w:ascii="Times New Roman" w:eastAsia="Times New Roman" w:hAnsi="Times New Roman" w:cs="Times New Roman"/>
+          <w:kern w:val="0"/>
+          <w14:ligatures w14:val="none"/>
+        </w:rPr>
+        <w:t xml:space="preserve">number of actual samples in each class? </w:t>
+      </w:r>
+      <w:r>
+        <w:rPr>
+          <w:rFonts w:ascii="Times New Roman" w:eastAsia="Times New Roman" w:hAnsi="Times New Roman" w:cs="Times New Roman"/>
+          <w:kern w:val="0"/>
+          <w14:ligatures w14:val="none"/>
+        </w:rPr>
+        <w:t>(</w:t>
+      </w:r>
+      <w:r>
+        <w:t>Support is n</w:t>
+      </w:r>
+      <w:r>
+        <w:t>umber of actual samples in each class.</w:t>
+      </w:r>
+      <w:r>
+        <w:t>)</w:t>
+      </w:r>
+    </w:p>
+    <w:p>
+      <w:pPr>
+        <w:pStyle w:val="ListParagraph"/>
+        <w:ind w:firstLine="720"/>
+      </w:pPr>
+      <w:r>
+        <w:t>85 - did not purchase the course from advertisement.</w:t>
+      </w:r>
+    </w:p>
+    <w:p>
+      <w:pPr>
+        <w:pStyle w:val="ListParagraph"/>
+        <w:ind w:firstLine="720"/>
+      </w:pPr>
+      <w:r>
+        <w:t>49 - did purchase the course from advertisement.</w:t>
+      </w:r>
+    </w:p>
+    <w:p>
+      <w:pPr>
+        <w:pStyle w:val="ListParagraph"/>
+        <w:numPr>
+          <w:ilvl w:val="0"/>
+          <w:numId w:val="14"/>
+        </w:numPr>
+      </w:pPr>
+      <w:r>
+        <w:rPr>
+          <w:b/>
+          <w:bCs/>
+        </w:rPr>
+        <w:t>How many predictions did the model get right (Accuracy)? = (TP + TN) / (TP + TN + FP + FN) = (</w:t>
+      </w:r>
+      <w:r>
+        <w:rPr>
+          <w:b/>
+          <w:bCs/>
+        </w:rPr>
+        <w:t>8</w:t>
+      </w:r>
+      <w:r>
+        <w:rPr>
+          <w:b/>
+          <w:bCs/>
+        </w:rPr>
+        <w:t>2</w:t>
+      </w:r>
+      <w:r>
+        <w:rPr>
+          <w:b/>
+          <w:bCs/>
+        </w:rPr>
+        <w:t xml:space="preserve">+ </w:t>
+      </w:r>
+      <w:r>
+        <w:rPr>
+          <w:b/>
+          <w:bCs/>
+        </w:rPr>
+        <w:t>18</w:t>
+      </w:r>
+      <w:r>
+        <w:rPr>
+          <w:b/>
+          <w:bCs/>
+        </w:rPr>
+        <w:t>)/ (</w:t>
+      </w:r>
+      <w:r>
+        <w:rPr>
+          <w:b/>
+          <w:bCs/>
+        </w:rPr>
+        <w:t>8</w:t>
+      </w:r>
+      <w:r>
+        <w:rPr>
+          <w:b/>
+          <w:bCs/>
+        </w:rPr>
+        <w:t>2</w:t>
+      </w:r>
+      <w:r>
+        <w:rPr>
+          <w:b/>
+          <w:bCs/>
+        </w:rPr>
+        <w:t xml:space="preserve"> + </w:t>
+      </w:r>
+      <w:r>
+        <w:rPr>
+          <w:b/>
+          <w:bCs/>
+        </w:rPr>
+        <w:t>31</w:t>
+      </w:r>
+      <w:r>
+        <w:rPr>
+          <w:b/>
+          <w:bCs/>
+        </w:rPr>
+        <w:t xml:space="preserve"> + </w:t>
+      </w:r>
+      <w:r>
+        <w:rPr>
+          <w:b/>
+          <w:bCs/>
+        </w:rPr>
+        <w:t>18</w:t>
+      </w:r>
+      <w:r>
+        <w:rPr>
+          <w:b/>
+          <w:bCs/>
+        </w:rPr>
+        <w:t xml:space="preserve"> </w:t>
+      </w:r>
+      <w:r>
+        <w:rPr>
+          <w:b/>
+          <w:bCs/>
+        </w:rPr>
+        <w:t xml:space="preserve">+ </w:t>
+      </w:r>
+      <w:r>
+        <w:rPr>
+          <w:b/>
+          <w:bCs/>
+        </w:rPr>
+        <w:t>3</w:t>
+      </w:r>
+      <w:r>
+        <w:rPr>
+          <w:b/>
+          <w:bCs/>
+        </w:rPr>
+        <w:t>) = 0.</w:t>
+      </w:r>
+      <w:r>
+        <w:rPr>
+          <w:b/>
+          <w:bCs/>
+        </w:rPr>
+        <w:t>84</w:t>
+      </w:r>
+    </w:p>
+    <w:p>
+      <w:pPr>
+        <w:ind w:left="720" w:hanging="360"/>
+      </w:pPr>
+    </w:p>
+    <w:p>
+      <w:pPr>
+        <w:ind w:left="720" w:hanging="360"/>
+        <w:rPr>
+          <w:b/>
+          <w:bCs/>
+          <w:sz w:val="40"/>
+          <w:szCs w:val="40"/>
+        </w:rPr>
+      </w:pPr>
+      <w:r>
+        <w:rPr>
+          <w:b/>
+          <w:bCs/>
+          <w:sz w:val="40"/>
+          <w:szCs w:val="40"/>
+        </w:rPr>
+        <w:t>Complement Naive Bayes</w:t>
+      </w:r>
+    </w:p>
+    <w:p>
+      <w:pPr>
+        <w:pStyle w:val="ListParagraph"/>
+        <w:numPr>
+          <w:ilvl w:val="0"/>
+          <w:numId w:val="15"/>
+        </w:numPr>
+        <w:rPr>
+          <w:rFonts w:ascii="Times New Roman" w:eastAsia="Times New Roman" w:hAnsi="Times New Roman" w:cs="Times New Roman"/>
+          <w:kern w:val="0"/>
+          <w14:ligatures w14:val="none"/>
+        </w:rPr>
+      </w:pPr>
+      <w:r>
+        <w:rPr>
+          <w:rFonts w:ascii="Times New Roman" w:eastAsia="Times New Roman" w:hAnsi="Times New Roman" w:cs="Times New Roman"/>
+          <w:kern w:val="0"/>
+          <w14:ligatures w14:val="none"/>
+        </w:rPr>
+        <w:t xml:space="preserve">When the model says Yes, how often is it correct? (i.e., Precision) = TP/ (TP + FP) = </w:t>
+      </w:r>
+      <w:r>
+        <w:rPr>
+          <w:rFonts w:ascii="Times New Roman" w:eastAsia="Times New Roman" w:hAnsi="Times New Roman" w:cs="Times New Roman"/>
+          <w:kern w:val="0"/>
+          <w14:ligatures w14:val="none"/>
+        </w:rPr>
+        <w:t>40</w:t>
+      </w:r>
+      <w:r>
+        <w:rPr>
+          <w:rFonts w:ascii="Times New Roman" w:eastAsia="Times New Roman" w:hAnsi="Times New Roman" w:cs="Times New Roman"/>
+          <w:kern w:val="0"/>
+          <w14:ligatures w14:val="none"/>
+        </w:rPr>
+        <w:t>/ (</w:t>
+      </w:r>
+      <w:r>
+        <w:rPr>
+          <w:rFonts w:ascii="Times New Roman" w:eastAsia="Times New Roman" w:hAnsi="Times New Roman" w:cs="Times New Roman"/>
+          <w:kern w:val="0"/>
+          <w14:ligatures w14:val="none"/>
+        </w:rPr>
+        <w:t>40</w:t>
+      </w:r>
+      <w:r>
+        <w:rPr>
+          <w:rFonts w:ascii="Times New Roman" w:eastAsia="Times New Roman" w:hAnsi="Times New Roman" w:cs="Times New Roman"/>
+          <w:kern w:val="0"/>
+          <w14:ligatures w14:val="none"/>
+        </w:rPr>
+        <w:t xml:space="preserve"> + </w:t>
+      </w:r>
+      <w:r>
+        <w:rPr>
+          <w:rFonts w:ascii="Times New Roman" w:eastAsia="Times New Roman" w:hAnsi="Times New Roman" w:cs="Times New Roman"/>
+          <w:kern w:val="0"/>
+          <w14:ligatures w14:val="none"/>
+        </w:rPr>
+        <w:t>20</w:t>
+      </w:r>
+      <w:r>
+        <w:rPr>
+          <w:rFonts w:ascii="Times New Roman" w:eastAsia="Times New Roman" w:hAnsi="Times New Roman" w:cs="Times New Roman"/>
+          <w:kern w:val="0"/>
+          <w14:ligatures w14:val="none"/>
+        </w:rPr>
+        <w:t>) = 0.</w:t>
+      </w:r>
+      <w:r>
+        <w:rPr>
+          <w:rFonts w:ascii="Times New Roman" w:eastAsia="Times New Roman" w:hAnsi="Times New Roman" w:cs="Times New Roman"/>
+          <w:kern w:val="0"/>
+          <w14:ligatures w14:val="none"/>
+        </w:rPr>
+        <w:t>67</w:t>
+      </w:r>
+    </w:p>
+    <w:p>
+      <w:pPr>
+        <w:pStyle w:val="ListParagraph"/>
+        <w:numPr>
+          <w:ilvl w:val="0"/>
+          <w:numId w:val="15"/>
+        </w:numPr>
+        <w:rPr>
+          <w:rFonts w:ascii="Times New Roman" w:eastAsia="Times New Roman" w:hAnsi="Times New Roman" w:cs="Times New Roman"/>
+          <w:kern w:val="0"/>
+          <w14:ligatures w14:val="none"/>
+        </w:rPr>
+      </w:pPr>
+      <w:r>
+        <w:rPr>
+          <w:rFonts w:ascii="Times New Roman" w:eastAsia="Times New Roman" w:hAnsi="Times New Roman" w:cs="Times New Roman"/>
+          <w:kern w:val="0"/>
+          <w14:ligatures w14:val="none"/>
+        </w:rPr>
+        <w:t xml:space="preserve">Out of all actual </w:t>
+      </w:r>
+      <w:r>
+        <w:rPr>
+          <w:rFonts w:ascii="Times New Roman" w:eastAsia="Times New Roman" w:hAnsi="Times New Roman" w:cs="Times New Roman"/>
+          <w:kern w:val="0"/>
+          <w14:ligatures w14:val="none"/>
+        </w:rPr>
+        <w:t>Yes</w:t>
+      </w:r>
+      <w:r>
+        <w:rPr>
+          <w:rFonts w:ascii="Times New Roman" w:eastAsia="Times New Roman" w:hAnsi="Times New Roman" w:cs="Times New Roman"/>
+          <w:kern w:val="0"/>
+          <w14:ligatures w14:val="none"/>
+        </w:rPr>
+        <w:t xml:space="preserve">, how many did the model find? </w:t>
+      </w:r>
+      <w:r>
+        <w:rPr>
+          <w:rFonts w:ascii="Times New Roman" w:eastAsia="Times New Roman" w:hAnsi="Times New Roman" w:cs="Times New Roman"/>
+          <w:kern w:val="0"/>
+          <w14:ligatures w14:val="none"/>
+        </w:rPr>
+        <w:t xml:space="preserve">(i.e., </w:t>
+      </w:r>
+      <w:r>
+        <w:rPr>
+          <w:rFonts w:ascii="Times New Roman" w:eastAsia="Times New Roman" w:hAnsi="Times New Roman" w:cs="Times New Roman"/>
+          <w:kern w:val="0"/>
+          <w14:ligatures w14:val="none"/>
+        </w:rPr>
+        <w:t>Recall</w:t>
+      </w:r>
+      <w:r>
+        <w:rPr>
+          <w:rFonts w:ascii="Times New Roman" w:eastAsia="Times New Roman" w:hAnsi="Times New Roman" w:cs="Times New Roman"/>
+          <w:kern w:val="0"/>
+          <w14:ligatures w14:val="none"/>
+        </w:rPr>
+        <w:t>)</w:t>
+      </w:r>
+      <w:r>
+        <w:rPr>
+          <w:rFonts w:ascii="Times New Roman" w:eastAsia="Times New Roman" w:hAnsi="Times New Roman" w:cs="Times New Roman"/>
+          <w:kern w:val="0"/>
+          <w14:ligatures w14:val="none"/>
+        </w:rPr>
+        <w:t>?</w:t>
+      </w:r>
+      <w:r>
+        <w:rPr>
+          <w:rFonts w:ascii="Times New Roman" w:eastAsia="Times New Roman" w:hAnsi="Times New Roman" w:cs="Times New Roman"/>
+          <w:kern w:val="0"/>
+          <w14:ligatures w14:val="none"/>
+        </w:rPr>
+        <w:t xml:space="preserve"> </w:t>
+      </w:r>
+      <w:r>
+        <w:rPr>
+          <w:rFonts w:ascii="Times New Roman" w:eastAsia="Times New Roman" w:hAnsi="Times New Roman" w:cs="Times New Roman"/>
+          <w:kern w:val="0"/>
+          <w14:ligatures w14:val="none"/>
+        </w:rPr>
+        <w:t>= TP / (TP + FN)</w:t>
+      </w:r>
+      <w:r>
+        <w:rPr>
+          <w:rFonts w:ascii="Times New Roman" w:eastAsia="Times New Roman" w:hAnsi="Times New Roman" w:cs="Times New Roman"/>
+          <w:kern w:val="0"/>
+          <w14:ligatures w14:val="none"/>
+        </w:rPr>
+        <w:t xml:space="preserve"> = </w:t>
+      </w:r>
+      <w:r>
+        <w:rPr>
+          <w:rFonts w:ascii="Times New Roman" w:eastAsia="Times New Roman" w:hAnsi="Times New Roman" w:cs="Times New Roman"/>
+          <w:kern w:val="0"/>
+          <w14:ligatures w14:val="none"/>
+        </w:rPr>
+        <w:t>40</w:t>
+      </w:r>
+      <w:r>
+        <w:rPr>
+          <w:rFonts w:ascii="Times New Roman" w:eastAsia="Times New Roman" w:hAnsi="Times New Roman" w:cs="Times New Roman"/>
+          <w:kern w:val="0"/>
+          <w14:ligatures w14:val="none"/>
+        </w:rPr>
+        <w:t>/ (</w:t>
+      </w:r>
+      <w:r>
+        <w:rPr>
+          <w:rFonts w:ascii="Times New Roman" w:eastAsia="Times New Roman" w:hAnsi="Times New Roman" w:cs="Times New Roman"/>
+          <w:kern w:val="0"/>
+          <w14:ligatures w14:val="none"/>
+        </w:rPr>
+        <w:t>40</w:t>
+      </w:r>
+      <w:r>
+        <w:rPr>
+          <w:rFonts w:ascii="Times New Roman" w:eastAsia="Times New Roman" w:hAnsi="Times New Roman" w:cs="Times New Roman"/>
+          <w:kern w:val="0"/>
+          <w14:ligatures w14:val="none"/>
+        </w:rPr>
+        <w:t xml:space="preserve"> + </w:t>
+      </w:r>
+      <w:r>
+        <w:rPr>
+          <w:rFonts w:ascii="Times New Roman" w:eastAsia="Times New Roman" w:hAnsi="Times New Roman" w:cs="Times New Roman"/>
+          <w:kern w:val="0"/>
+          <w14:ligatures w14:val="none"/>
+        </w:rPr>
+        <w:t>45</w:t>
+      </w:r>
+      <w:r>
+        <w:rPr>
+          <w:rFonts w:ascii="Times New Roman" w:eastAsia="Times New Roman" w:hAnsi="Times New Roman" w:cs="Times New Roman"/>
+          <w:kern w:val="0"/>
+          <w14:ligatures w14:val="none"/>
+        </w:rPr>
+        <w:t>) = 0.</w:t>
+      </w:r>
+      <w:r>
+        <w:rPr>
+          <w:rFonts w:ascii="Times New Roman" w:eastAsia="Times New Roman" w:hAnsi="Times New Roman" w:cs="Times New Roman"/>
+          <w:kern w:val="0"/>
+          <w14:ligatures w14:val="none"/>
+        </w:rPr>
+        <w:t>47</w:t>
+      </w:r>
+    </w:p>
+    <w:p>
+      <w:pPr>
+        <w:pStyle w:val="ListParagraph"/>
+        <w:numPr>
+          <w:ilvl w:val="0"/>
+          <w:numId w:val="15"/>
+        </w:numPr>
+      </w:pPr>
+      <w:r>
+        <w:rPr>
+          <w:rFonts w:ascii="Times New Roman" w:eastAsia="Times New Roman" w:hAnsi="Times New Roman" w:cs="Times New Roman"/>
+          <w:kern w:val="0"/>
+          <w14:ligatures w14:val="none"/>
+        </w:rPr>
+        <w:t>What is the b</w:t>
+      </w:r>
+      <w:r>
+        <w:rPr>
+          <w:rFonts w:ascii="Times New Roman" w:eastAsia="Times New Roman" w:hAnsi="Times New Roman" w:cs="Times New Roman"/>
+          <w:kern w:val="0"/>
+          <w14:ligatures w14:val="none"/>
+        </w:rPr>
+        <w:t xml:space="preserve">alance between Precision and Recall </w:t>
+      </w:r>
+      <w:r>
+        <w:rPr>
+          <w:rFonts w:ascii="Times New Roman" w:eastAsia="Times New Roman" w:hAnsi="Times New Roman" w:cs="Times New Roman"/>
+          <w:kern w:val="0"/>
+          <w14:ligatures w14:val="none"/>
+        </w:rPr>
+        <w:t>(</w:t>
+      </w:r>
+      <w:r>
+        <w:rPr>
+          <w:rFonts w:ascii="Times New Roman" w:eastAsia="Times New Roman" w:hAnsi="Times New Roman" w:cs="Times New Roman"/>
+          <w:kern w:val="0"/>
+          <w14:ligatures w14:val="none"/>
+        </w:rPr>
+        <w:t>F1-Score</w:t>
+      </w:r>
+      <w:r>
+        <w:rPr>
+          <w:rFonts w:ascii="Times New Roman" w:eastAsia="Times New Roman" w:hAnsi="Times New Roman" w:cs="Times New Roman"/>
+          <w:kern w:val="0"/>
+          <w14:ligatures w14:val="none"/>
+        </w:rPr>
+        <w:t xml:space="preserve">)? = </w:t>
+      </w:r>
+      <w:r>
+        <w:rPr>
+          <w:rFonts w:ascii="Times New Roman" w:eastAsia="Times New Roman" w:hAnsi="Times New Roman" w:cs="Times New Roman"/>
+          <w:kern w:val="0"/>
+          <w14:ligatures w14:val="none"/>
+        </w:rPr>
+        <w:t>F1 = 2 × (Precision × Recall) / (Precision + Recall)</w:t>
+      </w:r>
+      <w:r>
+        <w:rPr>
+          <w:rFonts w:ascii="Times New Roman" w:eastAsia="Times New Roman" w:hAnsi="Times New Roman" w:cs="Times New Roman"/>
+          <w:kern w:val="0"/>
+          <w14:ligatures w14:val="none"/>
+        </w:rPr>
+        <w:t xml:space="preserve"> = 2 * (0.</w:t>
+      </w:r>
+      <w:r>
+        <w:rPr>
+          <w:rFonts w:ascii="Times New Roman" w:eastAsia="Times New Roman" w:hAnsi="Times New Roman" w:cs="Times New Roman"/>
+          <w:kern w:val="0"/>
+          <w14:ligatures w14:val="none"/>
+        </w:rPr>
+        <w:t>67</w:t>
+      </w:r>
+      <w:r>
+        <w:rPr>
+          <w:rFonts w:ascii="Times New Roman" w:eastAsia="Times New Roman" w:hAnsi="Times New Roman" w:cs="Times New Roman"/>
+          <w:kern w:val="0"/>
+          <w14:ligatures w14:val="none"/>
+        </w:rPr>
+        <w:t xml:space="preserve"> * 0.</w:t>
+      </w:r>
+      <w:r>
+        <w:rPr>
+          <w:rFonts w:ascii="Times New Roman" w:eastAsia="Times New Roman" w:hAnsi="Times New Roman" w:cs="Times New Roman"/>
+          <w:kern w:val="0"/>
+          <w14:ligatures w14:val="none"/>
+        </w:rPr>
+        <w:t>47</w:t>
+      </w:r>
+      <w:r>
+        <w:rPr>
+          <w:rFonts w:ascii="Times New Roman" w:eastAsia="Times New Roman" w:hAnsi="Times New Roman" w:cs="Times New Roman"/>
+          <w:kern w:val="0"/>
+          <w14:ligatures w14:val="none"/>
+        </w:rPr>
+        <w:t>)/ (0.</w:t>
+      </w:r>
+      <w:r>
+        <w:rPr>
+          <w:rFonts w:ascii="Times New Roman" w:eastAsia="Times New Roman" w:hAnsi="Times New Roman" w:cs="Times New Roman"/>
+          <w:kern w:val="0"/>
+          <w14:ligatures w14:val="none"/>
+        </w:rPr>
+        <w:t>67</w:t>
+      </w:r>
+      <w:r>
+        <w:rPr>
+          <w:rFonts w:ascii="Times New Roman" w:eastAsia="Times New Roman" w:hAnsi="Times New Roman" w:cs="Times New Roman"/>
+          <w:kern w:val="0"/>
+          <w14:ligatures w14:val="none"/>
+        </w:rPr>
+        <w:t xml:space="preserve"> + 0.</w:t>
+      </w:r>
+      <w:r>
+        <w:rPr>
+          <w:rFonts w:ascii="Times New Roman" w:eastAsia="Times New Roman" w:hAnsi="Times New Roman" w:cs="Times New Roman"/>
+          <w:kern w:val="0"/>
+          <w14:ligatures w14:val="none"/>
+        </w:rPr>
+        <w:t>47</w:t>
+      </w:r>
+      <w:r>
+        <w:rPr>
+          <w:rFonts w:ascii="Times New Roman" w:eastAsia="Times New Roman" w:hAnsi="Times New Roman" w:cs="Times New Roman"/>
+          <w:kern w:val="0"/>
+          <w14:ligatures w14:val="none"/>
+        </w:rPr>
+        <w:t>) = 0</w:t>
+      </w:r>
+      <w:r>
+        <w:rPr>
+          <w:rFonts w:ascii="Times New Roman" w:eastAsia="Times New Roman" w:hAnsi="Times New Roman" w:cs="Times New Roman"/>
+          <w:kern w:val="0"/>
+          <w14:ligatures w14:val="none"/>
+        </w:rPr>
+        <w:t>.55</w:t>
+      </w:r>
+    </w:p>
+    <w:p>
+      <w:pPr>
+        <w:pStyle w:val="ListParagraph"/>
+        <w:numPr>
+          <w:ilvl w:val="0"/>
+          <w:numId w:val="15"/>
+        </w:numPr>
+        <w:rPr>
+          <w:rFonts w:ascii="Times New Roman" w:eastAsia="Times New Roman" w:hAnsi="Times New Roman" w:cs="Times New Roman"/>
+          <w:kern w:val="0"/>
+          <w14:ligatures w14:val="none"/>
+        </w:rPr>
+      </w:pPr>
+      <w:r>
+        <w:t xml:space="preserve">What is the </w:t>
+      </w:r>
+      <w:r>
+        <w:rPr>
+          <w:rFonts w:ascii="Times New Roman" w:eastAsia="Times New Roman" w:hAnsi="Times New Roman" w:cs="Times New Roman"/>
+          <w:kern w:val="0"/>
+          <w14:ligatures w14:val="none"/>
+        </w:rPr>
+        <w:t xml:space="preserve">number of actual samples in each class? </w:t>
+      </w:r>
+      <w:r>
+        <w:rPr>
+          <w:rFonts w:ascii="Times New Roman" w:eastAsia="Times New Roman" w:hAnsi="Times New Roman" w:cs="Times New Roman"/>
+          <w:kern w:val="0"/>
+          <w14:ligatures w14:val="none"/>
+        </w:rPr>
+        <w:t>(</w:t>
+      </w:r>
+      <w:r>
+        <w:t>Support is n</w:t>
+      </w:r>
+      <w:r>
+        <w:t>umber of actual samples in each class.</w:t>
+      </w:r>
+      <w:r>
+        <w:t>)</w:t>
+      </w:r>
+    </w:p>
+    <w:p>
+      <w:pPr>
+        <w:pStyle w:val="ListParagraph"/>
+        <w:ind w:firstLine="720"/>
+      </w:pPr>
+      <w:r>
+        <w:t>85 - did not purchase the course from advertisement.</w:t>
+      </w:r>
+    </w:p>
+    <w:p>
+      <w:pPr>
+        <w:pStyle w:val="ListParagraph"/>
+        <w:ind w:firstLine="720"/>
+      </w:pPr>
+      <w:r>
+        <w:t>49 - did purchase the course from advertisement.</w:t>
+      </w:r>
+    </w:p>
+    <w:p>
+      <w:pPr>
+        <w:pStyle w:val="ListParagraph"/>
+        <w:numPr>
+          <w:ilvl w:val="0"/>
+          <w:numId w:val="15"/>
+        </w:numPr>
+      </w:pPr>
+      <w:r>
+        <w:rPr>
+          <w:b/>
+          <w:bCs/>
+        </w:rPr>
+        <w:t>How many predictions did the model get right (Accuracy)? = (TP + TN) / (TP + TN + FP + FN) = (</w:t>
+      </w:r>
+      <w:r>
+        <w:rPr>
+          <w:b/>
+          <w:bCs/>
+        </w:rPr>
+        <w:t>82</w:t>
+      </w:r>
+      <w:r>
+        <w:rPr>
+          <w:b/>
+          <w:bCs/>
+        </w:rPr>
+        <w:t xml:space="preserve">+ </w:t>
+      </w:r>
+      <w:r>
+        <w:rPr>
+          <w:b/>
+          <w:bCs/>
+        </w:rPr>
+        <w:t>18</w:t>
+      </w:r>
+      <w:r>
+        <w:rPr>
+          <w:b/>
+          <w:bCs/>
+        </w:rPr>
+        <w:t>)/ (</w:t>
+      </w:r>
+      <w:r>
+        <w:rPr>
+          <w:b/>
+          <w:bCs/>
+        </w:rPr>
+        <w:t>40</w:t>
+      </w:r>
+      <w:r>
+        <w:rPr>
+          <w:b/>
+          <w:bCs/>
+        </w:rPr>
+        <w:t xml:space="preserve"> + </w:t>
+      </w:r>
+      <w:r>
+        <w:rPr>
+          <w:b/>
+          <w:bCs/>
+        </w:rPr>
+        <w:t>29</w:t>
+      </w:r>
+      <w:r>
+        <w:rPr>
+          <w:b/>
+          <w:bCs/>
+        </w:rPr>
+        <w:t xml:space="preserve"> + </w:t>
+      </w:r>
+      <w:r>
+        <w:rPr>
+          <w:b/>
+          <w:bCs/>
+        </w:rPr>
+        <w:t>20</w:t>
+      </w:r>
+      <w:r>
+        <w:rPr>
+          <w:b/>
+          <w:bCs/>
+        </w:rPr>
+        <w:t xml:space="preserve"> </w:t>
+      </w:r>
+      <w:r>
+        <w:rPr>
+          <w:b/>
+          <w:bCs/>
+        </w:rPr>
+        <w:t xml:space="preserve">+ </w:t>
+      </w:r>
+      <w:r>
+        <w:rPr>
+          <w:b/>
+          <w:bCs/>
+        </w:rPr>
+        <w:t>45</w:t>
+      </w:r>
+      <w:r>
+        <w:rPr>
+          <w:b/>
+          <w:bCs/>
+        </w:rPr>
+        <w:t>) = 0.</w:t>
+      </w:r>
+      <w:r>
+        <w:rPr>
+          <w:b/>
+          <w:bCs/>
+        </w:rPr>
+        <w:t>51</w:t>
+      </w:r>
+    </w:p>
+    <w:p/>
+    <w:p>
+      <w:pPr>
+        <w:ind w:left="720" w:hanging="360"/>
+        <w:rPr>
+          <w:b/>
+          <w:bCs/>
+          <w:sz w:val="40"/>
+          <w:szCs w:val="40"/>
+        </w:rPr>
+      </w:pPr>
+      <w:r>
+        <w:rPr>
+          <w:b/>
+          <w:bCs/>
+          <w:sz w:val="40"/>
+          <w:szCs w:val="40"/>
+        </w:rPr>
+        <w:t>SVM-Grid-Classification</w:t>
+      </w:r>
+    </w:p>
+    <w:p>
+      <w:pPr>
+        <w:pStyle w:val="ListParagraph"/>
+        <w:numPr>
+          <w:ilvl w:val="0"/>
+          <w:numId w:val="16"/>
+        </w:numPr>
+        <w:rPr>
+          <w:rFonts w:ascii="Times New Roman" w:eastAsia="Times New Roman" w:hAnsi="Times New Roman" w:cs="Times New Roman"/>
+          <w:kern w:val="0"/>
+          <w14:ligatures w14:val="none"/>
+        </w:rPr>
+      </w:pPr>
+      <w:r>
+        <w:rPr>
+          <w:rFonts w:ascii="Times New Roman" w:eastAsia="Times New Roman" w:hAnsi="Times New Roman" w:cs="Times New Roman"/>
+          <w:kern w:val="0"/>
+          <w14:ligatures w14:val="none"/>
+        </w:rPr>
+        <w:t xml:space="preserve">When the model says Yes, how often is it correct? (i.e., Precision) = TP/ (TP + FP) = </w:t>
+      </w:r>
+      <w:r>
+        <w:rPr>
+          <w:rFonts w:ascii="Times New Roman" w:eastAsia="Times New Roman" w:hAnsi="Times New Roman" w:cs="Times New Roman"/>
+          <w:kern w:val="0"/>
+          <w14:ligatures w14:val="none"/>
+        </w:rPr>
+        <w:t>80</w:t>
+      </w:r>
+      <w:r>
+        <w:rPr>
+          <w:rFonts w:ascii="Times New Roman" w:eastAsia="Times New Roman" w:hAnsi="Times New Roman" w:cs="Times New Roman"/>
+          <w:kern w:val="0"/>
+          <w14:ligatures w14:val="none"/>
+        </w:rPr>
+        <w:t>/ (</w:t>
+      </w:r>
+      <w:r>
+        <w:rPr>
+          <w:rFonts w:ascii="Times New Roman" w:eastAsia="Times New Roman" w:hAnsi="Times New Roman" w:cs="Times New Roman"/>
+          <w:kern w:val="0"/>
+          <w14:ligatures w14:val="none"/>
+        </w:rPr>
+        <w:t>80</w:t>
+      </w:r>
+      <w:r>
+        <w:rPr>
+          <w:rFonts w:ascii="Times New Roman" w:eastAsia="Times New Roman" w:hAnsi="Times New Roman" w:cs="Times New Roman"/>
+          <w:kern w:val="0"/>
+          <w14:ligatures w14:val="none"/>
+        </w:rPr>
+        <w:t xml:space="preserve"> + </w:t>
+      </w:r>
+      <w:r>
+        <w:rPr>
+          <w:rFonts w:ascii="Times New Roman" w:eastAsia="Times New Roman" w:hAnsi="Times New Roman" w:cs="Times New Roman"/>
+          <w:kern w:val="0"/>
+          <w14:ligatures w14:val="none"/>
+        </w:rPr>
+        <w:t>7</w:t>
+      </w:r>
+      <w:r>
+        <w:rPr>
+          <w:rFonts w:ascii="Times New Roman" w:eastAsia="Times New Roman" w:hAnsi="Times New Roman" w:cs="Times New Roman"/>
+          <w:kern w:val="0"/>
+          <w14:ligatures w14:val="none"/>
+        </w:rPr>
+        <w:t>) = 0.</w:t>
+      </w:r>
+      <w:r>
+        <w:rPr>
+          <w:rFonts w:ascii="Times New Roman" w:eastAsia="Times New Roman" w:hAnsi="Times New Roman" w:cs="Times New Roman"/>
+          <w:kern w:val="0"/>
+          <w14:ligatures w14:val="none"/>
+        </w:rPr>
+        <w:t>92</w:t>
+      </w:r>
+    </w:p>
+    <w:p>
+      <w:pPr>
+        <w:pStyle w:val="ListParagraph"/>
+        <w:numPr>
+          <w:ilvl w:val="0"/>
+          <w:numId w:val="16"/>
+        </w:numPr>
+        <w:rPr>
+          <w:rFonts w:ascii="Times New Roman" w:eastAsia="Times New Roman" w:hAnsi="Times New Roman" w:cs="Times New Roman"/>
+          <w:kern w:val="0"/>
+          <w14:ligatures w14:val="none"/>
+        </w:rPr>
+      </w:pPr>
+      <w:r>
+        <w:rPr>
+          <w:rFonts w:ascii="Times New Roman" w:eastAsia="Times New Roman" w:hAnsi="Times New Roman" w:cs="Times New Roman"/>
+          <w:kern w:val="0"/>
+          <w14:ligatures w14:val="none"/>
+        </w:rPr>
+        <w:t xml:space="preserve">Out of all actual </w:t>
+      </w:r>
+      <w:r>
+        <w:rPr>
+          <w:rFonts w:ascii="Times New Roman" w:eastAsia="Times New Roman" w:hAnsi="Times New Roman" w:cs="Times New Roman"/>
+          <w:kern w:val="0"/>
+          <w14:ligatures w14:val="none"/>
+        </w:rPr>
+        <w:t>Yes</w:t>
+      </w:r>
+      <w:r>
+        <w:rPr>
+          <w:rFonts w:ascii="Times New Roman" w:eastAsia="Times New Roman" w:hAnsi="Times New Roman" w:cs="Times New Roman"/>
+          <w:kern w:val="0"/>
+          <w14:ligatures w14:val="none"/>
+        </w:rPr>
+        <w:t xml:space="preserve">, how many did the model find? </w:t>
+      </w:r>
+      <w:r>
+        <w:rPr>
+          <w:rFonts w:ascii="Times New Roman" w:eastAsia="Times New Roman" w:hAnsi="Times New Roman" w:cs="Times New Roman"/>
+          <w:kern w:val="0"/>
+          <w14:ligatures w14:val="none"/>
+        </w:rPr>
+        <w:t xml:space="preserve">(i.e., </w:t>
+      </w:r>
+      <w:r>
+        <w:rPr>
+          <w:rFonts w:ascii="Times New Roman" w:eastAsia="Times New Roman" w:hAnsi="Times New Roman" w:cs="Times New Roman"/>
+          <w:kern w:val="0"/>
+          <w14:ligatures w14:val="none"/>
+        </w:rPr>
+        <w:t>Recall</w:t>
+      </w:r>
+      <w:r>
+        <w:rPr>
+          <w:rFonts w:ascii="Times New Roman" w:eastAsia="Times New Roman" w:hAnsi="Times New Roman" w:cs="Times New Roman"/>
+          <w:kern w:val="0"/>
+          <w14:ligatures w14:val="none"/>
+        </w:rPr>
+        <w:t>)</w:t>
+      </w:r>
+      <w:r>
+        <w:rPr>
+          <w:rFonts w:ascii="Times New Roman" w:eastAsia="Times New Roman" w:hAnsi="Times New Roman" w:cs="Times New Roman"/>
+          <w:kern w:val="0"/>
+          <w14:ligatures w14:val="none"/>
+        </w:rPr>
+        <w:t>?</w:t>
+      </w:r>
+      <w:r>
+        <w:rPr>
+          <w:rFonts w:ascii="Times New Roman" w:eastAsia="Times New Roman" w:hAnsi="Times New Roman" w:cs="Times New Roman"/>
+          <w:kern w:val="0"/>
+          <w14:ligatures w14:val="none"/>
+        </w:rPr>
+        <w:t xml:space="preserve"> </w:t>
+      </w:r>
+      <w:r>
+        <w:rPr>
+          <w:rFonts w:ascii="Times New Roman" w:eastAsia="Times New Roman" w:hAnsi="Times New Roman" w:cs="Times New Roman"/>
+          <w:kern w:val="0"/>
+          <w14:ligatures w14:val="none"/>
+        </w:rPr>
+        <w:t>= TP / (TP + FN)</w:t>
+      </w:r>
+      <w:r>
+        <w:rPr>
+          <w:rFonts w:ascii="Times New Roman" w:eastAsia="Times New Roman" w:hAnsi="Times New Roman" w:cs="Times New Roman"/>
+          <w:kern w:val="0"/>
+          <w14:ligatures w14:val="none"/>
+        </w:rPr>
+        <w:t xml:space="preserve"> = </w:t>
+      </w:r>
+      <w:r>
+        <w:rPr>
+          <w:rFonts w:ascii="Times New Roman" w:eastAsia="Times New Roman" w:hAnsi="Times New Roman" w:cs="Times New Roman"/>
+          <w:kern w:val="0"/>
+          <w14:ligatures w14:val="none"/>
+        </w:rPr>
+        <w:t>8</w:t>
+      </w:r>
+      <w:r>
+        <w:rPr>
+          <w:rFonts w:ascii="Times New Roman" w:eastAsia="Times New Roman" w:hAnsi="Times New Roman" w:cs="Times New Roman"/>
+          <w:kern w:val="0"/>
+          <w14:ligatures w14:val="none"/>
+        </w:rPr>
+        <w:t>0/ (</w:t>
+      </w:r>
+      <w:r>
+        <w:rPr>
+          <w:rFonts w:ascii="Times New Roman" w:eastAsia="Times New Roman" w:hAnsi="Times New Roman" w:cs="Times New Roman"/>
+          <w:kern w:val="0"/>
+          <w14:ligatures w14:val="none"/>
+        </w:rPr>
+        <w:t>8</w:t>
+      </w:r>
+      <w:r>
+        <w:rPr>
+          <w:rFonts w:ascii="Times New Roman" w:eastAsia="Times New Roman" w:hAnsi="Times New Roman" w:cs="Times New Roman"/>
+          <w:kern w:val="0"/>
+          <w14:ligatures w14:val="none"/>
+        </w:rPr>
+        <w:t>0 + 5) = 0.</w:t>
+      </w:r>
+      <w:r>
+        <w:rPr>
+          <w:rFonts w:ascii="Times New Roman" w:eastAsia="Times New Roman" w:hAnsi="Times New Roman" w:cs="Times New Roman"/>
+          <w:kern w:val="0"/>
+          <w14:ligatures w14:val="none"/>
+        </w:rPr>
+        <w:t>94</w:t>
+      </w:r>
+    </w:p>
+    <w:p>
+      <w:pPr>
+        <w:pStyle w:val="ListParagraph"/>
+        <w:numPr>
+          <w:ilvl w:val="0"/>
+          <w:numId w:val="16"/>
+        </w:numPr>
+      </w:pPr>
+      <w:r>
+        <w:rPr>
+          <w:rFonts w:ascii="Times New Roman" w:eastAsia="Times New Roman" w:hAnsi="Times New Roman" w:cs="Times New Roman"/>
+          <w:kern w:val="0"/>
+          <w14:ligatures w14:val="none"/>
+        </w:rPr>
+        <w:t>What is the b</w:t>
+      </w:r>
+      <w:r>
+        <w:rPr>
+          <w:rFonts w:ascii="Times New Roman" w:eastAsia="Times New Roman" w:hAnsi="Times New Roman" w:cs="Times New Roman"/>
+          <w:kern w:val="0"/>
+          <w14:ligatures w14:val="none"/>
+        </w:rPr>
+        <w:t xml:space="preserve">alance between Precision and Recall </w:t>
+      </w:r>
+      <w:r>
+        <w:rPr>
+          <w:rFonts w:ascii="Times New Roman" w:eastAsia="Times New Roman" w:hAnsi="Times New Roman" w:cs="Times New Roman"/>
+          <w:kern w:val="0"/>
+          <w14:ligatures w14:val="none"/>
+        </w:rPr>
+        <w:t>(</w:t>
+      </w:r>
+      <w:r>
+        <w:rPr>
+          <w:rFonts w:ascii="Times New Roman" w:eastAsia="Times New Roman" w:hAnsi="Times New Roman" w:cs="Times New Roman"/>
+          <w:kern w:val="0"/>
+          <w14:ligatures w14:val="none"/>
+        </w:rPr>
+        <w:t>F1-Score</w:t>
+      </w:r>
+      <w:r>
+        <w:rPr>
+          <w:rFonts w:ascii="Times New Roman" w:eastAsia="Times New Roman" w:hAnsi="Times New Roman" w:cs="Times New Roman"/>
+          <w:kern w:val="0"/>
+          <w14:ligatures w14:val="none"/>
+        </w:rPr>
+        <w:t xml:space="preserve">)? = </w:t>
+      </w:r>
+      <w:r>
+        <w:rPr>
+          <w:rFonts w:ascii="Times New Roman" w:eastAsia="Times New Roman" w:hAnsi="Times New Roman" w:cs="Times New Roman"/>
+          <w:kern w:val="0"/>
+          <w14:ligatures w14:val="none"/>
+        </w:rPr>
+        <w:t>F1 = 2 × (Precision × Recall) / (Precision + Recall)</w:t>
+      </w:r>
+      <w:r>
+        <w:rPr>
+          <w:rFonts w:ascii="Times New Roman" w:eastAsia="Times New Roman" w:hAnsi="Times New Roman" w:cs="Times New Roman"/>
+          <w:kern w:val="0"/>
+          <w14:ligatures w14:val="none"/>
+        </w:rPr>
+        <w:t xml:space="preserve"> = 2 * (0.</w:t>
+      </w:r>
+      <w:r>
+        <w:rPr>
+          <w:rFonts w:ascii="Times New Roman" w:eastAsia="Times New Roman" w:hAnsi="Times New Roman" w:cs="Times New Roman"/>
+          <w:kern w:val="0"/>
+          <w14:ligatures w14:val="none"/>
+        </w:rPr>
+        <w:t>92</w:t>
+      </w:r>
+      <w:r>
+        <w:rPr>
+          <w:rFonts w:ascii="Times New Roman" w:eastAsia="Times New Roman" w:hAnsi="Times New Roman" w:cs="Times New Roman"/>
+          <w:kern w:val="0"/>
+          <w14:ligatures w14:val="none"/>
+        </w:rPr>
+        <w:t xml:space="preserve"> * 0.</w:t>
+      </w:r>
+      <w:r>
+        <w:rPr>
+          <w:rFonts w:ascii="Times New Roman" w:eastAsia="Times New Roman" w:hAnsi="Times New Roman" w:cs="Times New Roman"/>
+          <w:kern w:val="0"/>
+          <w14:ligatures w14:val="none"/>
+        </w:rPr>
+        <w:t>94</w:t>
+      </w:r>
+      <w:r>
+        <w:rPr>
+          <w:rFonts w:ascii="Times New Roman" w:eastAsia="Times New Roman" w:hAnsi="Times New Roman" w:cs="Times New Roman"/>
+          <w:kern w:val="0"/>
+          <w14:ligatures w14:val="none"/>
+        </w:rPr>
+        <w:t>)/ (0.</w:t>
+      </w:r>
+      <w:r>
+        <w:rPr>
+          <w:rFonts w:ascii="Times New Roman" w:eastAsia="Times New Roman" w:hAnsi="Times New Roman" w:cs="Times New Roman"/>
+          <w:kern w:val="0"/>
+          <w14:ligatures w14:val="none"/>
+        </w:rPr>
+        <w:t>92</w:t>
+      </w:r>
+      <w:r>
+        <w:rPr>
+          <w:rFonts w:ascii="Times New Roman" w:eastAsia="Times New Roman" w:hAnsi="Times New Roman" w:cs="Times New Roman"/>
+          <w:kern w:val="0"/>
+          <w14:ligatures w14:val="none"/>
+        </w:rPr>
+        <w:t xml:space="preserve"> + 0.</w:t>
+      </w:r>
+      <w:r>
+        <w:rPr>
+          <w:rFonts w:ascii="Times New Roman" w:eastAsia="Times New Roman" w:hAnsi="Times New Roman" w:cs="Times New Roman"/>
+          <w:kern w:val="0"/>
+          <w14:ligatures w14:val="none"/>
+        </w:rPr>
+        <w:t>94</w:t>
+      </w:r>
+      <w:r>
+        <w:rPr>
+          <w:rFonts w:ascii="Times New Roman" w:eastAsia="Times New Roman" w:hAnsi="Times New Roman" w:cs="Times New Roman"/>
+          <w:kern w:val="0"/>
+          <w14:ligatures w14:val="none"/>
+        </w:rPr>
+        <w:t>) = 0.</w:t>
+      </w:r>
+      <w:r>
+        <w:rPr>
+          <w:rFonts w:ascii="Times New Roman" w:eastAsia="Times New Roman" w:hAnsi="Times New Roman" w:cs="Times New Roman"/>
+          <w:kern w:val="0"/>
+          <w14:ligatures w14:val="none"/>
+        </w:rPr>
+        <w:t>93</w:t>
+      </w:r>
+    </w:p>
+    <w:p>
+      <w:pPr>
+        <w:pStyle w:val="ListParagraph"/>
+        <w:numPr>
+          <w:ilvl w:val="0"/>
+          <w:numId w:val="16"/>
+        </w:numPr>
+        <w:rPr>
+          <w:rFonts w:ascii="Times New Roman" w:eastAsia="Times New Roman" w:hAnsi="Times New Roman" w:cs="Times New Roman"/>
+          <w:kern w:val="0"/>
+          <w14:ligatures w14:val="none"/>
+        </w:rPr>
+      </w:pPr>
+      <w:r>
+        <w:t xml:space="preserve">What is the </w:t>
+      </w:r>
+      <w:r>
+        <w:rPr>
+          <w:rFonts w:ascii="Times New Roman" w:eastAsia="Times New Roman" w:hAnsi="Times New Roman" w:cs="Times New Roman"/>
+          <w:kern w:val="0"/>
+          <w14:ligatures w14:val="none"/>
+        </w:rPr>
+        <w:t xml:space="preserve">number of actual samples in each class? </w:t>
+      </w:r>
+      <w:r>
+        <w:rPr>
+          <w:rFonts w:ascii="Times New Roman" w:eastAsia="Times New Roman" w:hAnsi="Times New Roman" w:cs="Times New Roman"/>
+          <w:kern w:val="0"/>
+          <w14:ligatures w14:val="none"/>
+        </w:rPr>
+        <w:t>(</w:t>
+      </w:r>
+      <w:r>
+        <w:t>Support is n</w:t>
+      </w:r>
+      <w:r>
+        <w:t>umber of actual samples in each class.</w:t>
+      </w:r>
+      <w:r>
+        <w:t>)</w:t>
+      </w:r>
+    </w:p>
+    <w:p>
+      <w:pPr>
+        <w:pStyle w:val="ListParagraph"/>
+        <w:ind w:firstLine="720"/>
+      </w:pPr>
+      <w:r>
+        <w:t>85 - did not purchase the course from advertisement.</w:t>
+      </w:r>
+    </w:p>
+    <w:p>
+      <w:pPr>
+        <w:pStyle w:val="ListParagraph"/>
+        <w:ind w:firstLine="720"/>
+      </w:pPr>
+      <w:r>
+        <w:t>49 - did purchase the course from advertisement.</w:t>
+      </w:r>
+    </w:p>
+    <w:p>
+      <w:pPr>
+        <w:pStyle w:val="ListParagraph"/>
+        <w:numPr>
+          <w:ilvl w:val="0"/>
+          <w:numId w:val="16"/>
+        </w:numPr>
+      </w:pPr>
+      <w:r>
+        <w:rPr>
+          <w:b/>
+          <w:bCs/>
+        </w:rPr>
+        <w:t>How many predictions did the model get right (Accuracy)? = (TP + TN) / (TP + TN + FP + FN) = (</w:t>
+      </w:r>
+      <w:r>
+        <w:rPr>
+          <w:b/>
+          <w:bCs/>
+        </w:rPr>
+        <w:t>8</w:t>
+      </w:r>
+      <w:r>
+        <w:rPr>
+          <w:b/>
+          <w:bCs/>
+        </w:rPr>
+        <w:t>0</w:t>
+      </w:r>
+      <w:r>
+        <w:rPr>
+          <w:b/>
+          <w:bCs/>
+        </w:rPr>
+        <w:t xml:space="preserve">+ </w:t>
+      </w:r>
+      <w:r>
+        <w:rPr>
+          <w:b/>
+          <w:bCs/>
+        </w:rPr>
+        <w:t>42</w:t>
+      </w:r>
+      <w:r>
+        <w:rPr>
+          <w:b/>
+          <w:bCs/>
+        </w:rPr>
+        <w:t>)/ (</w:t>
+      </w:r>
+      <w:r>
+        <w:rPr>
+          <w:b/>
+          <w:bCs/>
+        </w:rPr>
+        <w:t>8</w:t>
+      </w:r>
+      <w:r>
+        <w:rPr>
+          <w:b/>
+          <w:bCs/>
+        </w:rPr>
+        <w:t>0</w:t>
+      </w:r>
+      <w:r>
+        <w:rPr>
+          <w:b/>
+          <w:bCs/>
+        </w:rPr>
+        <w:t xml:space="preserve"> + </w:t>
+      </w:r>
+      <w:r>
+        <w:rPr>
+          <w:b/>
+          <w:bCs/>
+        </w:rPr>
+        <w:t>42</w:t>
+      </w:r>
+      <w:r>
+        <w:rPr>
+          <w:b/>
+          <w:bCs/>
+        </w:rPr>
+        <w:t xml:space="preserve"> + </w:t>
+      </w:r>
+      <w:r>
+        <w:rPr>
+          <w:b/>
+          <w:bCs/>
+        </w:rPr>
+        <w:t>7</w:t>
+      </w:r>
+      <w:r>
+        <w:rPr>
+          <w:b/>
+          <w:bCs/>
+        </w:rPr>
+        <w:t xml:space="preserve"> </w:t>
+      </w:r>
+      <w:r>
+        <w:rPr>
+          <w:b/>
+          <w:bCs/>
+        </w:rPr>
+        <w:t xml:space="preserve">+ </w:t>
+      </w:r>
+      <w:r>
+        <w:rPr>
+          <w:b/>
+          <w:bCs/>
+        </w:rPr>
+        <w:t>5</w:t>
+      </w:r>
+      <w:r>
+        <w:rPr>
+          <w:b/>
+          <w:bCs/>
+        </w:rPr>
+        <w:t>) = 0.</w:t>
+      </w:r>
+      <w:r>
+        <w:rPr>
+          <w:b/>
+          <w:bCs/>
+        </w:rPr>
+        <w:t>91</w:t>
+      </w:r>
+    </w:p>
+    <w:p/>
+    <w:p>
+      <w:pPr>
+        <w:ind w:left="720" w:hanging="360"/>
+        <w:rPr>
+          <w:b/>
+          <w:bCs/>
+          <w:sz w:val="40"/>
+          <w:szCs w:val="40"/>
+        </w:rPr>
+      </w:pPr>
+      <w:r>
+        <w:rPr>
+          <w:b/>
+          <w:bCs/>
+          <w:sz w:val="40"/>
+          <w:szCs w:val="40"/>
+        </w:rPr>
+        <w:t>DT</w:t>
+      </w:r>
+      <w:r>
+        <w:rPr>
+          <w:b/>
+          <w:bCs/>
+          <w:sz w:val="40"/>
+          <w:szCs w:val="40"/>
+        </w:rPr>
+        <w:t>-Grid-Classification</w:t>
+      </w:r>
+    </w:p>
+    <w:p>
+      <w:pPr>
+        <w:pStyle w:val="ListParagraph"/>
+        <w:numPr>
+          <w:ilvl w:val="0"/>
+          <w:numId w:val="17"/>
+        </w:numPr>
+        <w:rPr>
+          <w:rFonts w:ascii="Times New Roman" w:eastAsia="Times New Roman" w:hAnsi="Times New Roman" w:cs="Times New Roman"/>
+          <w:kern w:val="0"/>
+          <w14:ligatures w14:val="none"/>
+        </w:rPr>
+      </w:pPr>
+      <w:r>
+        <w:rPr>
+          <w:rFonts w:ascii="Times New Roman" w:eastAsia="Times New Roman" w:hAnsi="Times New Roman" w:cs="Times New Roman"/>
+          <w:kern w:val="0"/>
+          <w14:ligatures w14:val="none"/>
+        </w:rPr>
+        <w:t xml:space="preserve">When the model says Yes, how often is it correct? (i.e., Precision) = TP/ (TP + FP) = </w:t>
+      </w:r>
+      <w:r>
+        <w:rPr>
+          <w:rFonts w:ascii="Times New Roman" w:eastAsia="Times New Roman" w:hAnsi="Times New Roman" w:cs="Times New Roman"/>
+          <w:kern w:val="0"/>
+          <w14:ligatures w14:val="none"/>
+        </w:rPr>
+        <w:t>75</w:t>
+      </w:r>
+      <w:r>
+        <w:rPr>
+          <w:rFonts w:ascii="Times New Roman" w:eastAsia="Times New Roman" w:hAnsi="Times New Roman" w:cs="Times New Roman"/>
+          <w:kern w:val="0"/>
+          <w14:ligatures w14:val="none"/>
+        </w:rPr>
+        <w:t>/ (</w:t>
+      </w:r>
+      <w:r>
+        <w:rPr>
+          <w:rFonts w:ascii="Times New Roman" w:eastAsia="Times New Roman" w:hAnsi="Times New Roman" w:cs="Times New Roman"/>
+          <w:kern w:val="0"/>
+          <w14:ligatures w14:val="none"/>
+        </w:rPr>
+        <w:t>75</w:t>
+      </w:r>
+      <w:r>
+        <w:rPr>
+          <w:rFonts w:ascii="Times New Roman" w:eastAsia="Times New Roman" w:hAnsi="Times New Roman" w:cs="Times New Roman"/>
+          <w:kern w:val="0"/>
+          <w14:ligatures w14:val="none"/>
+        </w:rPr>
+        <w:t xml:space="preserve"> + </w:t>
+      </w:r>
+      <w:r>
+        <w:rPr>
+          <w:rFonts w:ascii="Times New Roman" w:eastAsia="Times New Roman" w:hAnsi="Times New Roman" w:cs="Times New Roman"/>
+          <w:kern w:val="0"/>
+          <w14:ligatures w14:val="none"/>
+        </w:rPr>
+        <w:t>7</w:t>
+      </w:r>
+      <w:r>
+        <w:rPr>
+          <w:rFonts w:ascii="Times New Roman" w:eastAsia="Times New Roman" w:hAnsi="Times New Roman" w:cs="Times New Roman"/>
+          <w:kern w:val="0"/>
+          <w14:ligatures w14:val="none"/>
+        </w:rPr>
+        <w:t>) = 0.</w:t>
+      </w:r>
+      <w:r>
+        <w:rPr>
+          <w:rFonts w:ascii="Times New Roman" w:eastAsia="Times New Roman" w:hAnsi="Times New Roman" w:cs="Times New Roman"/>
+          <w:kern w:val="0"/>
+          <w14:ligatures w14:val="none"/>
+        </w:rPr>
+        <w:t>9</w:t>
+      </w:r>
+      <w:r>
+        <w:rPr>
+          <w:rFonts w:ascii="Times New Roman" w:eastAsia="Times New Roman" w:hAnsi="Times New Roman" w:cs="Times New Roman"/>
+          <w:kern w:val="0"/>
+          <w14:ligatures w14:val="none"/>
+        </w:rPr>
+        <w:t>1</w:t>
+      </w:r>
+    </w:p>
+    <w:p>
+      <w:pPr>
+        <w:pStyle w:val="ListParagraph"/>
+        <w:numPr>
+          <w:ilvl w:val="0"/>
+          <w:numId w:val="17"/>
+        </w:numPr>
+        <w:rPr>
+          <w:rFonts w:ascii="Times New Roman" w:eastAsia="Times New Roman" w:hAnsi="Times New Roman" w:cs="Times New Roman"/>
+          <w:kern w:val="0"/>
+          <w14:ligatures w14:val="none"/>
+        </w:rPr>
+      </w:pPr>
+      <w:r>
+        <w:rPr>
+          <w:rFonts w:ascii="Times New Roman" w:eastAsia="Times New Roman" w:hAnsi="Times New Roman" w:cs="Times New Roman"/>
+          <w:kern w:val="0"/>
+          <w14:ligatures w14:val="none"/>
+        </w:rPr>
+        <w:t xml:space="preserve">Out of all actual </w:t>
+      </w:r>
+      <w:r>
+        <w:rPr>
+          <w:rFonts w:ascii="Times New Roman" w:eastAsia="Times New Roman" w:hAnsi="Times New Roman" w:cs="Times New Roman"/>
+          <w:kern w:val="0"/>
+          <w14:ligatures w14:val="none"/>
+        </w:rPr>
+        <w:t>Yes</w:t>
+      </w:r>
+      <w:r>
+        <w:rPr>
+          <w:rFonts w:ascii="Times New Roman" w:eastAsia="Times New Roman" w:hAnsi="Times New Roman" w:cs="Times New Roman"/>
+          <w:kern w:val="0"/>
+          <w14:ligatures w14:val="none"/>
+        </w:rPr>
+        <w:t xml:space="preserve">, how many did the model find? </w:t>
+      </w:r>
+      <w:r>
+        <w:rPr>
+          <w:rFonts w:ascii="Times New Roman" w:eastAsia="Times New Roman" w:hAnsi="Times New Roman" w:cs="Times New Roman"/>
+          <w:kern w:val="0"/>
+          <w14:ligatures w14:val="none"/>
+        </w:rPr>
+        <w:t xml:space="preserve">(i.e., </w:t>
+      </w:r>
+      <w:r>
+        <w:rPr>
+          <w:rFonts w:ascii="Times New Roman" w:eastAsia="Times New Roman" w:hAnsi="Times New Roman" w:cs="Times New Roman"/>
+          <w:kern w:val="0"/>
+          <w14:ligatures w14:val="none"/>
+        </w:rPr>
+        <w:t>Recall</w:t>
+      </w:r>
+      <w:r>
+        <w:rPr>
+          <w:rFonts w:ascii="Times New Roman" w:eastAsia="Times New Roman" w:hAnsi="Times New Roman" w:cs="Times New Roman"/>
+          <w:kern w:val="0"/>
+          <w14:ligatures w14:val="none"/>
+        </w:rPr>
+        <w:t>)</w:t>
+      </w:r>
+      <w:r>
+        <w:rPr>
+          <w:rFonts w:ascii="Times New Roman" w:eastAsia="Times New Roman" w:hAnsi="Times New Roman" w:cs="Times New Roman"/>
+          <w:kern w:val="0"/>
+          <w14:ligatures w14:val="none"/>
+        </w:rPr>
+        <w:t>?</w:t>
+      </w:r>
+      <w:r>
+        <w:rPr>
+          <w:rFonts w:ascii="Times New Roman" w:eastAsia="Times New Roman" w:hAnsi="Times New Roman" w:cs="Times New Roman"/>
+          <w:kern w:val="0"/>
+          <w14:ligatures w14:val="none"/>
+        </w:rPr>
+        <w:t xml:space="preserve"> </w:t>
+      </w:r>
+      <w:r>
+        <w:rPr>
+          <w:rFonts w:ascii="Times New Roman" w:eastAsia="Times New Roman" w:hAnsi="Times New Roman" w:cs="Times New Roman"/>
+          <w:kern w:val="0"/>
+          <w14:ligatures w14:val="none"/>
+        </w:rPr>
+        <w:t>= TP / (TP + FN)</w:t>
+      </w:r>
+      <w:r>
+        <w:rPr>
+          <w:rFonts w:ascii="Times New Roman" w:eastAsia="Times New Roman" w:hAnsi="Times New Roman" w:cs="Times New Roman"/>
+          <w:kern w:val="0"/>
+          <w14:ligatures w14:val="none"/>
+        </w:rPr>
+        <w:t xml:space="preserve"> = </w:t>
+      </w:r>
+      <w:r>
+        <w:rPr>
+          <w:rFonts w:ascii="Times New Roman" w:eastAsia="Times New Roman" w:hAnsi="Times New Roman" w:cs="Times New Roman"/>
+          <w:kern w:val="0"/>
+          <w14:ligatures w14:val="none"/>
+        </w:rPr>
+        <w:t>75</w:t>
+      </w:r>
+      <w:r>
+        <w:rPr>
+          <w:rFonts w:ascii="Times New Roman" w:eastAsia="Times New Roman" w:hAnsi="Times New Roman" w:cs="Times New Roman"/>
+          <w:kern w:val="0"/>
+          <w14:ligatures w14:val="none"/>
+        </w:rPr>
+        <w:t>/ (</w:t>
+      </w:r>
+      <w:r>
+        <w:rPr>
+          <w:rFonts w:ascii="Times New Roman" w:eastAsia="Times New Roman" w:hAnsi="Times New Roman" w:cs="Times New Roman"/>
+          <w:kern w:val="0"/>
+          <w14:ligatures w14:val="none"/>
+        </w:rPr>
+        <w:t>75</w:t>
+      </w:r>
+      <w:r>
+        <w:rPr>
+          <w:rFonts w:ascii="Times New Roman" w:eastAsia="Times New Roman" w:hAnsi="Times New Roman" w:cs="Times New Roman"/>
+          <w:kern w:val="0"/>
+          <w14:ligatures w14:val="none"/>
+        </w:rPr>
+        <w:t xml:space="preserve"> + </w:t>
+      </w:r>
+      <w:r>
+        <w:rPr>
+          <w:rFonts w:ascii="Times New Roman" w:eastAsia="Times New Roman" w:hAnsi="Times New Roman" w:cs="Times New Roman"/>
+          <w:kern w:val="0"/>
+          <w14:ligatures w14:val="none"/>
+        </w:rPr>
+        <w:t>10</w:t>
+      </w:r>
+      <w:r>
+        <w:rPr>
+          <w:rFonts w:ascii="Times New Roman" w:eastAsia="Times New Roman" w:hAnsi="Times New Roman" w:cs="Times New Roman"/>
+          <w:kern w:val="0"/>
+          <w14:ligatures w14:val="none"/>
+        </w:rPr>
+        <w:t>) = 0.</w:t>
+      </w:r>
+      <w:r>
+        <w:rPr>
+          <w:rFonts w:ascii="Times New Roman" w:eastAsia="Times New Roman" w:hAnsi="Times New Roman" w:cs="Times New Roman"/>
+          <w:kern w:val="0"/>
+          <w14:ligatures w14:val="none"/>
+        </w:rPr>
+        <w:t>88</w:t>
+      </w:r>
+    </w:p>
+    <w:p>
+      <w:pPr>
+        <w:pStyle w:val="ListParagraph"/>
+        <w:numPr>
+          <w:ilvl w:val="0"/>
+          <w:numId w:val="17"/>
+        </w:numPr>
+      </w:pPr>
+      <w:r>
+        <w:rPr>
+          <w:rFonts w:ascii="Times New Roman" w:eastAsia="Times New Roman" w:hAnsi="Times New Roman" w:cs="Times New Roman"/>
+          <w:kern w:val="0"/>
+          <w14:ligatures w14:val="none"/>
+        </w:rPr>
+        <w:t>What is the b</w:t>
+      </w:r>
+      <w:r>
+        <w:rPr>
+          <w:rFonts w:ascii="Times New Roman" w:eastAsia="Times New Roman" w:hAnsi="Times New Roman" w:cs="Times New Roman"/>
+          <w:kern w:val="0"/>
+          <w14:ligatures w14:val="none"/>
+        </w:rPr>
+        <w:t xml:space="preserve">alance between Precision and Recall </w:t>
+      </w:r>
+      <w:r>
+        <w:rPr>
+          <w:rFonts w:ascii="Times New Roman" w:eastAsia="Times New Roman" w:hAnsi="Times New Roman" w:cs="Times New Roman"/>
+          <w:kern w:val="0"/>
+          <w14:ligatures w14:val="none"/>
+        </w:rPr>
+        <w:t>(</w:t>
+      </w:r>
+      <w:r>
+        <w:rPr>
+          <w:rFonts w:ascii="Times New Roman" w:eastAsia="Times New Roman" w:hAnsi="Times New Roman" w:cs="Times New Roman"/>
+          <w:kern w:val="0"/>
+          <w14:ligatures w14:val="none"/>
+        </w:rPr>
+        <w:t>F1-Score</w:t>
+      </w:r>
+      <w:r>
+        <w:rPr>
+          <w:rFonts w:ascii="Times New Roman" w:eastAsia="Times New Roman" w:hAnsi="Times New Roman" w:cs="Times New Roman"/>
+          <w:kern w:val="0"/>
+          <w14:ligatures w14:val="none"/>
+        </w:rPr>
+        <w:t xml:space="preserve">)? = </w:t>
+      </w:r>
+      <w:r>
+        <w:rPr>
+          <w:rFonts w:ascii="Times New Roman" w:eastAsia="Times New Roman" w:hAnsi="Times New Roman" w:cs="Times New Roman"/>
+          <w:kern w:val="0"/>
+          <w14:ligatures w14:val="none"/>
+        </w:rPr>
+        <w:t>F1 = 2 × (Precision × Recall) / (Precision + Recall)</w:t>
+      </w:r>
+      <w:r>
+        <w:rPr>
+          <w:rFonts w:ascii="Times New Roman" w:eastAsia="Times New Roman" w:hAnsi="Times New Roman" w:cs="Times New Roman"/>
+          <w:kern w:val="0"/>
+          <w14:ligatures w14:val="none"/>
+        </w:rPr>
+        <w:t xml:space="preserve"> = 2 * (0.9</w:t>
+      </w:r>
+      <w:r>
+        <w:rPr>
+          <w:rFonts w:ascii="Times New Roman" w:eastAsia="Times New Roman" w:hAnsi="Times New Roman" w:cs="Times New Roman"/>
+          <w:kern w:val="0"/>
+          <w14:ligatures w14:val="none"/>
+        </w:rPr>
+        <w:t>1</w:t>
+      </w:r>
+      <w:r>
+        <w:rPr>
+          <w:rFonts w:ascii="Times New Roman" w:eastAsia="Times New Roman" w:hAnsi="Times New Roman" w:cs="Times New Roman"/>
+          <w:kern w:val="0"/>
+          <w14:ligatures w14:val="none"/>
+        </w:rPr>
+        <w:t xml:space="preserve"> * 0.</w:t>
+      </w:r>
+      <w:r>
+        <w:rPr>
+          <w:rFonts w:ascii="Times New Roman" w:eastAsia="Times New Roman" w:hAnsi="Times New Roman" w:cs="Times New Roman"/>
+          <w:kern w:val="0"/>
+          <w14:ligatures w14:val="none"/>
+        </w:rPr>
+        <w:t>88</w:t>
+      </w:r>
+      <w:r>
+        <w:rPr>
+          <w:rFonts w:ascii="Times New Roman" w:eastAsia="Times New Roman" w:hAnsi="Times New Roman" w:cs="Times New Roman"/>
+          <w:kern w:val="0"/>
+          <w14:ligatures w14:val="none"/>
+        </w:rPr>
+        <w:t>)/ (0.9</w:t>
+      </w:r>
+      <w:r>
+        <w:rPr>
+          <w:rFonts w:ascii="Times New Roman" w:eastAsia="Times New Roman" w:hAnsi="Times New Roman" w:cs="Times New Roman"/>
+          <w:kern w:val="0"/>
+          <w14:ligatures w14:val="none"/>
+        </w:rPr>
+        <w:t>1</w:t>
+      </w:r>
+      <w:r>
+        <w:rPr>
+          <w:rFonts w:ascii="Times New Roman" w:eastAsia="Times New Roman" w:hAnsi="Times New Roman" w:cs="Times New Roman"/>
+          <w:kern w:val="0"/>
+          <w14:ligatures w14:val="none"/>
+        </w:rPr>
+        <w:t xml:space="preserve"> + 0.</w:t>
+      </w:r>
+      <w:r>
+        <w:rPr>
+          <w:rFonts w:ascii="Times New Roman" w:eastAsia="Times New Roman" w:hAnsi="Times New Roman" w:cs="Times New Roman"/>
+          <w:kern w:val="0"/>
+          <w14:ligatures w14:val="none"/>
+        </w:rPr>
+        <w:t>88</w:t>
+      </w:r>
+      <w:r>
+        <w:rPr>
+          <w:rFonts w:ascii="Times New Roman" w:eastAsia="Times New Roman" w:hAnsi="Times New Roman" w:cs="Times New Roman"/>
+          <w:kern w:val="0"/>
+          <w14:ligatures w14:val="none"/>
+        </w:rPr>
+        <w:t>) = 0.</w:t>
+      </w:r>
+      <w:r>
+        <w:rPr>
+          <w:rFonts w:ascii="Times New Roman" w:eastAsia="Times New Roman" w:hAnsi="Times New Roman" w:cs="Times New Roman"/>
+          <w:kern w:val="0"/>
+          <w14:ligatures w14:val="none"/>
+        </w:rPr>
+        <w:t>90</w:t>
+      </w:r>
+    </w:p>
+    <w:p>
+      <w:pPr>
+        <w:pStyle w:val="ListParagraph"/>
+        <w:numPr>
+          <w:ilvl w:val="0"/>
+          <w:numId w:val="17"/>
+        </w:numPr>
+        <w:rPr>
+          <w:rFonts w:ascii="Times New Roman" w:eastAsia="Times New Roman" w:hAnsi="Times New Roman" w:cs="Times New Roman"/>
+          <w:kern w:val="0"/>
+          <w14:ligatures w14:val="none"/>
+        </w:rPr>
+      </w:pPr>
+      <w:r>
+        <w:t xml:space="preserve">What is the </w:t>
+      </w:r>
+      <w:r>
+        <w:rPr>
+          <w:rFonts w:ascii="Times New Roman" w:eastAsia="Times New Roman" w:hAnsi="Times New Roman" w:cs="Times New Roman"/>
+          <w:kern w:val="0"/>
+          <w14:ligatures w14:val="none"/>
+        </w:rPr>
+        <w:t xml:space="preserve">number of actual samples in each class? </w:t>
+      </w:r>
+      <w:r>
+        <w:rPr>
+          <w:rFonts w:ascii="Times New Roman" w:eastAsia="Times New Roman" w:hAnsi="Times New Roman" w:cs="Times New Roman"/>
+          <w:kern w:val="0"/>
+          <w14:ligatures w14:val="none"/>
+        </w:rPr>
+        <w:t>(</w:t>
+      </w:r>
+      <w:r>
+        <w:t>Support is n</w:t>
+      </w:r>
+      <w:r>
+        <w:t>umber of actual samples in each class.</w:t>
+      </w:r>
+      <w:r>
+        <w:t>)</w:t>
+      </w:r>
+    </w:p>
+    <w:p>
+      <w:pPr>
+        <w:pStyle w:val="ListParagraph"/>
+        <w:ind w:firstLine="720"/>
+      </w:pPr>
+      <w:r>
+        <w:t>85 - did not purchase the course from advertisement.</w:t>
+      </w:r>
+    </w:p>
+    <w:p>
+      <w:pPr>
+        <w:pStyle w:val="ListParagraph"/>
+        <w:ind w:firstLine="720"/>
+      </w:pPr>
+      <w:r>
+        <w:t>49 - did purchase the course from advertisement.</w:t>
+      </w:r>
+    </w:p>
+    <w:p>
+      <w:pPr>
+        <w:pStyle w:val="ListParagraph"/>
+        <w:numPr>
+          <w:ilvl w:val="0"/>
+          <w:numId w:val="17"/>
+        </w:numPr>
+      </w:pPr>
+      <w:r>
+        <w:rPr>
+          <w:b/>
+          <w:bCs/>
+        </w:rPr>
+        <w:t>How many predictions did the model get right (Accuracy)? = (TP + TN) / (TP + TN + FP + FN) = (</w:t>
+      </w:r>
+      <w:r>
+        <w:rPr>
+          <w:b/>
+          <w:bCs/>
+        </w:rPr>
+        <w:t>75</w:t>
+      </w:r>
+      <w:r>
+        <w:rPr>
+          <w:b/>
+          <w:bCs/>
+        </w:rPr>
+        <w:t xml:space="preserve">+ </w:t>
+      </w:r>
+      <w:r>
+        <w:rPr>
+          <w:b/>
+          <w:bCs/>
+        </w:rPr>
+        <w:t>42</w:t>
+      </w:r>
+      <w:r>
+        <w:rPr>
+          <w:b/>
+          <w:bCs/>
+        </w:rPr>
+        <w:t>)/ (</w:t>
+      </w:r>
+      <w:r>
+        <w:rPr>
+          <w:b/>
+          <w:bCs/>
+        </w:rPr>
+        <w:t>75</w:t>
+      </w:r>
+      <w:r>
+        <w:rPr>
+          <w:b/>
+          <w:bCs/>
+        </w:rPr>
+        <w:t xml:space="preserve"> + </w:t>
+      </w:r>
+      <w:r>
+        <w:rPr>
+          <w:b/>
+          <w:bCs/>
+        </w:rPr>
+        <w:t>42</w:t>
+      </w:r>
+      <w:r>
+        <w:rPr>
+          <w:b/>
+          <w:bCs/>
+        </w:rPr>
+        <w:t xml:space="preserve"> + </w:t>
+      </w:r>
+      <w:r>
+        <w:rPr>
+          <w:b/>
+          <w:bCs/>
+        </w:rPr>
+        <w:t xml:space="preserve">7 </w:t>
+      </w:r>
+      <w:r>
+        <w:rPr>
+          <w:b/>
+          <w:bCs/>
+        </w:rPr>
+        <w:t xml:space="preserve">+ </w:t>
+      </w:r>
+      <w:r>
+        <w:rPr>
+          <w:b/>
+          <w:bCs/>
+        </w:rPr>
+        <w:t>10</w:t>
+      </w:r>
+      <w:r>
+        <w:rPr>
+          <w:b/>
+          <w:bCs/>
+        </w:rPr>
+        <w:t>) = 0.</w:t>
+      </w:r>
+      <w:r>
+        <w:rPr>
+          <w:b/>
+          <w:bCs/>
+        </w:rPr>
+        <w:t>87</w:t>
+      </w:r>
+    </w:p>
+    <w:p>
+      <w:pPr>
+        <w:ind w:left="720" w:hanging="360"/>
+        <w:rPr>
+          <w:b/>
+          <w:bCs/>
+          <w:sz w:val="40"/>
+          <w:szCs w:val="40"/>
+        </w:rPr>
+      </w:pPr>
+      <w:r>
+        <w:rPr>
+          <w:b/>
+          <w:bCs/>
+          <w:sz w:val="40"/>
+          <w:szCs w:val="40"/>
+        </w:rPr>
+        <w:t>RF</w:t>
+      </w:r>
+      <w:r>
+        <w:rPr>
+          <w:b/>
+          <w:bCs/>
+          <w:sz w:val="40"/>
+          <w:szCs w:val="40"/>
+        </w:rPr>
+        <w:t>-Grid-Classification</w:t>
+      </w:r>
+    </w:p>
+    <w:p>
+      <w:pPr>
+        <w:pStyle w:val="ListParagraph"/>
+        <w:numPr>
+          <w:ilvl w:val="0"/>
+          <w:numId w:val="18"/>
+        </w:numPr>
+        <w:rPr>
+          <w:rFonts w:ascii="Times New Roman" w:eastAsia="Times New Roman" w:hAnsi="Times New Roman" w:cs="Times New Roman"/>
+          <w:kern w:val="0"/>
+          <w14:ligatures w14:val="none"/>
+        </w:rPr>
+      </w:pPr>
+      <w:r>
+        <w:rPr>
+          <w:rFonts w:ascii="Times New Roman" w:eastAsia="Times New Roman" w:hAnsi="Times New Roman" w:cs="Times New Roman"/>
+          <w:kern w:val="0"/>
+          <w14:ligatures w14:val="none"/>
+        </w:rPr>
+        <w:t xml:space="preserve">When the model says Yes, how often is it correct? (i.e., Precision) = TP/ (TP + FP) = </w:t>
+      </w:r>
+      <w:r>
+        <w:rPr>
+          <w:rFonts w:ascii="Times New Roman" w:eastAsia="Times New Roman" w:hAnsi="Times New Roman" w:cs="Times New Roman"/>
+          <w:kern w:val="0"/>
+          <w14:ligatures w14:val="none"/>
+        </w:rPr>
+        <w:t>7</w:t>
+      </w:r>
+      <w:r>
+        <w:rPr>
+          <w:rFonts w:ascii="Times New Roman" w:eastAsia="Times New Roman" w:hAnsi="Times New Roman" w:cs="Times New Roman"/>
+          <w:kern w:val="0"/>
+          <w14:ligatures w14:val="none"/>
+        </w:rPr>
+        <w:t>9</w:t>
+      </w:r>
+      <w:r>
+        <w:rPr>
+          <w:rFonts w:ascii="Times New Roman" w:eastAsia="Times New Roman" w:hAnsi="Times New Roman" w:cs="Times New Roman"/>
+          <w:kern w:val="0"/>
+          <w14:ligatures w14:val="none"/>
+        </w:rPr>
+        <w:t>/ (</w:t>
+      </w:r>
+      <w:r>
+        <w:rPr>
+          <w:rFonts w:ascii="Times New Roman" w:eastAsia="Times New Roman" w:hAnsi="Times New Roman" w:cs="Times New Roman"/>
+          <w:kern w:val="0"/>
+          <w14:ligatures w14:val="none"/>
+        </w:rPr>
+        <w:t>7</w:t>
+      </w:r>
+      <w:r>
+        <w:rPr>
+          <w:rFonts w:ascii="Times New Roman" w:eastAsia="Times New Roman" w:hAnsi="Times New Roman" w:cs="Times New Roman"/>
+          <w:kern w:val="0"/>
+          <w14:ligatures w14:val="none"/>
+        </w:rPr>
+        <w:t>9</w:t>
+      </w:r>
+      <w:r>
+        <w:rPr>
+          <w:rFonts w:ascii="Times New Roman" w:eastAsia="Times New Roman" w:hAnsi="Times New Roman" w:cs="Times New Roman"/>
+          <w:kern w:val="0"/>
+          <w14:ligatures w14:val="none"/>
+        </w:rPr>
+        <w:t xml:space="preserve"> + </w:t>
+      </w:r>
+      <w:r>
+        <w:rPr>
+          <w:rFonts w:ascii="Times New Roman" w:eastAsia="Times New Roman" w:hAnsi="Times New Roman" w:cs="Times New Roman"/>
+          <w:kern w:val="0"/>
+          <w14:ligatures w14:val="none"/>
+        </w:rPr>
+        <w:t>4</w:t>
+      </w:r>
+      <w:r>
+        <w:rPr>
+          <w:rFonts w:ascii="Times New Roman" w:eastAsia="Times New Roman" w:hAnsi="Times New Roman" w:cs="Times New Roman"/>
+          <w:kern w:val="0"/>
+          <w14:ligatures w14:val="none"/>
+        </w:rPr>
+        <w:t>) = 0.</w:t>
+      </w:r>
+      <w:r>
+        <w:rPr>
+          <w:rFonts w:ascii="Times New Roman" w:eastAsia="Times New Roman" w:hAnsi="Times New Roman" w:cs="Times New Roman"/>
+          <w:kern w:val="0"/>
+          <w14:ligatures w14:val="none"/>
+        </w:rPr>
+        <w:t>95</w:t>
+      </w:r>
+    </w:p>
+    <w:p>
+      <w:pPr>
+        <w:pStyle w:val="ListParagraph"/>
+        <w:numPr>
+          <w:ilvl w:val="0"/>
+          <w:numId w:val="18"/>
+        </w:numPr>
+        <w:rPr>
+          <w:rFonts w:ascii="Times New Roman" w:eastAsia="Times New Roman" w:hAnsi="Times New Roman" w:cs="Times New Roman"/>
+          <w:kern w:val="0"/>
+          <w14:ligatures w14:val="none"/>
+        </w:rPr>
+      </w:pPr>
+      <w:r>
+        <w:rPr>
+          <w:rFonts w:ascii="Times New Roman" w:eastAsia="Times New Roman" w:hAnsi="Times New Roman" w:cs="Times New Roman"/>
+          <w:kern w:val="0"/>
+          <w14:ligatures w14:val="none"/>
+        </w:rPr>
+        <w:t xml:space="preserve">Out of all actual </w:t>
+      </w:r>
+      <w:r>
+        <w:rPr>
+          <w:rFonts w:ascii="Times New Roman" w:eastAsia="Times New Roman" w:hAnsi="Times New Roman" w:cs="Times New Roman"/>
+          <w:kern w:val="0"/>
+          <w14:ligatures w14:val="none"/>
+        </w:rPr>
+        <w:t>Yes</w:t>
+      </w:r>
+      <w:r>
+        <w:rPr>
+          <w:rFonts w:ascii="Times New Roman" w:eastAsia="Times New Roman" w:hAnsi="Times New Roman" w:cs="Times New Roman"/>
+          <w:kern w:val="0"/>
+          <w14:ligatures w14:val="none"/>
+        </w:rPr>
+        <w:t xml:space="preserve">, how many did the model find? </w:t>
+      </w:r>
+      <w:r>
+        <w:rPr>
+          <w:rFonts w:ascii="Times New Roman" w:eastAsia="Times New Roman" w:hAnsi="Times New Roman" w:cs="Times New Roman"/>
+          <w:kern w:val="0"/>
+          <w14:ligatures w14:val="none"/>
+        </w:rPr>
+        <w:t xml:space="preserve">(i.e., </w:t>
+      </w:r>
+      <w:r>
+        <w:rPr>
+          <w:rFonts w:ascii="Times New Roman" w:eastAsia="Times New Roman" w:hAnsi="Times New Roman" w:cs="Times New Roman"/>
+          <w:kern w:val="0"/>
+          <w14:ligatures w14:val="none"/>
+        </w:rPr>
+        <w:t>Recall</w:t>
+      </w:r>
+      <w:r>
+        <w:rPr>
+          <w:rFonts w:ascii="Times New Roman" w:eastAsia="Times New Roman" w:hAnsi="Times New Roman" w:cs="Times New Roman"/>
+          <w:kern w:val="0"/>
+          <w14:ligatures w14:val="none"/>
+        </w:rPr>
+        <w:t>)</w:t>
+      </w:r>
+      <w:r>
+        <w:rPr>
+          <w:rFonts w:ascii="Times New Roman" w:eastAsia="Times New Roman" w:hAnsi="Times New Roman" w:cs="Times New Roman"/>
+          <w:kern w:val="0"/>
+          <w14:ligatures w14:val="none"/>
+        </w:rPr>
+        <w:t>?</w:t>
+      </w:r>
+      <w:r>
+        <w:rPr>
+          <w:rFonts w:ascii="Times New Roman" w:eastAsia="Times New Roman" w:hAnsi="Times New Roman" w:cs="Times New Roman"/>
+          <w:kern w:val="0"/>
+          <w14:ligatures w14:val="none"/>
+        </w:rPr>
+        <w:t xml:space="preserve"> </w:t>
+      </w:r>
+      <w:r>
+        <w:rPr>
+          <w:rFonts w:ascii="Times New Roman" w:eastAsia="Times New Roman" w:hAnsi="Times New Roman" w:cs="Times New Roman"/>
+          <w:kern w:val="0"/>
+          <w14:ligatures w14:val="none"/>
+        </w:rPr>
+        <w:t>= TP / (TP + FN)</w:t>
+      </w:r>
+      <w:r>
+        <w:rPr>
+          <w:rFonts w:ascii="Times New Roman" w:eastAsia="Times New Roman" w:hAnsi="Times New Roman" w:cs="Times New Roman"/>
+          <w:kern w:val="0"/>
+          <w14:ligatures w14:val="none"/>
+        </w:rPr>
+        <w:t xml:space="preserve"> = 7</w:t>
+      </w:r>
+      <w:r>
+        <w:rPr>
+          <w:rFonts w:ascii="Times New Roman" w:eastAsia="Times New Roman" w:hAnsi="Times New Roman" w:cs="Times New Roman"/>
+          <w:kern w:val="0"/>
+          <w14:ligatures w14:val="none"/>
+        </w:rPr>
+        <w:t>9</w:t>
+      </w:r>
+      <w:r>
+        <w:rPr>
+          <w:rFonts w:ascii="Times New Roman" w:eastAsia="Times New Roman" w:hAnsi="Times New Roman" w:cs="Times New Roman"/>
+          <w:kern w:val="0"/>
+          <w14:ligatures w14:val="none"/>
+        </w:rPr>
+        <w:t>/ (7</w:t>
+      </w:r>
+      <w:r>
+        <w:rPr>
+          <w:rFonts w:ascii="Times New Roman" w:eastAsia="Times New Roman" w:hAnsi="Times New Roman" w:cs="Times New Roman"/>
+          <w:kern w:val="0"/>
+          <w14:ligatures w14:val="none"/>
+        </w:rPr>
+        <w:t>9</w:t>
+      </w:r>
+      <w:r>
+        <w:rPr>
+          <w:rFonts w:ascii="Times New Roman" w:eastAsia="Times New Roman" w:hAnsi="Times New Roman" w:cs="Times New Roman"/>
+          <w:kern w:val="0"/>
+          <w14:ligatures w14:val="none"/>
+        </w:rPr>
+        <w:t xml:space="preserve"> + </w:t>
+      </w:r>
+      <w:r>
+        <w:rPr>
+          <w:rFonts w:ascii="Times New Roman" w:eastAsia="Times New Roman" w:hAnsi="Times New Roman" w:cs="Times New Roman"/>
+          <w:kern w:val="0"/>
+          <w14:ligatures w14:val="none"/>
+        </w:rPr>
+        <w:t>6</w:t>
+      </w:r>
+      <w:r>
+        <w:rPr>
+          <w:rFonts w:ascii="Times New Roman" w:eastAsia="Times New Roman" w:hAnsi="Times New Roman" w:cs="Times New Roman"/>
+          <w:kern w:val="0"/>
+          <w14:ligatures w14:val="none"/>
+        </w:rPr>
+        <w:t>) = 0.</w:t>
+      </w:r>
+      <w:r>
+        <w:rPr>
+          <w:rFonts w:ascii="Times New Roman" w:eastAsia="Times New Roman" w:hAnsi="Times New Roman" w:cs="Times New Roman"/>
+          <w:kern w:val="0"/>
+          <w14:ligatures w14:val="none"/>
+        </w:rPr>
+        <w:t>93</w:t>
+      </w:r>
+    </w:p>
+    <w:p>
+      <w:pPr>
+        <w:pStyle w:val="ListParagraph"/>
+        <w:numPr>
+          <w:ilvl w:val="0"/>
+          <w:numId w:val="18"/>
+        </w:numPr>
+      </w:pPr>
+      <w:r>
+        <w:rPr>
+          <w:rFonts w:ascii="Times New Roman" w:eastAsia="Times New Roman" w:hAnsi="Times New Roman" w:cs="Times New Roman"/>
+          <w:kern w:val="0"/>
+          <w14:ligatures w14:val="none"/>
+        </w:rPr>
+        <w:t>What is the b</w:t>
+      </w:r>
+      <w:r>
+        <w:rPr>
+          <w:rFonts w:ascii="Times New Roman" w:eastAsia="Times New Roman" w:hAnsi="Times New Roman" w:cs="Times New Roman"/>
+          <w:kern w:val="0"/>
+          <w14:ligatures w14:val="none"/>
+        </w:rPr>
+        <w:t xml:space="preserve">alance between Precision and Recall </w:t>
+      </w:r>
+      <w:r>
+        <w:rPr>
+          <w:rFonts w:ascii="Times New Roman" w:eastAsia="Times New Roman" w:hAnsi="Times New Roman" w:cs="Times New Roman"/>
+          <w:kern w:val="0"/>
+          <w14:ligatures w14:val="none"/>
+        </w:rPr>
+        <w:t>(</w:t>
+      </w:r>
+      <w:r>
+        <w:rPr>
+          <w:rFonts w:ascii="Times New Roman" w:eastAsia="Times New Roman" w:hAnsi="Times New Roman" w:cs="Times New Roman"/>
+          <w:kern w:val="0"/>
+          <w14:ligatures w14:val="none"/>
+        </w:rPr>
+        <w:t>F1-Score</w:t>
+      </w:r>
+      <w:r>
+        <w:rPr>
+          <w:rFonts w:ascii="Times New Roman" w:eastAsia="Times New Roman" w:hAnsi="Times New Roman" w:cs="Times New Roman"/>
+          <w:kern w:val="0"/>
+          <w14:ligatures w14:val="none"/>
+        </w:rPr>
+        <w:t xml:space="preserve">)? = </w:t>
+      </w:r>
+      <w:r>
+        <w:rPr>
+          <w:rFonts w:ascii="Times New Roman" w:eastAsia="Times New Roman" w:hAnsi="Times New Roman" w:cs="Times New Roman"/>
+          <w:kern w:val="0"/>
+          <w14:ligatures w14:val="none"/>
+        </w:rPr>
+        <w:t>F1 = 2 × (Precision × Recall) / (Precision + Recall)</w:t>
+      </w:r>
+      <w:r>
+        <w:rPr>
+          <w:rFonts w:ascii="Times New Roman" w:eastAsia="Times New Roman" w:hAnsi="Times New Roman" w:cs="Times New Roman"/>
+          <w:kern w:val="0"/>
+          <w14:ligatures w14:val="none"/>
+        </w:rPr>
+        <w:t xml:space="preserve"> = 2 * (0.9</w:t>
+      </w:r>
+      <w:r>
+        <w:rPr>
+          <w:rFonts w:ascii="Times New Roman" w:eastAsia="Times New Roman" w:hAnsi="Times New Roman" w:cs="Times New Roman"/>
+          <w:kern w:val="0"/>
+          <w14:ligatures w14:val="none"/>
+        </w:rPr>
+        <w:t>5</w:t>
+      </w:r>
+      <w:r>
+        <w:rPr>
+          <w:rFonts w:ascii="Times New Roman" w:eastAsia="Times New Roman" w:hAnsi="Times New Roman" w:cs="Times New Roman"/>
+          <w:kern w:val="0"/>
+          <w14:ligatures w14:val="none"/>
+        </w:rPr>
+        <w:t xml:space="preserve"> * 0.</w:t>
+      </w:r>
+      <w:r>
+        <w:rPr>
+          <w:rFonts w:ascii="Times New Roman" w:eastAsia="Times New Roman" w:hAnsi="Times New Roman" w:cs="Times New Roman"/>
+          <w:kern w:val="0"/>
+          <w14:ligatures w14:val="none"/>
+        </w:rPr>
+        <w:t>93</w:t>
+      </w:r>
+      <w:r>
+        <w:rPr>
+          <w:rFonts w:ascii="Times New Roman" w:eastAsia="Times New Roman" w:hAnsi="Times New Roman" w:cs="Times New Roman"/>
+          <w:kern w:val="0"/>
+          <w14:ligatures w14:val="none"/>
+        </w:rPr>
+        <w:t>)/ (0.9</w:t>
+      </w:r>
+      <w:r>
+        <w:rPr>
+          <w:rFonts w:ascii="Times New Roman" w:eastAsia="Times New Roman" w:hAnsi="Times New Roman" w:cs="Times New Roman"/>
+          <w:kern w:val="0"/>
+          <w14:ligatures w14:val="none"/>
+        </w:rPr>
+        <w:t>5</w:t>
+      </w:r>
+      <w:r>
+        <w:rPr>
+          <w:rFonts w:ascii="Times New Roman" w:eastAsia="Times New Roman" w:hAnsi="Times New Roman" w:cs="Times New Roman"/>
+          <w:kern w:val="0"/>
+          <w14:ligatures w14:val="none"/>
+        </w:rPr>
+        <w:t xml:space="preserve"> + 0.</w:t>
+      </w:r>
+      <w:r>
+        <w:rPr>
+          <w:rFonts w:ascii="Times New Roman" w:eastAsia="Times New Roman" w:hAnsi="Times New Roman" w:cs="Times New Roman"/>
+          <w:kern w:val="0"/>
+          <w14:ligatures w14:val="none"/>
+        </w:rPr>
+        <w:t>93</w:t>
+      </w:r>
+      <w:r>
+        <w:rPr>
+          <w:rFonts w:ascii="Times New Roman" w:eastAsia="Times New Roman" w:hAnsi="Times New Roman" w:cs="Times New Roman"/>
+          <w:kern w:val="0"/>
+          <w14:ligatures w14:val="none"/>
+        </w:rPr>
+        <w:t>) = 0.</w:t>
+      </w:r>
+      <w:r>
+        <w:rPr>
+          <w:rFonts w:ascii="Times New Roman" w:eastAsia="Times New Roman" w:hAnsi="Times New Roman" w:cs="Times New Roman"/>
+          <w:kern w:val="0"/>
+          <w14:ligatures w14:val="none"/>
+        </w:rPr>
+        <w:t>94</w:t>
+      </w:r>
+    </w:p>
+    <w:p>
+      <w:pPr>
+        <w:pStyle w:val="ListParagraph"/>
+        <w:numPr>
+          <w:ilvl w:val="0"/>
+          <w:numId w:val="18"/>
+        </w:numPr>
+        <w:rPr>
+          <w:rFonts w:ascii="Times New Roman" w:eastAsia="Times New Roman" w:hAnsi="Times New Roman" w:cs="Times New Roman"/>
+          <w:kern w:val="0"/>
+          <w14:ligatures w14:val="none"/>
+        </w:rPr>
+      </w:pPr>
+      <w:r>
+        <w:t xml:space="preserve">What is the </w:t>
+      </w:r>
+      <w:r>
+        <w:rPr>
+          <w:rFonts w:ascii="Times New Roman" w:eastAsia="Times New Roman" w:hAnsi="Times New Roman" w:cs="Times New Roman"/>
+          <w:kern w:val="0"/>
+          <w14:ligatures w14:val="none"/>
+        </w:rPr>
+        <w:t xml:space="preserve">number of actual samples in each class? </w:t>
+      </w:r>
+      <w:r>
+        <w:rPr>
+          <w:rFonts w:ascii="Times New Roman" w:eastAsia="Times New Roman" w:hAnsi="Times New Roman" w:cs="Times New Roman"/>
+          <w:kern w:val="0"/>
+          <w14:ligatures w14:val="none"/>
+        </w:rPr>
+        <w:t>(</w:t>
+      </w:r>
+      <w:r>
+        <w:t>Support is n</w:t>
+      </w:r>
+      <w:r>
+        <w:t>umber of actual samples in each class.</w:t>
+      </w:r>
+      <w:r>
+        <w:t>)</w:t>
+      </w:r>
+    </w:p>
+    <w:p>
+      <w:pPr>
+        <w:pStyle w:val="ListParagraph"/>
+        <w:ind w:firstLine="720"/>
+      </w:pPr>
+      <w:r>
+        <w:t>85 - did not purchase the course from advertisement.</w:t>
+      </w:r>
+    </w:p>
+    <w:p>
+      <w:pPr>
+        <w:pStyle w:val="ListParagraph"/>
+        <w:ind w:firstLine="720"/>
+      </w:pPr>
+      <w:r>
+        <w:t>49 - did purchase the course from advertisement.</w:t>
+      </w:r>
+    </w:p>
+    <w:p>
+      <w:pPr>
+        <w:pStyle w:val="ListParagraph"/>
+        <w:numPr>
+          <w:ilvl w:val="0"/>
+          <w:numId w:val="18"/>
+        </w:numPr>
+      </w:pPr>
+      <w:r>
+        <w:rPr>
+          <w:b/>
+          <w:bCs/>
+        </w:rPr>
+        <w:t>How many predictions did the model get right (Accuracy)? = (TP + TN) / (TP + TN + FP + FN) = (7</w:t>
+      </w:r>
+      <w:r>
+        <w:rPr>
+          <w:b/>
+          <w:bCs/>
+        </w:rPr>
+        <w:t>9</w:t>
+      </w:r>
+      <w:r>
+        <w:rPr>
+          <w:b/>
+          <w:bCs/>
+        </w:rPr>
+        <w:t>+ 4</w:t>
+      </w:r>
+      <w:r>
+        <w:rPr>
+          <w:b/>
+          <w:bCs/>
+        </w:rPr>
+        <w:t>5</w:t>
+      </w:r>
+      <w:r>
+        <w:rPr>
+          <w:b/>
+          <w:bCs/>
+        </w:rPr>
+        <w:t>)/ (7</w:t>
+      </w:r>
+      <w:r>
+        <w:rPr>
+          <w:b/>
+          <w:bCs/>
+        </w:rPr>
+        <w:t>9</w:t>
+      </w:r>
+      <w:r>
+        <w:rPr>
+          <w:b/>
+          <w:bCs/>
+        </w:rPr>
+        <w:t xml:space="preserve"> + 4</w:t>
+      </w:r>
+      <w:r>
+        <w:rPr>
+          <w:b/>
+          <w:bCs/>
+        </w:rPr>
+        <w:t>5</w:t>
+      </w:r>
+      <w:r>
+        <w:rPr>
+          <w:b/>
+          <w:bCs/>
+        </w:rPr>
+        <w:t xml:space="preserve"> + </w:t>
+      </w:r>
+      <w:r>
+        <w:rPr>
+          <w:b/>
+          <w:bCs/>
+        </w:rPr>
+        <w:t>4</w:t>
+      </w:r>
+      <w:r>
+        <w:rPr>
+          <w:b/>
+          <w:bCs/>
+        </w:rPr>
+        <w:t xml:space="preserve"> + </w:t>
+      </w:r>
+      <w:r>
+        <w:rPr>
+          <w:b/>
+          <w:bCs/>
+        </w:rPr>
+        <w:t>6</w:t>
+      </w:r>
+      <w:r>
+        <w:rPr>
+          <w:b/>
+          <w:bCs/>
+        </w:rPr>
+        <w:t>) = 0.</w:t>
+      </w:r>
+      <w:r>
+        <w:rPr>
+          <w:b/>
+          <w:bCs/>
+        </w:rPr>
+        <w:t>93</w:t>
+      </w:r>
+    </w:p>
+    <w:p>
+      <w:r>
+        <w:t xml:space="preserve"> </w:t>
+      </w:r>
+    </w:p>
+    <w:p/>
     <w:sectPr>
       <w:pgSz w:w="12240" w:h="15840"/>
       <w:pgMar w:top="1440" w:right="1440" w:bottom="1440" w:left="1440" w:header="720" w:footer="720" w:gutter="0"/>
@@ -2420,7 +6148,7 @@
 </file>
 
 <file path=word/numbering.xml><?xml version="1.0" encoding="utf-8"?>
-<w:numbering xmlns:wpc="http://schemas.microsoft.com/office/word/2010/wordprocessingCanvas" xmlns:cx="http://schemas.microsoft.com/office/drawing/2014/chartex" xmlns:cx1="http://schemas.microsoft.com/office/drawing/2015/9/8/chartex" xmlns:cx2="http://schemas.microsoft.com/office/drawing/2015/10/21/chartex" xmlns:cx3="http://schemas.microsoft.com/office/drawing/2016/5/9/chartex" xmlns:cx4="http://schemas.microsoft.com/office/drawing/2016/5/10/chartex" xmlns:cx5="http://schemas.microsoft.com/office/drawing/2016/5/11/chartex" xmlns:cx6="http://schemas.microsoft.com/office/drawing/2016/5/12/chartex" xmlns:cx7="http://schemas.microsoft.com/office/drawing/2016/5/13/chartex" xmlns:cx8="http://schemas.microsoft.com/office/drawing/2016/5/14/chartex" xmlns:mc="http://schemas.openxmlformats.org/markup-compatibility/2006" xmlns:aink="http://schemas.microsoft.com/office/drawing/2016/ink" xmlns:am3d="http://schemas.microsoft.com/office/drawing/2017/model3d" xmlns:o="urn:schemas-microsoft-com:office:office" xmlns:oel="http://schemas.microsoft.com/office/2019/extlst" xmlns:r="http://schemas.openxmlformats.org/officeDocument/2006/relationships" xmlns:m="http://schemas.openxmlformats.org/officeDocument/2006/math" xmlns:v="urn:schemas-microsoft-com:vml" xmlns:wp14="http://schemas.microsoft.com/office/word/2010/wordprocessingDrawing" xmlns:wp="http://schemas.openxmlformats.org/drawingml/2006/wordprocessingDrawing" xmlns:w10="urn:schemas-microsoft-com:office:word" xmlns:w="http://schemas.openxmlformats.org/wordprocessingml/2006/main" xmlns:w14="http://schemas.microsoft.com/office/word/2010/wordml" xmlns:w15="http://schemas.microsoft.com/office/word/2012/wordml" xmlns:w16cei="http://schemas.microsoft.com/office/word/2026/wordml/cei" xmlns:w16cex="http://schemas.microsoft.com/office/word/2018/wordml/cex" xmlns:w16cid="http://schemas.microsoft.com/office/word/2016/wordml/cid" xmlns:w16="http://schemas.microsoft.com/office/word/2018/wordml" xmlns:w16du="http://schemas.microsoft.com/office/word/2023/wordml/word16du" xmlns:w16sdtdh="http://schemas.microsoft.com/office/word/2020/wordml/sdtdatahash" xmlns:w16sdtfl="http://schemas.microsoft.com/office/word/2024/wordml/sdtformatlock" xmlns:w16se="http://schemas.microsoft.com/office/word/2015/wordml/symex" xmlns:wpg="http://schemas.microsoft.com/office/word/2010/wordprocessingGroup" xmlns:wpi="http://schemas.microsoft.com/office/word/2010/wordprocessingInk" xmlns:wne="http://schemas.microsoft.com/office/word/2006/wordml" xmlns:wps="http://schemas.microsoft.com/office/word/2010/wordprocessingShape" mc:Ignorable="w14 w15 w16se w16cid w16 w16cex w16sdtdh w16sdtfl w16du wp14">
+<w:numbering xmlns:wpc="http://schemas.microsoft.com/office/word/2010/wordprocessingCanvas" xmlns:cx="http://schemas.microsoft.com/office/drawing/2014/chartex" xmlns:cx1="http://schemas.microsoft.com/office/drawing/2015/9/8/chartex" xmlns:cx2="http://schemas.microsoft.com/office/drawing/2015/10/21/chartex" xmlns:cx3="http://schemas.microsoft.com/office/drawing/2016/5/9/chartex" xmlns:cx4="http://schemas.microsoft.com/office/drawing/2016/5/10/chartex" xmlns:cx5="http://schemas.microsoft.com/office/drawing/2016/5/11/chartex" xmlns:cx6="http://schemas.microsoft.com/office/drawing/2016/5/12/chartex" xmlns:cx7="http://schemas.microsoft.com/office/drawing/2016/5/13/chartex" xmlns:cx8="http://schemas.microsoft.com/office/drawing/2016/5/14/chartex" xmlns:mc="http://schemas.openxmlformats.org/markup-compatibility/2006" xmlns:aink="http://schemas.microsoft.com/office/drawing/2016/ink" xmlns:am3d="http://schemas.microsoft.com/office/drawing/2017/model3d" xmlns:o="urn:schemas-microsoft-com:office:office" xmlns:oel="http://schemas.microsoft.com/office/2019/extlst" xmlns:r="http://schemas.openxmlformats.org/officeDocument/2006/relationships" xmlns:m="http://schemas.openxmlformats.org/officeDocument/2006/math" xmlns:v="urn:schemas-microsoft-com:vml" xmlns:wp14="http://schemas.microsoft.com/office/word/2010/wordprocessingDrawing" xmlns:wp="http://schemas.openxmlformats.org/drawingml/2006/wordprocessingDrawing" xmlns:w10="urn:schemas-microsoft-com:office:word" xmlns:w="http://schemas.openxmlformats.org/wordprocessingml/2006/main" xmlns:w14="http://schemas.microsoft.com/office/word/2010/wordml" xmlns:w15="http://schemas.microsoft.com/office/word/2012/wordml" xmlns:w16cex="http://schemas.microsoft.com/office/word/2018/wordml/cex" xmlns:w16cid="http://schemas.microsoft.com/office/word/2016/wordml/cid" xmlns:w16="http://schemas.microsoft.com/office/word/2018/wordml" xmlns:w16du="http://schemas.microsoft.com/office/word/2023/wordml/word16du" xmlns:w16sdtdh="http://schemas.microsoft.com/office/word/2020/wordml/sdtdatahash" xmlns:w16sdtfl="http://schemas.microsoft.com/office/word/2024/wordml/sdtformatlock" xmlns:w16se="http://schemas.microsoft.com/office/word/2015/wordml/symex" xmlns:wpg="http://schemas.microsoft.com/office/word/2010/wordprocessingGroup" xmlns:wpi="http://schemas.microsoft.com/office/word/2010/wordprocessingInk" xmlns:wne="http://schemas.microsoft.com/office/word/2006/wordml" xmlns:wps="http://schemas.microsoft.com/office/word/2010/wordprocessingShape" mc:Ignorable="w14 w15 w16se w16cid w16 w16cex w16sdtdh w16sdtfl w16du wp14">
   <w:abstractNum w:abstractNumId="0" w15:restartNumberingAfterBreak="0">
     <w:nsid w:val="078703DC"/>
     <w:multiLevelType w:val="multilevel"/>
@@ -2838,6 +6566,184 @@
     </w:lvl>
   </w:abstractNum>
   <w:abstractNum w:abstractNumId="4" w15:restartNumberingAfterBreak="0">
+    <w:nsid w:val="23133BB3"/>
+    <w:multiLevelType w:val="hybridMultilevel"/>
+    <w:tmpl w:val="2B1AD4A2"/>
+    <w:lvl w:ilvl="0" w:tplc="FFFFFFFF">
+      <w:start w:val="1"/>
+      <w:numFmt w:val="decimal"/>
+      <w:lvlText w:val="%1."/>
+      <w:lvlJc w:val="left"/>
+      <w:pPr>
+        <w:ind w:left="1440" w:hanging="360"/>
+      </w:pPr>
+      <w:rPr>
+        <w:rFonts w:hint="default"/>
+      </w:rPr>
+    </w:lvl>
+    <w:lvl w:ilvl="1" w:tplc="FFFFFFFF" w:tentative="1">
+      <w:start w:val="1"/>
+      <w:numFmt w:val="lowerLetter"/>
+      <w:lvlText w:val="%2."/>
+      <w:lvlJc w:val="left"/>
+      <w:pPr>
+        <w:ind w:left="2160" w:hanging="360"/>
+      </w:pPr>
+    </w:lvl>
+    <w:lvl w:ilvl="2" w:tplc="FFFFFFFF" w:tentative="1">
+      <w:start w:val="1"/>
+      <w:numFmt w:val="lowerRoman"/>
+      <w:lvlText w:val="%3."/>
+      <w:lvlJc w:val="right"/>
+      <w:pPr>
+        <w:ind w:left="2880" w:hanging="180"/>
+      </w:pPr>
+    </w:lvl>
+    <w:lvl w:ilvl="3" w:tplc="FFFFFFFF" w:tentative="1">
+      <w:start w:val="1"/>
+      <w:numFmt w:val="decimal"/>
+      <w:lvlText w:val="%4."/>
+      <w:lvlJc w:val="left"/>
+      <w:pPr>
+        <w:ind w:left="3600" w:hanging="360"/>
+      </w:pPr>
+    </w:lvl>
+    <w:lvl w:ilvl="4" w:tplc="FFFFFFFF" w:tentative="1">
+      <w:start w:val="1"/>
+      <w:numFmt w:val="lowerLetter"/>
+      <w:lvlText w:val="%5."/>
+      <w:lvlJc w:val="left"/>
+      <w:pPr>
+        <w:ind w:left="4320" w:hanging="360"/>
+      </w:pPr>
+    </w:lvl>
+    <w:lvl w:ilvl="5" w:tplc="FFFFFFFF" w:tentative="1">
+      <w:start w:val="1"/>
+      <w:numFmt w:val="lowerRoman"/>
+      <w:lvlText w:val="%6."/>
+      <w:lvlJc w:val="right"/>
+      <w:pPr>
+        <w:ind w:left="5040" w:hanging="180"/>
+      </w:pPr>
+    </w:lvl>
+    <w:lvl w:ilvl="6" w:tplc="FFFFFFFF" w:tentative="1">
+      <w:start w:val="1"/>
+      <w:numFmt w:val="decimal"/>
+      <w:lvlText w:val="%7."/>
+      <w:lvlJc w:val="left"/>
+      <w:pPr>
+        <w:ind w:left="5760" w:hanging="360"/>
+      </w:pPr>
+    </w:lvl>
+    <w:lvl w:ilvl="7" w:tplc="FFFFFFFF" w:tentative="1">
+      <w:start w:val="1"/>
+      <w:numFmt w:val="lowerLetter"/>
+      <w:lvlText w:val="%8."/>
+      <w:lvlJc w:val="left"/>
+      <w:pPr>
+        <w:ind w:left="6480" w:hanging="360"/>
+      </w:pPr>
+    </w:lvl>
+    <w:lvl w:ilvl="8" w:tplc="FFFFFFFF" w:tentative="1">
+      <w:start w:val="1"/>
+      <w:numFmt w:val="lowerRoman"/>
+      <w:lvlText w:val="%9."/>
+      <w:lvlJc w:val="right"/>
+      <w:pPr>
+        <w:ind w:left="7200" w:hanging="180"/>
+      </w:pPr>
+    </w:lvl>
+  </w:abstractNum>
+  <w:abstractNum w:abstractNumId="5" w15:restartNumberingAfterBreak="0">
+    <w:nsid w:val="29543250"/>
+    <w:multiLevelType w:val="hybridMultilevel"/>
+    <w:tmpl w:val="2B1AD4A2"/>
+    <w:lvl w:ilvl="0" w:tplc="FFFFFFFF">
+      <w:start w:val="1"/>
+      <w:numFmt w:val="decimal"/>
+      <w:lvlText w:val="%1."/>
+      <w:lvlJc w:val="left"/>
+      <w:pPr>
+        <w:ind w:left="1440" w:hanging="360"/>
+      </w:pPr>
+      <w:rPr>
+        <w:rFonts w:hint="default"/>
+      </w:rPr>
+    </w:lvl>
+    <w:lvl w:ilvl="1" w:tplc="FFFFFFFF" w:tentative="1">
+      <w:start w:val="1"/>
+      <w:numFmt w:val="lowerLetter"/>
+      <w:lvlText w:val="%2."/>
+      <w:lvlJc w:val="left"/>
+      <w:pPr>
+        <w:ind w:left="2160" w:hanging="360"/>
+      </w:pPr>
+    </w:lvl>
+    <w:lvl w:ilvl="2" w:tplc="FFFFFFFF" w:tentative="1">
+      <w:start w:val="1"/>
+      <w:numFmt w:val="lowerRoman"/>
+      <w:lvlText w:val="%3."/>
+      <w:lvlJc w:val="right"/>
+      <w:pPr>
+        <w:ind w:left="2880" w:hanging="180"/>
+      </w:pPr>
+    </w:lvl>
+    <w:lvl w:ilvl="3" w:tplc="FFFFFFFF" w:tentative="1">
+      <w:start w:val="1"/>
+      <w:numFmt w:val="decimal"/>
+      <w:lvlText w:val="%4."/>
+      <w:lvlJc w:val="left"/>
+      <w:pPr>
+        <w:ind w:left="3600" w:hanging="360"/>
+      </w:pPr>
+    </w:lvl>
+    <w:lvl w:ilvl="4" w:tplc="FFFFFFFF" w:tentative="1">
+      <w:start w:val="1"/>
+      <w:numFmt w:val="lowerLetter"/>
+      <w:lvlText w:val="%5."/>
+      <w:lvlJc w:val="left"/>
+      <w:pPr>
+        <w:ind w:left="4320" w:hanging="360"/>
+      </w:pPr>
+    </w:lvl>
+    <w:lvl w:ilvl="5" w:tplc="FFFFFFFF" w:tentative="1">
+      <w:start w:val="1"/>
+      <w:numFmt w:val="lowerRoman"/>
+      <w:lvlText w:val="%6."/>
+      <w:lvlJc w:val="right"/>
+      <w:pPr>
+        <w:ind w:left="5040" w:hanging="180"/>
+      </w:pPr>
+    </w:lvl>
+    <w:lvl w:ilvl="6" w:tplc="FFFFFFFF" w:tentative="1">
+      <w:start w:val="1"/>
+      <w:numFmt w:val="decimal"/>
+      <w:lvlText w:val="%7."/>
+      <w:lvlJc w:val="left"/>
+      <w:pPr>
+        <w:ind w:left="5760" w:hanging="360"/>
+      </w:pPr>
+    </w:lvl>
+    <w:lvl w:ilvl="7" w:tplc="FFFFFFFF" w:tentative="1">
+      <w:start w:val="1"/>
+      <w:numFmt w:val="lowerLetter"/>
+      <w:lvlText w:val="%8."/>
+      <w:lvlJc w:val="left"/>
+      <w:pPr>
+        <w:ind w:left="6480" w:hanging="360"/>
+      </w:pPr>
+    </w:lvl>
+    <w:lvl w:ilvl="8" w:tplc="FFFFFFFF" w:tentative="1">
+      <w:start w:val="1"/>
+      <w:numFmt w:val="lowerRoman"/>
+      <w:lvlText w:val="%9."/>
+      <w:lvlJc w:val="right"/>
+      <w:pPr>
+        <w:ind w:left="7200" w:hanging="180"/>
+      </w:pPr>
+    </w:lvl>
+  </w:abstractNum>
+  <w:abstractNum w:abstractNumId="6" w15:restartNumberingAfterBreak="0">
     <w:nsid w:val="29891939"/>
     <w:multiLevelType w:val="hybridMultilevel"/>
     <w:tmpl w:val="FF10A416"/>
@@ -2926,7 +6832,96 @@
       </w:pPr>
     </w:lvl>
   </w:abstractNum>
-  <w:abstractNum w:abstractNumId="5" w15:restartNumberingAfterBreak="0">
+  <w:abstractNum w:abstractNumId="7" w15:restartNumberingAfterBreak="0">
+    <w:nsid w:val="2C6975D7"/>
+    <w:multiLevelType w:val="hybridMultilevel"/>
+    <w:tmpl w:val="2B1AD4A2"/>
+    <w:lvl w:ilvl="0" w:tplc="FFFFFFFF">
+      <w:start w:val="1"/>
+      <w:numFmt w:val="decimal"/>
+      <w:lvlText w:val="%1."/>
+      <w:lvlJc w:val="left"/>
+      <w:pPr>
+        <w:ind w:left="1440" w:hanging="360"/>
+      </w:pPr>
+      <w:rPr>
+        <w:rFonts w:hint="default"/>
+      </w:rPr>
+    </w:lvl>
+    <w:lvl w:ilvl="1" w:tplc="FFFFFFFF" w:tentative="1">
+      <w:start w:val="1"/>
+      <w:numFmt w:val="lowerLetter"/>
+      <w:lvlText w:val="%2."/>
+      <w:lvlJc w:val="left"/>
+      <w:pPr>
+        <w:ind w:left="2160" w:hanging="360"/>
+      </w:pPr>
+    </w:lvl>
+    <w:lvl w:ilvl="2" w:tplc="FFFFFFFF" w:tentative="1">
+      <w:start w:val="1"/>
+      <w:numFmt w:val="lowerRoman"/>
+      <w:lvlText w:val="%3."/>
+      <w:lvlJc w:val="right"/>
+      <w:pPr>
+        <w:ind w:left="2880" w:hanging="180"/>
+      </w:pPr>
+    </w:lvl>
+    <w:lvl w:ilvl="3" w:tplc="FFFFFFFF" w:tentative="1">
+      <w:start w:val="1"/>
+      <w:numFmt w:val="decimal"/>
+      <w:lvlText w:val="%4."/>
+      <w:lvlJc w:val="left"/>
+      <w:pPr>
+        <w:ind w:left="3600" w:hanging="360"/>
+      </w:pPr>
+    </w:lvl>
+    <w:lvl w:ilvl="4" w:tplc="FFFFFFFF" w:tentative="1">
+      <w:start w:val="1"/>
+      <w:numFmt w:val="lowerLetter"/>
+      <w:lvlText w:val="%5."/>
+      <w:lvlJc w:val="left"/>
+      <w:pPr>
+        <w:ind w:left="4320" w:hanging="360"/>
+      </w:pPr>
+    </w:lvl>
+    <w:lvl w:ilvl="5" w:tplc="FFFFFFFF" w:tentative="1">
+      <w:start w:val="1"/>
+      <w:numFmt w:val="lowerRoman"/>
+      <w:lvlText w:val="%6."/>
+      <w:lvlJc w:val="right"/>
+      <w:pPr>
+        <w:ind w:left="5040" w:hanging="180"/>
+      </w:pPr>
+    </w:lvl>
+    <w:lvl w:ilvl="6" w:tplc="FFFFFFFF" w:tentative="1">
+      <w:start w:val="1"/>
+      <w:numFmt w:val="decimal"/>
+      <w:lvlText w:val="%7."/>
+      <w:lvlJc w:val="left"/>
+      <w:pPr>
+        <w:ind w:left="5760" w:hanging="360"/>
+      </w:pPr>
+    </w:lvl>
+    <w:lvl w:ilvl="7" w:tplc="FFFFFFFF" w:tentative="1">
+      <w:start w:val="1"/>
+      <w:numFmt w:val="lowerLetter"/>
+      <w:lvlText w:val="%8."/>
+      <w:lvlJc w:val="left"/>
+      <w:pPr>
+        <w:ind w:left="6480" w:hanging="360"/>
+      </w:pPr>
+    </w:lvl>
+    <w:lvl w:ilvl="8" w:tplc="FFFFFFFF" w:tentative="1">
+      <w:start w:val="1"/>
+      <w:numFmt w:val="lowerRoman"/>
+      <w:lvlText w:val="%9."/>
+      <w:lvlJc w:val="right"/>
+      <w:pPr>
+        <w:ind w:left="7200" w:hanging="180"/>
+      </w:pPr>
+    </w:lvl>
+  </w:abstractNum>
+  <w:abstractNum w:abstractNumId="8" w15:restartNumberingAfterBreak="0">
     <w:nsid w:val="34E505F9"/>
     <w:multiLevelType w:val="hybridMultilevel"/>
     <w:tmpl w:val="5852CB46"/>
@@ -3015,7 +7010,96 @@
       </w:pPr>
     </w:lvl>
   </w:abstractNum>
-  <w:abstractNum w:abstractNumId="6" w15:restartNumberingAfterBreak="0">
+  <w:abstractNum w:abstractNumId="9" w15:restartNumberingAfterBreak="0">
+    <w:nsid w:val="381C4C08"/>
+    <w:multiLevelType w:val="hybridMultilevel"/>
+    <w:tmpl w:val="2B1AD4A2"/>
+    <w:lvl w:ilvl="0" w:tplc="FFFFFFFF">
+      <w:start w:val="1"/>
+      <w:numFmt w:val="decimal"/>
+      <w:lvlText w:val="%1."/>
+      <w:lvlJc w:val="left"/>
+      <w:pPr>
+        <w:ind w:left="1440" w:hanging="360"/>
+      </w:pPr>
+      <w:rPr>
+        <w:rFonts w:hint="default"/>
+      </w:rPr>
+    </w:lvl>
+    <w:lvl w:ilvl="1" w:tplc="FFFFFFFF" w:tentative="1">
+      <w:start w:val="1"/>
+      <w:numFmt w:val="lowerLetter"/>
+      <w:lvlText w:val="%2."/>
+      <w:lvlJc w:val="left"/>
+      <w:pPr>
+        <w:ind w:left="2160" w:hanging="360"/>
+      </w:pPr>
+    </w:lvl>
+    <w:lvl w:ilvl="2" w:tplc="FFFFFFFF" w:tentative="1">
+      <w:start w:val="1"/>
+      <w:numFmt w:val="lowerRoman"/>
+      <w:lvlText w:val="%3."/>
+      <w:lvlJc w:val="right"/>
+      <w:pPr>
+        <w:ind w:left="2880" w:hanging="180"/>
+      </w:pPr>
+    </w:lvl>
+    <w:lvl w:ilvl="3" w:tplc="FFFFFFFF" w:tentative="1">
+      <w:start w:val="1"/>
+      <w:numFmt w:val="decimal"/>
+      <w:lvlText w:val="%4."/>
+      <w:lvlJc w:val="left"/>
+      <w:pPr>
+        <w:ind w:left="3600" w:hanging="360"/>
+      </w:pPr>
+    </w:lvl>
+    <w:lvl w:ilvl="4" w:tplc="FFFFFFFF" w:tentative="1">
+      <w:start w:val="1"/>
+      <w:numFmt w:val="lowerLetter"/>
+      <w:lvlText w:val="%5."/>
+      <w:lvlJc w:val="left"/>
+      <w:pPr>
+        <w:ind w:left="4320" w:hanging="360"/>
+      </w:pPr>
+    </w:lvl>
+    <w:lvl w:ilvl="5" w:tplc="FFFFFFFF" w:tentative="1">
+      <w:start w:val="1"/>
+      <w:numFmt w:val="lowerRoman"/>
+      <w:lvlText w:val="%6."/>
+      <w:lvlJc w:val="right"/>
+      <w:pPr>
+        <w:ind w:left="5040" w:hanging="180"/>
+      </w:pPr>
+    </w:lvl>
+    <w:lvl w:ilvl="6" w:tplc="FFFFFFFF" w:tentative="1">
+      <w:start w:val="1"/>
+      <w:numFmt w:val="decimal"/>
+      <w:lvlText w:val="%7."/>
+      <w:lvlJc w:val="left"/>
+      <w:pPr>
+        <w:ind w:left="5760" w:hanging="360"/>
+      </w:pPr>
+    </w:lvl>
+    <w:lvl w:ilvl="7" w:tplc="FFFFFFFF" w:tentative="1">
+      <w:start w:val="1"/>
+      <w:numFmt w:val="lowerLetter"/>
+      <w:lvlText w:val="%8."/>
+      <w:lvlJc w:val="left"/>
+      <w:pPr>
+        <w:ind w:left="6480" w:hanging="360"/>
+      </w:pPr>
+    </w:lvl>
+    <w:lvl w:ilvl="8" w:tplc="FFFFFFFF" w:tentative="1">
+      <w:start w:val="1"/>
+      <w:numFmt w:val="lowerRoman"/>
+      <w:lvlText w:val="%9."/>
+      <w:lvlJc w:val="right"/>
+      <w:pPr>
+        <w:ind w:left="7200" w:hanging="180"/>
+      </w:pPr>
+    </w:lvl>
+  </w:abstractNum>
+  <w:abstractNum w:abstractNumId="10" w15:restartNumberingAfterBreak="0">
     <w:nsid w:val="384B5554"/>
     <w:multiLevelType w:val="hybridMultilevel"/>
     <w:tmpl w:val="70CA723C"/>
@@ -3104,7 +7188,7 @@
       </w:pPr>
     </w:lvl>
   </w:abstractNum>
-  <w:abstractNum w:abstractNumId="7" w15:restartNumberingAfterBreak="0">
+  <w:abstractNum w:abstractNumId="11" w15:restartNumberingAfterBreak="0">
     <w:nsid w:val="4361304E"/>
     <w:multiLevelType w:val="hybridMultilevel"/>
     <w:tmpl w:val="2B1AD4A2"/>
@@ -3193,7 +7277,185 @@
       </w:pPr>
     </w:lvl>
   </w:abstractNum>
-  <w:abstractNum w:abstractNumId="8" w15:restartNumberingAfterBreak="0">
+  <w:abstractNum w:abstractNumId="12" w15:restartNumberingAfterBreak="0">
+    <w:nsid w:val="508259D1"/>
+    <w:multiLevelType w:val="hybridMultilevel"/>
+    <w:tmpl w:val="2B1AD4A2"/>
+    <w:lvl w:ilvl="0" w:tplc="FFFFFFFF">
+      <w:start w:val="1"/>
+      <w:numFmt w:val="decimal"/>
+      <w:lvlText w:val="%1."/>
+      <w:lvlJc w:val="left"/>
+      <w:pPr>
+        <w:ind w:left="1440" w:hanging="360"/>
+      </w:pPr>
+      <w:rPr>
+        <w:rFonts w:hint="default"/>
+      </w:rPr>
+    </w:lvl>
+    <w:lvl w:ilvl="1" w:tplc="FFFFFFFF" w:tentative="1">
+      <w:start w:val="1"/>
+      <w:numFmt w:val="lowerLetter"/>
+      <w:lvlText w:val="%2."/>
+      <w:lvlJc w:val="left"/>
+      <w:pPr>
+        <w:ind w:left="2160" w:hanging="360"/>
+      </w:pPr>
+    </w:lvl>
+    <w:lvl w:ilvl="2" w:tplc="FFFFFFFF" w:tentative="1">
+      <w:start w:val="1"/>
+      <w:numFmt w:val="lowerRoman"/>
+      <w:lvlText w:val="%3."/>
+      <w:lvlJc w:val="right"/>
+      <w:pPr>
+        <w:ind w:left="2880" w:hanging="180"/>
+      </w:pPr>
+    </w:lvl>
+    <w:lvl w:ilvl="3" w:tplc="FFFFFFFF" w:tentative="1">
+      <w:start w:val="1"/>
+      <w:numFmt w:val="decimal"/>
+      <w:lvlText w:val="%4."/>
+      <w:lvlJc w:val="left"/>
+      <w:pPr>
+        <w:ind w:left="3600" w:hanging="360"/>
+      </w:pPr>
+    </w:lvl>
+    <w:lvl w:ilvl="4" w:tplc="FFFFFFFF" w:tentative="1">
+      <w:start w:val="1"/>
+      <w:numFmt w:val="lowerLetter"/>
+      <w:lvlText w:val="%5."/>
+      <w:lvlJc w:val="left"/>
+      <w:pPr>
+        <w:ind w:left="4320" w:hanging="360"/>
+      </w:pPr>
+    </w:lvl>
+    <w:lvl w:ilvl="5" w:tplc="FFFFFFFF" w:tentative="1">
+      <w:start w:val="1"/>
+      <w:numFmt w:val="lowerRoman"/>
+      <w:lvlText w:val="%6."/>
+      <w:lvlJc w:val="right"/>
+      <w:pPr>
+        <w:ind w:left="5040" w:hanging="180"/>
+      </w:pPr>
+    </w:lvl>
+    <w:lvl w:ilvl="6" w:tplc="FFFFFFFF" w:tentative="1">
+      <w:start w:val="1"/>
+      <w:numFmt w:val="decimal"/>
+      <w:lvlText w:val="%7."/>
+      <w:lvlJc w:val="left"/>
+      <w:pPr>
+        <w:ind w:left="5760" w:hanging="360"/>
+      </w:pPr>
+    </w:lvl>
+    <w:lvl w:ilvl="7" w:tplc="FFFFFFFF" w:tentative="1">
+      <w:start w:val="1"/>
+      <w:numFmt w:val="lowerLetter"/>
+      <w:lvlText w:val="%8."/>
+      <w:lvlJc w:val="left"/>
+      <w:pPr>
+        <w:ind w:left="6480" w:hanging="360"/>
+      </w:pPr>
+    </w:lvl>
+    <w:lvl w:ilvl="8" w:tplc="FFFFFFFF" w:tentative="1">
+      <w:start w:val="1"/>
+      <w:numFmt w:val="lowerRoman"/>
+      <w:lvlText w:val="%9."/>
+      <w:lvlJc w:val="right"/>
+      <w:pPr>
+        <w:ind w:left="7200" w:hanging="180"/>
+      </w:pPr>
+    </w:lvl>
+  </w:abstractNum>
+  <w:abstractNum w:abstractNumId="13" w15:restartNumberingAfterBreak="0">
+    <w:nsid w:val="59A425A3"/>
+    <w:multiLevelType w:val="hybridMultilevel"/>
+    <w:tmpl w:val="2B1AD4A2"/>
+    <w:lvl w:ilvl="0" w:tplc="FFFFFFFF">
+      <w:start w:val="1"/>
+      <w:numFmt w:val="decimal"/>
+      <w:lvlText w:val="%1."/>
+      <w:lvlJc w:val="left"/>
+      <w:pPr>
+        <w:ind w:left="1440" w:hanging="360"/>
+      </w:pPr>
+      <w:rPr>
+        <w:rFonts w:hint="default"/>
+      </w:rPr>
+    </w:lvl>
+    <w:lvl w:ilvl="1" w:tplc="FFFFFFFF" w:tentative="1">
+      <w:start w:val="1"/>
+      <w:numFmt w:val="lowerLetter"/>
+      <w:lvlText w:val="%2."/>
+      <w:lvlJc w:val="left"/>
+      <w:pPr>
+        <w:ind w:left="2160" w:hanging="360"/>
+      </w:pPr>
+    </w:lvl>
+    <w:lvl w:ilvl="2" w:tplc="FFFFFFFF" w:tentative="1">
+      <w:start w:val="1"/>
+      <w:numFmt w:val="lowerRoman"/>
+      <w:lvlText w:val="%3."/>
+      <w:lvlJc w:val="right"/>
+      <w:pPr>
+        <w:ind w:left="2880" w:hanging="180"/>
+      </w:pPr>
+    </w:lvl>
+    <w:lvl w:ilvl="3" w:tplc="FFFFFFFF" w:tentative="1">
+      <w:start w:val="1"/>
+      <w:numFmt w:val="decimal"/>
+      <w:lvlText w:val="%4."/>
+      <w:lvlJc w:val="left"/>
+      <w:pPr>
+        <w:ind w:left="3600" w:hanging="360"/>
+      </w:pPr>
+    </w:lvl>
+    <w:lvl w:ilvl="4" w:tplc="FFFFFFFF" w:tentative="1">
+      <w:start w:val="1"/>
+      <w:numFmt w:val="lowerLetter"/>
+      <w:lvlText w:val="%5."/>
+      <w:lvlJc w:val="left"/>
+      <w:pPr>
+        <w:ind w:left="4320" w:hanging="360"/>
+      </w:pPr>
+    </w:lvl>
+    <w:lvl w:ilvl="5" w:tplc="FFFFFFFF" w:tentative="1">
+      <w:start w:val="1"/>
+      <w:numFmt w:val="lowerRoman"/>
+      <w:lvlText w:val="%6."/>
+      <w:lvlJc w:val="right"/>
+      <w:pPr>
+        <w:ind w:left="5040" w:hanging="180"/>
+      </w:pPr>
+    </w:lvl>
+    <w:lvl w:ilvl="6" w:tplc="FFFFFFFF" w:tentative="1">
+      <w:start w:val="1"/>
+      <w:numFmt w:val="decimal"/>
+      <w:lvlText w:val="%7."/>
+      <w:lvlJc w:val="left"/>
+      <w:pPr>
+        <w:ind w:left="5760" w:hanging="360"/>
+      </w:pPr>
+    </w:lvl>
+    <w:lvl w:ilvl="7" w:tplc="FFFFFFFF" w:tentative="1">
+      <w:start w:val="1"/>
+      <w:numFmt w:val="lowerLetter"/>
+      <w:lvlText w:val="%8."/>
+      <w:lvlJc w:val="left"/>
+      <w:pPr>
+        <w:ind w:left="6480" w:hanging="360"/>
+      </w:pPr>
+    </w:lvl>
+    <w:lvl w:ilvl="8" w:tplc="FFFFFFFF" w:tentative="1">
+      <w:start w:val="1"/>
+      <w:numFmt w:val="lowerRoman"/>
+      <w:lvlText w:val="%9."/>
+      <w:lvlJc w:val="right"/>
+      <w:pPr>
+        <w:ind w:left="7200" w:hanging="180"/>
+      </w:pPr>
+    </w:lvl>
+  </w:abstractNum>
+  <w:abstractNum w:abstractNumId="14" w15:restartNumberingAfterBreak="0">
     <w:nsid w:val="5BC8457B"/>
     <w:multiLevelType w:val="hybridMultilevel"/>
     <w:tmpl w:val="2B1AD4A2"/>
@@ -3282,7 +7544,7 @@
       </w:pPr>
     </w:lvl>
   </w:abstractNum>
-  <w:abstractNum w:abstractNumId="9" w15:restartNumberingAfterBreak="0">
+  <w:abstractNum w:abstractNumId="15" w15:restartNumberingAfterBreak="0">
     <w:nsid w:val="5D1A710E"/>
     <w:multiLevelType w:val="hybridMultilevel"/>
     <w:tmpl w:val="6652CD3E"/>
@@ -3371,8 +7633,97 @@
       </w:pPr>
     </w:lvl>
   </w:abstractNum>
-  <w:abstractNum w:abstractNumId="10" w15:restartNumberingAfterBreak="0">
+  <w:abstractNum w:abstractNumId="16" w15:restartNumberingAfterBreak="0">
     <w:nsid w:val="696214F5"/>
+    <w:multiLevelType w:val="hybridMultilevel"/>
+    <w:tmpl w:val="2B1AD4A2"/>
+    <w:lvl w:ilvl="0" w:tplc="FFFFFFFF">
+      <w:start w:val="1"/>
+      <w:numFmt w:val="decimal"/>
+      <w:lvlText w:val="%1."/>
+      <w:lvlJc w:val="left"/>
+      <w:pPr>
+        <w:ind w:left="1440" w:hanging="360"/>
+      </w:pPr>
+      <w:rPr>
+        <w:rFonts w:hint="default"/>
+      </w:rPr>
+    </w:lvl>
+    <w:lvl w:ilvl="1" w:tplc="FFFFFFFF" w:tentative="1">
+      <w:start w:val="1"/>
+      <w:numFmt w:val="lowerLetter"/>
+      <w:lvlText w:val="%2."/>
+      <w:lvlJc w:val="left"/>
+      <w:pPr>
+        <w:ind w:left="2160" w:hanging="360"/>
+      </w:pPr>
+    </w:lvl>
+    <w:lvl w:ilvl="2" w:tplc="FFFFFFFF" w:tentative="1">
+      <w:start w:val="1"/>
+      <w:numFmt w:val="lowerRoman"/>
+      <w:lvlText w:val="%3."/>
+      <w:lvlJc w:val="right"/>
+      <w:pPr>
+        <w:ind w:left="2880" w:hanging="180"/>
+      </w:pPr>
+    </w:lvl>
+    <w:lvl w:ilvl="3" w:tplc="FFFFFFFF" w:tentative="1">
+      <w:start w:val="1"/>
+      <w:numFmt w:val="decimal"/>
+      <w:lvlText w:val="%4."/>
+      <w:lvlJc w:val="left"/>
+      <w:pPr>
+        <w:ind w:left="3600" w:hanging="360"/>
+      </w:pPr>
+    </w:lvl>
+    <w:lvl w:ilvl="4" w:tplc="FFFFFFFF" w:tentative="1">
+      <w:start w:val="1"/>
+      <w:numFmt w:val="lowerLetter"/>
+      <w:lvlText w:val="%5."/>
+      <w:lvlJc w:val="left"/>
+      <w:pPr>
+        <w:ind w:left="4320" w:hanging="360"/>
+      </w:pPr>
+    </w:lvl>
+    <w:lvl w:ilvl="5" w:tplc="FFFFFFFF" w:tentative="1">
+      <w:start w:val="1"/>
+      <w:numFmt w:val="lowerRoman"/>
+      <w:lvlText w:val="%6."/>
+      <w:lvlJc w:val="right"/>
+      <w:pPr>
+        <w:ind w:left="5040" w:hanging="180"/>
+      </w:pPr>
+    </w:lvl>
+    <w:lvl w:ilvl="6" w:tplc="FFFFFFFF" w:tentative="1">
+      <w:start w:val="1"/>
+      <w:numFmt w:val="decimal"/>
+      <w:lvlText w:val="%7."/>
+      <w:lvlJc w:val="left"/>
+      <w:pPr>
+        <w:ind w:left="5760" w:hanging="360"/>
+      </w:pPr>
+    </w:lvl>
+    <w:lvl w:ilvl="7" w:tplc="FFFFFFFF" w:tentative="1">
+      <w:start w:val="1"/>
+      <w:numFmt w:val="lowerLetter"/>
+      <w:lvlText w:val="%8."/>
+      <w:lvlJc w:val="left"/>
+      <w:pPr>
+        <w:ind w:left="6480" w:hanging="360"/>
+      </w:pPr>
+    </w:lvl>
+    <w:lvl w:ilvl="8" w:tplc="FFFFFFFF" w:tentative="1">
+      <w:start w:val="1"/>
+      <w:numFmt w:val="lowerRoman"/>
+      <w:lvlText w:val="%9."/>
+      <w:lvlJc w:val="right"/>
+      <w:pPr>
+        <w:ind w:left="7200" w:hanging="180"/>
+      </w:pPr>
+    </w:lvl>
+  </w:abstractNum>
+  <w:abstractNum w:abstractNumId="17" w15:restartNumberingAfterBreak="0">
+    <w:nsid w:val="7A67241F"/>
     <w:multiLevelType w:val="hybridMultilevel"/>
     <w:tmpl w:val="2B1AD4A2"/>
     <w:lvl w:ilvl="0" w:tplc="FFFFFFFF">
@@ -3467,31 +7818,52 @@
     <w:abstractNumId w:val="0"/>
   </w:num>
   <w:num w:numId="3" w16cid:durableId="1709332903">
-    <w:abstractNumId w:val="4"/>
+    <w:abstractNumId w:val="6"/>
   </w:num>
   <w:num w:numId="4" w16cid:durableId="1642416733">
     <w:abstractNumId w:val="1"/>
   </w:num>
   <w:num w:numId="5" w16cid:durableId="401031425">
-    <w:abstractNumId w:val="6"/>
+    <w:abstractNumId w:val="10"/>
   </w:num>
   <w:num w:numId="6" w16cid:durableId="1437284071">
     <w:abstractNumId w:val="3"/>
   </w:num>
   <w:num w:numId="7" w16cid:durableId="678629010">
+    <w:abstractNumId w:val="8"/>
+  </w:num>
+  <w:num w:numId="8" w16cid:durableId="697630763">
+    <w:abstractNumId w:val="15"/>
+  </w:num>
+  <w:num w:numId="9" w16cid:durableId="1902671883">
+    <w:abstractNumId w:val="14"/>
+  </w:num>
+  <w:num w:numId="10" w16cid:durableId="1077753651">
+    <w:abstractNumId w:val="16"/>
+  </w:num>
+  <w:num w:numId="11" w16cid:durableId="1607810135">
+    <w:abstractNumId w:val="11"/>
+  </w:num>
+  <w:num w:numId="12" w16cid:durableId="77217983">
+    <w:abstractNumId w:val="9"/>
+  </w:num>
+  <w:num w:numId="13" w16cid:durableId="16349301">
+    <w:abstractNumId w:val="7"/>
+  </w:num>
+  <w:num w:numId="14" w16cid:durableId="1825466095">
+    <w:abstractNumId w:val="12"/>
+  </w:num>
+  <w:num w:numId="15" w16cid:durableId="1646085215">
     <w:abstractNumId w:val="5"/>
   </w:num>
-  <w:num w:numId="8" w16cid:durableId="697630763">
-    <w:abstractNumId w:val="9"/>
+  <w:num w:numId="16" w16cid:durableId="1966155299">
+    <w:abstractNumId w:val="4"/>
   </w:num>
-  <w:num w:numId="9" w16cid:durableId="1902671883">
-    <w:abstractNumId w:val="8"/>
+  <w:num w:numId="17" w16cid:durableId="1764568589">
+    <w:abstractNumId w:val="17"/>
   </w:num>
-  <w:num w:numId="10" w16cid:durableId="1077753651">
-    <w:abstractNumId w:val="10"/>
-  </w:num>
-  <w:num w:numId="11" w16cid:durableId="1607810135">
-    <w:abstractNumId w:val="7"/>
+  <w:num w:numId="18" w16cid:durableId="595483897">
+    <w:abstractNumId w:val="13"/>
   </w:num>
 </w:numbering>
 </file>
@@ -3924,7 +8296,6 @@
     <w:next w:val="Normal"/>
     <w:link w:val="Heading2Char"/>
     <w:uiPriority w:val="9"/>
-    <w:semiHidden/>
     <w:unhideWhenUsed/>
     <w:qFormat/>
     <w:rsid w:val="008C0AD2"/>
@@ -4099,7 +8470,6 @@
   <w:style w:type="character" w:default="1" w:styleId="DefaultParagraphFont">
     <w:name w:val="Default Paragraph Font"/>
     <w:uiPriority w:val="1"/>
-    <w:semiHidden/>
     <w:unhideWhenUsed/>
   </w:style>
   <w:style w:type="table" w:default="1" w:styleId="TableNormal">
@@ -4141,7 +8511,6 @@
     <w:basedOn w:val="DefaultParagraphFont"/>
     <w:link w:val="Heading2"/>
     <w:uiPriority w:val="9"/>
-    <w:semiHidden/>
     <w:rsid w:val="008C0AD2"/>
     <w:rPr>
       <w:rFonts w:asciiTheme="majorHAnsi" w:eastAsiaTheme="majorEastAsia" w:hAnsiTheme="majorHAnsi" w:cstheme="majorBidi"/>

</xml_diff>